<commit_message>
Holm-corrected DeLong comparisons and explicit contribution statement
- 21 pairwise DeLong tests now Holm-adjusted (results/delong_pairwise_corrected.csv); Table 3 shows unadjusted (upper) and adjusted (lower) p-values
- XGBoost vs LR and MLP vs ResNet no longer significant after correction; no deep model beats any classical model either way
- Introduction now lists the four contributions (controlled comparison, calibration, compute cost, SHAP agreement/stability)
- Holm (1979) added to references; Overleaf version and result write-ups updated to match

Co-Authored-By: Claude Opus 5.5 <noreply@anthropic.com>
</commit_message>
<xml_diff>
--- a/ICINCDS_2026_Manuscript_NHANES_CVD_v2.docx
+++ b/ICINCDS_2026_Manuscript_NHANES_CVD_v2.docx
@@ -78,7 +78,7 @@
         <w:rPr>
           <w:rFonts w:ascii="Times New Roman" w:cs="Times New Roman" w:eastAsia="Times New Roman" w:hAnsi="Times New Roman"/>
         </w:rPr>
-        <w:t xml:space="preserve">Cardiovascular disease (CVD) is a leading cause of death, yet it remains unclear whether deep learning improves CVD classification over classical machine learning on structured clinical data. Using four cycles of the U.S. National Health and Nutrition Examination Survey (NHANES 2011–2018; n = 21,552 adults, 2,369 with CVD), this study compared four classical models (Logistic Regression, Random Forest, Support Vector Machine, XGBoost) with three deep learning models (multilayer perceptron, tabular ResNet, FT-Transformer) using 20 demographic, clinical and laboratory features. Models were evaluated for discrimination (ROC-AUC, PR-AUC, DeLong test), calibration (Brier score, expected calibration error) and computational cost, and interpreted with SHAP. All models performed similarly (ROC-AUC 0.837–0.848). XGBoost achieved the highest AUC, and no deep learning model significantly outperformed any classical model, although the FT-Transformer required 119 times longer tuning than XGBoost. Age was the most influential feature for every model. Feature rankings were broadly concordant (Kendall’s W = 0.75) but clustered by the shape of the decision function, with the deep models agreeing closely with each other (W = 0.92). Inverse attributions for cholesterol reflected treatment after diagnosis, indicating association rather than causation. For structured health survey data, deep learning offered no measurable advantage over classical machine learning.</w:t>
+        <w:t xml:space="preserve">Cardiovascular disease (CVD) is a leading cause of death, yet it remains unclear whether deep learning improves CVD classification over classical machine learning on structured clinical data. Using four cycles of the U.S. National Health and Nutrition Examination Survey (NHANES 2011–2018; n = 21,552 adults, 2,369 with CVD), this study compared four classical models (Logistic Regression, Random Forest, Support Vector Machine, XGBoost) with three deep learning models (multilayer perceptron, tabular ResNet, FT-Transformer) using 20 demographic, clinical and laboratory features. Models were evaluated for discrimination (ROC-AUC, PR-AUC, Holm-corrected DeLong tests), calibration (Brier score, expected calibration error) and computational cost, and interpreted with SHAP. All models performed similarly (ROC-AUC 0.837–0.848). XGBoost achieved the highest AUC, and no deep learning model significantly outperformed any classical model, although the FT-Transformer required 119 times longer tuning than XGBoost. Age was the most influential feature for every model. Feature rankings were broadly concordant (Kendall’s W = 0.75) but clustered by the shape of the decision function, with the deep models agreeing closely with each other (W = 0.92). Inverse attributions for cholesterol reflected treatment after diagnosis, indicating association rather than causation. For structured health survey data, deep learning offered no measurable advantage over classical machine learning.</w:t>
       </w:r>
     </w:p>
     <w:p>
@@ -171,7 +171,7 @@
         <w:rPr>
           <w:rFonts w:ascii="Times New Roman" w:cs="Times New Roman" w:eastAsia="Times New Roman" w:hAnsi="Times New Roman"/>
         </w:rPr>
-        <w:t xml:space="preserve">This study compares four classical machine learning models with three deep learning models for CVD classification using harmonized NHANES data. It evaluates predictive performance, calibration and computational efficiency, and examines clinical feature contributions through SHAP and feature-ablation experiments. It further investigates whether different model families identify consistent influential features, providing a comparative assessment of predictive effectiveness and interpretability on structured clinical data.</w:t>
+        <w:t xml:space="preserve">This study compares four classical machine learning models (LR, RF, SVM, XGBoost) with three deep learning models (MLP, tabular ResNet, FT-Transformer) for CVD classification on harmonized NHANES 2011–2018 data. Its contributions are fourfold. First, it provides a controlled comparison in which all seven models share the same data splits, preprocessing and tuning protocol, with pairwise DeLong tests corrected for multiple comparisons. Second, it evaluates calibration (Brier score, expected calibration error and calibration slope) alongside discrimination, which most prior CVD studies omit. Third, it quantifies computational cost (tuning, training and inference time) for every model. Fourth, it measures whether SHAP explanations agree across model families and remain stable across bootstrap refits, complemented by feature-group ablation and an analysis of treatment-related reverse causation.</w:t>
       </w:r>
     </w:p>
     <w:p>
@@ -375,7 +375,7 @@
         <w:rPr>
           <w:rFonts w:ascii="Times New Roman" w:cs="Times New Roman" w:eastAsia="Times New Roman" w:hAnsi="Times New Roman"/>
         </w:rPr>
-        <w:t xml:space="preserve">Test-set performance was assessed with ROC-AUC (with 1,000-sample bootstrap confidence intervals), PR-AUC (Saito &amp; Rehmsmeier, 2015), precision, recall, specificity, F1-score, Brier score, expected calibration error (ECE) and calibration slope (Van Calster et al., 2019). Paired AUC differences were tested with DeLong’s method (DeLong et al., 1988). Robustness was assessed over five random splits, by temporal validation (training on 2011–2016 and testing on 2017–2018), and with survey-weighted AUC.</w:t>
+        <w:t xml:space="preserve">Test-set performance was assessed with ROC-AUC (with 1,000-sample bootstrap confidence intervals), PR-AUC (Saito &amp; Rehmsmeier, 2015), precision, recall, specificity, F1-score, Brier score, expected calibration error (ECE) and calibration slope (Van Calster et al., 2019). Paired AUC differences were tested with DeLong’s method (DeLong et al., 1988), and p-values for the 21 pairwise comparisons were adjusted with Holm’s step-down procedure (Holm, 1979). Robustness was assessed over five random splits, by temporal validation (training on 2011–2016 and testing on 2017–2018), and with survey-weighted AUC.</w:t>
       </w:r>
     </w:p>
     <w:p>
@@ -515,6 +515,7 @@
           </w:tcPr>
           <w:p>
             <w:pPr>
+              <w:keepNext/>
               <w:spacing w:after="0" w:line="240"/>
               <w:jc w:val="left"/>
             </w:pPr>
@@ -550,6 +551,7 @@
           </w:tcPr>
           <w:p>
             <w:pPr>
+              <w:keepNext/>
               <w:spacing w:after="0" w:line="240"/>
               <w:jc w:val="center"/>
             </w:pPr>
@@ -585,6 +587,7 @@
           </w:tcPr>
           <w:p>
             <w:pPr>
+              <w:keepNext/>
               <w:spacing w:after="0" w:line="240"/>
               <w:jc w:val="center"/>
             </w:pPr>
@@ -620,6 +623,7 @@
           </w:tcPr>
           <w:p>
             <w:pPr>
+              <w:keepNext/>
               <w:spacing w:after="0" w:line="240"/>
               <w:jc w:val="center"/>
             </w:pPr>
@@ -659,6 +663,7 @@
           </w:tcPr>
           <w:p>
             <w:pPr>
+              <w:keepNext/>
               <w:spacing w:after="0" w:line="240"/>
               <w:jc w:val="left"/>
             </w:pPr>
@@ -691,6 +696,7 @@
           </w:tcPr>
           <w:p>
             <w:pPr>
+              <w:keepNext/>
               <w:spacing w:after="0" w:line="240"/>
               <w:jc w:val="center"/>
             </w:pPr>
@@ -723,6 +729,7 @@
           </w:tcPr>
           <w:p>
             <w:pPr>
+              <w:keepNext/>
               <w:spacing w:after="0" w:line="240"/>
               <w:jc w:val="center"/>
             </w:pPr>
@@ -755,6 +762,7 @@
           </w:tcPr>
           <w:p>
             <w:pPr>
+              <w:keepNext/>
               <w:spacing w:after="0" w:line="240"/>
               <w:jc w:val="center"/>
             </w:pPr>
@@ -792,6 +800,7 @@
           </w:tcPr>
           <w:p>
             <w:pPr>
+              <w:keepNext/>
               <w:spacing w:after="0" w:line="240"/>
               <w:jc w:val="left"/>
             </w:pPr>
@@ -824,6 +833,7 @@
           </w:tcPr>
           <w:p>
             <w:pPr>
+              <w:keepNext/>
               <w:spacing w:after="0" w:line="240"/>
               <w:jc w:val="center"/>
             </w:pPr>
@@ -856,6 +866,7 @@
           </w:tcPr>
           <w:p>
             <w:pPr>
+              <w:keepNext/>
               <w:spacing w:after="0" w:line="240"/>
               <w:jc w:val="center"/>
             </w:pPr>
@@ -888,6 +899,7 @@
           </w:tcPr>
           <w:p>
             <w:pPr>
+              <w:keepNext/>
               <w:spacing w:after="0" w:line="240"/>
               <w:jc w:val="center"/>
             </w:pPr>
@@ -925,6 +937,7 @@
           </w:tcPr>
           <w:p>
             <w:pPr>
+              <w:keepNext/>
               <w:spacing w:after="0" w:line="240"/>
               <w:jc w:val="left"/>
             </w:pPr>
@@ -957,6 +970,7 @@
           </w:tcPr>
           <w:p>
             <w:pPr>
+              <w:keepNext/>
               <w:spacing w:after="0" w:line="240"/>
               <w:jc w:val="center"/>
             </w:pPr>
@@ -989,6 +1003,7 @@
           </w:tcPr>
           <w:p>
             <w:pPr>
+              <w:keepNext/>
               <w:spacing w:after="0" w:line="240"/>
               <w:jc w:val="center"/>
             </w:pPr>
@@ -1021,6 +1036,7 @@
           </w:tcPr>
           <w:p>
             <w:pPr>
+              <w:keepNext/>
               <w:spacing w:after="0" w:line="240"/>
               <w:jc w:val="center"/>
             </w:pPr>
@@ -1058,6 +1074,7 @@
           </w:tcPr>
           <w:p>
             <w:pPr>
+              <w:keepNext/>
               <w:spacing w:after="0" w:line="240"/>
               <w:jc w:val="left"/>
             </w:pPr>
@@ -1090,6 +1107,7 @@
           </w:tcPr>
           <w:p>
             <w:pPr>
+              <w:keepNext/>
               <w:spacing w:after="0" w:line="240"/>
               <w:jc w:val="center"/>
             </w:pPr>
@@ -1122,6 +1140,7 @@
           </w:tcPr>
           <w:p>
             <w:pPr>
+              <w:keepNext/>
               <w:spacing w:after="0" w:line="240"/>
               <w:jc w:val="center"/>
             </w:pPr>
@@ -1154,6 +1173,7 @@
           </w:tcPr>
           <w:p>
             <w:pPr>
+              <w:keepNext/>
               <w:spacing w:after="0" w:line="240"/>
               <w:jc w:val="center"/>
             </w:pPr>
@@ -1191,6 +1211,7 @@
           </w:tcPr>
           <w:p>
             <w:pPr>
+              <w:keepNext/>
               <w:spacing w:after="0" w:line="240"/>
               <w:jc w:val="left"/>
             </w:pPr>
@@ -1223,6 +1244,7 @@
           </w:tcPr>
           <w:p>
             <w:pPr>
+              <w:keepNext/>
               <w:spacing w:after="0" w:line="240"/>
               <w:jc w:val="center"/>
             </w:pPr>
@@ -1255,6 +1277,7 @@
           </w:tcPr>
           <w:p>
             <w:pPr>
+              <w:keepNext/>
               <w:spacing w:after="0" w:line="240"/>
               <w:jc w:val="center"/>
             </w:pPr>
@@ -1287,6 +1310,7 @@
           </w:tcPr>
           <w:p>
             <w:pPr>
+              <w:keepNext/>
               <w:spacing w:after="0" w:line="240"/>
               <w:jc w:val="center"/>
             </w:pPr>
@@ -1324,6 +1348,7 @@
           </w:tcPr>
           <w:p>
             <w:pPr>
+              <w:keepNext/>
               <w:spacing w:after="0" w:line="240"/>
               <w:jc w:val="left"/>
             </w:pPr>
@@ -1356,6 +1381,7 @@
           </w:tcPr>
           <w:p>
             <w:pPr>
+              <w:keepNext/>
               <w:spacing w:after="0" w:line="240"/>
               <w:jc w:val="center"/>
             </w:pPr>
@@ -1388,6 +1414,7 @@
           </w:tcPr>
           <w:p>
             <w:pPr>
+              <w:keepNext/>
               <w:spacing w:after="0" w:line="240"/>
               <w:jc w:val="center"/>
             </w:pPr>
@@ -1420,6 +1447,7 @@
           </w:tcPr>
           <w:p>
             <w:pPr>
+              <w:keepNext/>
               <w:spacing w:after="0" w:line="240"/>
               <w:jc w:val="center"/>
             </w:pPr>
@@ -1457,6 +1485,7 @@
           </w:tcPr>
           <w:p>
             <w:pPr>
+              <w:keepNext/>
               <w:spacing w:after="0" w:line="240"/>
               <w:jc w:val="left"/>
             </w:pPr>
@@ -1489,6 +1518,7 @@
           </w:tcPr>
           <w:p>
             <w:pPr>
+              <w:keepNext/>
               <w:spacing w:after="0" w:line="240"/>
               <w:jc w:val="center"/>
             </w:pPr>
@@ -1521,6 +1551,7 @@
           </w:tcPr>
           <w:p>
             <w:pPr>
+              <w:keepNext/>
               <w:spacing w:after="0" w:line="240"/>
               <w:jc w:val="center"/>
             </w:pPr>
@@ -1553,6 +1584,7 @@
           </w:tcPr>
           <w:p>
             <w:pPr>
+              <w:keepNext/>
               <w:spacing w:after="0" w:line="240"/>
               <w:jc w:val="center"/>
             </w:pPr>
@@ -1590,6 +1622,7 @@
           </w:tcPr>
           <w:p>
             <w:pPr>
+              <w:keepNext/>
               <w:spacing w:after="0" w:line="240"/>
               <w:jc w:val="left"/>
             </w:pPr>
@@ -1622,6 +1655,7 @@
           </w:tcPr>
           <w:p>
             <w:pPr>
+              <w:keepNext/>
               <w:spacing w:after="0" w:line="240"/>
               <w:jc w:val="center"/>
             </w:pPr>
@@ -1654,6 +1688,7 @@
           </w:tcPr>
           <w:p>
             <w:pPr>
+              <w:keepNext/>
               <w:spacing w:after="0" w:line="240"/>
               <w:jc w:val="center"/>
             </w:pPr>
@@ -1686,6 +1721,7 @@
           </w:tcPr>
           <w:p>
             <w:pPr>
+              <w:keepNext/>
               <w:spacing w:after="0" w:line="240"/>
               <w:jc w:val="center"/>
             </w:pPr>
@@ -1723,6 +1759,7 @@
           </w:tcPr>
           <w:p>
             <w:pPr>
+              <w:keepNext/>
               <w:spacing w:after="0" w:line="240"/>
               <w:jc w:val="left"/>
             </w:pPr>
@@ -1755,6 +1792,7 @@
           </w:tcPr>
           <w:p>
             <w:pPr>
+              <w:keepNext/>
               <w:spacing w:after="0" w:line="240"/>
               <w:jc w:val="center"/>
             </w:pPr>
@@ -1787,6 +1825,7 @@
           </w:tcPr>
           <w:p>
             <w:pPr>
+              <w:keepNext/>
               <w:spacing w:after="0" w:line="240"/>
               <w:jc w:val="center"/>
             </w:pPr>
@@ -1819,6 +1858,7 @@
           </w:tcPr>
           <w:p>
             <w:pPr>
+              <w:keepNext/>
               <w:spacing w:after="0" w:line="240"/>
               <w:jc w:val="center"/>
             </w:pPr>
@@ -1856,6 +1896,7 @@
           </w:tcPr>
           <w:p>
             <w:pPr>
+              <w:keepNext/>
               <w:spacing w:after="0" w:line="240"/>
               <w:jc w:val="left"/>
             </w:pPr>
@@ -1888,6 +1929,7 @@
           </w:tcPr>
           <w:p>
             <w:pPr>
+              <w:keepNext/>
               <w:spacing w:after="0" w:line="240"/>
               <w:jc w:val="center"/>
             </w:pPr>
@@ -1920,6 +1962,7 @@
           </w:tcPr>
           <w:p>
             <w:pPr>
+              <w:keepNext/>
               <w:spacing w:after="0" w:line="240"/>
               <w:jc w:val="center"/>
             </w:pPr>
@@ -1952,6 +1995,7 @@
           </w:tcPr>
           <w:p>
             <w:pPr>
+              <w:keepNext/>
               <w:spacing w:after="0" w:line="240"/>
               <w:jc w:val="center"/>
             </w:pPr>
@@ -1989,6 +2033,7 @@
           </w:tcPr>
           <w:p>
             <w:pPr>
+              <w:keepNext/>
               <w:spacing w:after="0" w:line="240"/>
               <w:jc w:val="left"/>
             </w:pPr>
@@ -2021,6 +2066,7 @@
           </w:tcPr>
           <w:p>
             <w:pPr>
+              <w:keepNext/>
               <w:spacing w:after="0" w:line="240"/>
               <w:jc w:val="center"/>
             </w:pPr>
@@ -2053,6 +2099,7 @@
           </w:tcPr>
           <w:p>
             <w:pPr>
+              <w:keepNext/>
               <w:spacing w:after="0" w:line="240"/>
               <w:jc w:val="center"/>
             </w:pPr>
@@ -2085,6 +2132,7 @@
           </w:tcPr>
           <w:p>
             <w:pPr>
+              <w:keepNext/>
               <w:spacing w:after="0" w:line="240"/>
               <w:jc w:val="center"/>
             </w:pPr>
@@ -2122,6 +2170,7 @@
           </w:tcPr>
           <w:p>
             <w:pPr>
+              <w:keepNext/>
               <w:spacing w:after="0" w:line="240"/>
               <w:jc w:val="left"/>
             </w:pPr>
@@ -2154,6 +2203,7 @@
           </w:tcPr>
           <w:p>
             <w:pPr>
+              <w:keepNext/>
               <w:spacing w:after="0" w:line="240"/>
               <w:jc w:val="center"/>
             </w:pPr>
@@ -2186,6 +2236,7 @@
           </w:tcPr>
           <w:p>
             <w:pPr>
+              <w:keepNext/>
               <w:spacing w:after="0" w:line="240"/>
               <w:jc w:val="center"/>
             </w:pPr>
@@ -2218,6 +2269,7 @@
           </w:tcPr>
           <w:p>
             <w:pPr>
+              <w:keepNext/>
               <w:spacing w:after="0" w:line="240"/>
               <w:jc w:val="center"/>
             </w:pPr>
@@ -2255,6 +2307,7 @@
           </w:tcPr>
           <w:p>
             <w:pPr>
+              <w:keepNext/>
               <w:spacing w:after="0" w:line="240"/>
               <w:jc w:val="left"/>
             </w:pPr>
@@ -2287,6 +2340,7 @@
           </w:tcPr>
           <w:p>
             <w:pPr>
+              <w:keepNext/>
               <w:spacing w:after="0" w:line="240"/>
               <w:jc w:val="center"/>
             </w:pPr>
@@ -2319,6 +2373,7 @@
           </w:tcPr>
           <w:p>
             <w:pPr>
+              <w:keepNext/>
               <w:spacing w:after="0" w:line="240"/>
               <w:jc w:val="center"/>
             </w:pPr>
@@ -2351,6 +2406,7 @@
           </w:tcPr>
           <w:p>
             <w:pPr>
+              <w:keepNext/>
               <w:spacing w:after="0" w:line="240"/>
               <w:jc w:val="center"/>
             </w:pPr>
@@ -2388,6 +2444,7 @@
           </w:tcPr>
           <w:p>
             <w:pPr>
+              <w:keepNext/>
               <w:spacing w:after="0" w:line="240"/>
               <w:jc w:val="left"/>
             </w:pPr>
@@ -2420,6 +2477,7 @@
           </w:tcPr>
           <w:p>
             <w:pPr>
+              <w:keepNext/>
               <w:spacing w:after="0" w:line="240"/>
               <w:jc w:val="center"/>
             </w:pPr>
@@ -2452,6 +2510,7 @@
           </w:tcPr>
           <w:p>
             <w:pPr>
+              <w:keepNext/>
               <w:spacing w:after="0" w:line="240"/>
               <w:jc w:val="center"/>
             </w:pPr>
@@ -2484,6 +2543,7 @@
           </w:tcPr>
           <w:p>
             <w:pPr>
+              <w:keepNext/>
               <w:spacing w:after="0" w:line="240"/>
               <w:jc w:val="center"/>
             </w:pPr>
@@ -2521,6 +2581,7 @@
           </w:tcPr>
           <w:p>
             <w:pPr>
+              <w:keepNext/>
               <w:spacing w:after="0" w:line="240"/>
               <w:jc w:val="left"/>
             </w:pPr>
@@ -2553,6 +2614,7 @@
           </w:tcPr>
           <w:p>
             <w:pPr>
+              <w:keepNext/>
               <w:spacing w:after="0" w:line="240"/>
               <w:jc w:val="center"/>
             </w:pPr>
@@ -2585,6 +2647,7 @@
           </w:tcPr>
           <w:p>
             <w:pPr>
+              <w:keepNext/>
               <w:spacing w:after="0" w:line="240"/>
               <w:jc w:val="center"/>
             </w:pPr>
@@ -2617,6 +2680,7 @@
           </w:tcPr>
           <w:p>
             <w:pPr>
+              <w:keepNext/>
               <w:spacing w:after="0" w:line="240"/>
               <w:jc w:val="center"/>
             </w:pPr>
@@ -2738,6 +2802,7 @@
           </w:tcPr>
           <w:p>
             <w:pPr>
+              <w:keepNext/>
               <w:spacing w:after="0" w:line="240"/>
               <w:jc w:val="left"/>
             </w:pPr>
@@ -2773,6 +2838,7 @@
           </w:tcPr>
           <w:p>
             <w:pPr>
+              <w:keepNext/>
               <w:spacing w:after="0" w:line="240"/>
               <w:jc w:val="center"/>
             </w:pPr>
@@ -2808,6 +2874,7 @@
           </w:tcPr>
           <w:p>
             <w:pPr>
+              <w:keepNext/>
               <w:spacing w:after="0" w:line="240"/>
               <w:jc w:val="center"/>
             </w:pPr>
@@ -2843,6 +2910,7 @@
           </w:tcPr>
           <w:p>
             <w:pPr>
+              <w:keepNext/>
               <w:spacing w:after="0" w:line="240"/>
               <w:jc w:val="center"/>
             </w:pPr>
@@ -2878,6 +2946,7 @@
           </w:tcPr>
           <w:p>
             <w:pPr>
+              <w:keepNext/>
               <w:spacing w:after="0" w:line="240"/>
               <w:jc w:val="center"/>
             </w:pPr>
@@ -2913,6 +2982,7 @@
           </w:tcPr>
           <w:p>
             <w:pPr>
+              <w:keepNext/>
               <w:spacing w:after="0" w:line="240"/>
               <w:jc w:val="center"/>
             </w:pPr>
@@ -2948,6 +3018,7 @@
           </w:tcPr>
           <w:p>
             <w:pPr>
+              <w:keepNext/>
               <w:spacing w:after="0" w:line="240"/>
               <w:jc w:val="center"/>
             </w:pPr>
@@ -2983,6 +3054,7 @@
           </w:tcPr>
           <w:p>
             <w:pPr>
+              <w:keepNext/>
               <w:spacing w:after="0" w:line="240"/>
               <w:jc w:val="center"/>
             </w:pPr>
@@ -3018,6 +3090,7 @@
           </w:tcPr>
           <w:p>
             <w:pPr>
+              <w:keepNext/>
               <w:spacing w:after="0" w:line="240"/>
               <w:jc w:val="center"/>
             </w:pPr>
@@ -3053,6 +3126,7 @@
           </w:tcPr>
           <w:p>
             <w:pPr>
+              <w:keepNext/>
               <w:spacing w:after="0" w:line="240"/>
               <w:jc w:val="center"/>
             </w:pPr>
@@ -3092,6 +3166,7 @@
           </w:tcPr>
           <w:p>
             <w:pPr>
+              <w:keepNext/>
               <w:spacing w:after="0" w:line="240"/>
               <w:jc w:val="left"/>
             </w:pPr>
@@ -3124,6 +3199,7 @@
           </w:tcPr>
           <w:p>
             <w:pPr>
+              <w:keepNext/>
               <w:spacing w:after="0" w:line="240"/>
               <w:jc w:val="center"/>
             </w:pPr>
@@ -3156,6 +3232,7 @@
           </w:tcPr>
           <w:p>
             <w:pPr>
+              <w:keepNext/>
               <w:spacing w:after="0" w:line="240"/>
               <w:jc w:val="center"/>
             </w:pPr>
@@ -3188,6 +3265,7 @@
           </w:tcPr>
           <w:p>
             <w:pPr>
+              <w:keepNext/>
               <w:spacing w:after="0" w:line="240"/>
               <w:jc w:val="center"/>
             </w:pPr>
@@ -3220,6 +3298,7 @@
           </w:tcPr>
           <w:p>
             <w:pPr>
+              <w:keepNext/>
               <w:spacing w:after="0" w:line="240"/>
               <w:jc w:val="center"/>
             </w:pPr>
@@ -3252,6 +3331,7 @@
           </w:tcPr>
           <w:p>
             <w:pPr>
+              <w:keepNext/>
               <w:spacing w:after="0" w:line="240"/>
               <w:jc w:val="center"/>
             </w:pPr>
@@ -3284,6 +3364,7 @@
           </w:tcPr>
           <w:p>
             <w:pPr>
+              <w:keepNext/>
               <w:spacing w:after="0" w:line="240"/>
               <w:jc w:val="center"/>
             </w:pPr>
@@ -3316,6 +3397,7 @@
           </w:tcPr>
           <w:p>
             <w:pPr>
+              <w:keepNext/>
               <w:spacing w:after="0" w:line="240"/>
               <w:jc w:val="center"/>
             </w:pPr>
@@ -3348,6 +3430,7 @@
           </w:tcPr>
           <w:p>
             <w:pPr>
+              <w:keepNext/>
               <w:spacing w:after="0" w:line="240"/>
               <w:jc w:val="center"/>
             </w:pPr>
@@ -3380,6 +3463,7 @@
           </w:tcPr>
           <w:p>
             <w:pPr>
+              <w:keepNext/>
               <w:spacing w:after="0" w:line="240"/>
               <w:jc w:val="center"/>
             </w:pPr>
@@ -3417,6 +3501,7 @@
           </w:tcPr>
           <w:p>
             <w:pPr>
+              <w:keepNext/>
               <w:spacing w:after="0" w:line="240"/>
               <w:jc w:val="left"/>
             </w:pPr>
@@ -3449,6 +3534,7 @@
           </w:tcPr>
           <w:p>
             <w:pPr>
+              <w:keepNext/>
               <w:spacing w:after="0" w:line="240"/>
               <w:jc w:val="center"/>
             </w:pPr>
@@ -3481,6 +3567,7 @@
           </w:tcPr>
           <w:p>
             <w:pPr>
+              <w:keepNext/>
               <w:spacing w:after="0" w:line="240"/>
               <w:jc w:val="center"/>
             </w:pPr>
@@ -3513,6 +3600,7 @@
           </w:tcPr>
           <w:p>
             <w:pPr>
+              <w:keepNext/>
               <w:spacing w:after="0" w:line="240"/>
               <w:jc w:val="center"/>
             </w:pPr>
@@ -3545,6 +3633,7 @@
           </w:tcPr>
           <w:p>
             <w:pPr>
+              <w:keepNext/>
               <w:spacing w:after="0" w:line="240"/>
               <w:jc w:val="center"/>
             </w:pPr>
@@ -3577,6 +3666,7 @@
           </w:tcPr>
           <w:p>
             <w:pPr>
+              <w:keepNext/>
               <w:spacing w:after="0" w:line="240"/>
               <w:jc w:val="center"/>
             </w:pPr>
@@ -3609,6 +3699,7 @@
           </w:tcPr>
           <w:p>
             <w:pPr>
+              <w:keepNext/>
               <w:spacing w:after="0" w:line="240"/>
               <w:jc w:val="center"/>
             </w:pPr>
@@ -3641,6 +3732,7 @@
           </w:tcPr>
           <w:p>
             <w:pPr>
+              <w:keepNext/>
               <w:spacing w:after="0" w:line="240"/>
               <w:jc w:val="center"/>
             </w:pPr>
@@ -3673,6 +3765,7 @@
           </w:tcPr>
           <w:p>
             <w:pPr>
+              <w:keepNext/>
               <w:spacing w:after="0" w:line="240"/>
               <w:jc w:val="center"/>
             </w:pPr>
@@ -3705,6 +3798,7 @@
           </w:tcPr>
           <w:p>
             <w:pPr>
+              <w:keepNext/>
               <w:spacing w:after="0" w:line="240"/>
               <w:jc w:val="center"/>
             </w:pPr>
@@ -3742,6 +3836,7 @@
           </w:tcPr>
           <w:p>
             <w:pPr>
+              <w:keepNext/>
               <w:spacing w:after="0" w:line="240"/>
               <w:jc w:val="left"/>
             </w:pPr>
@@ -3774,6 +3869,7 @@
           </w:tcPr>
           <w:p>
             <w:pPr>
+              <w:keepNext/>
               <w:spacing w:after="0" w:line="240"/>
               <w:jc w:val="center"/>
             </w:pPr>
@@ -3806,6 +3902,7 @@
           </w:tcPr>
           <w:p>
             <w:pPr>
+              <w:keepNext/>
               <w:spacing w:after="0" w:line="240"/>
               <w:jc w:val="center"/>
             </w:pPr>
@@ -3838,6 +3935,7 @@
           </w:tcPr>
           <w:p>
             <w:pPr>
+              <w:keepNext/>
               <w:spacing w:after="0" w:line="240"/>
               <w:jc w:val="center"/>
             </w:pPr>
@@ -3870,6 +3968,7 @@
           </w:tcPr>
           <w:p>
             <w:pPr>
+              <w:keepNext/>
               <w:spacing w:after="0" w:line="240"/>
               <w:jc w:val="center"/>
             </w:pPr>
@@ -3902,6 +4001,7 @@
           </w:tcPr>
           <w:p>
             <w:pPr>
+              <w:keepNext/>
               <w:spacing w:after="0" w:line="240"/>
               <w:jc w:val="center"/>
             </w:pPr>
@@ -3934,6 +4034,7 @@
           </w:tcPr>
           <w:p>
             <w:pPr>
+              <w:keepNext/>
               <w:spacing w:after="0" w:line="240"/>
               <w:jc w:val="center"/>
             </w:pPr>
@@ -3966,6 +4067,7 @@
           </w:tcPr>
           <w:p>
             <w:pPr>
+              <w:keepNext/>
               <w:spacing w:after="0" w:line="240"/>
               <w:jc w:val="center"/>
             </w:pPr>
@@ -3998,6 +4100,7 @@
           </w:tcPr>
           <w:p>
             <w:pPr>
+              <w:keepNext/>
               <w:spacing w:after="0" w:line="240"/>
               <w:jc w:val="center"/>
             </w:pPr>
@@ -4030,6 +4133,7 @@
           </w:tcPr>
           <w:p>
             <w:pPr>
+              <w:keepNext/>
               <w:spacing w:after="0" w:line="240"/>
               <w:jc w:val="center"/>
             </w:pPr>
@@ -4067,6 +4171,7 @@
           </w:tcPr>
           <w:p>
             <w:pPr>
+              <w:keepNext/>
               <w:spacing w:after="0" w:line="240"/>
               <w:jc w:val="left"/>
             </w:pPr>
@@ -4101,6 +4206,7 @@
           </w:tcPr>
           <w:p>
             <w:pPr>
+              <w:keepNext/>
               <w:spacing w:after="0" w:line="240"/>
               <w:jc w:val="center"/>
             </w:pPr>
@@ -4133,6 +4239,7 @@
           </w:tcPr>
           <w:p>
             <w:pPr>
+              <w:keepNext/>
               <w:spacing w:after="0" w:line="240"/>
               <w:jc w:val="center"/>
             </w:pPr>
@@ -4167,6 +4274,7 @@
           </w:tcPr>
           <w:p>
             <w:pPr>
+              <w:keepNext/>
               <w:spacing w:after="0" w:line="240"/>
               <w:jc w:val="center"/>
             </w:pPr>
@@ -4199,6 +4307,7 @@
           </w:tcPr>
           <w:p>
             <w:pPr>
+              <w:keepNext/>
               <w:spacing w:after="0" w:line="240"/>
               <w:jc w:val="center"/>
             </w:pPr>
@@ -4231,6 +4340,7 @@
           </w:tcPr>
           <w:p>
             <w:pPr>
+              <w:keepNext/>
               <w:spacing w:after="0" w:line="240"/>
               <w:jc w:val="center"/>
             </w:pPr>
@@ -4263,6 +4373,7 @@
           </w:tcPr>
           <w:p>
             <w:pPr>
+              <w:keepNext/>
               <w:spacing w:after="0" w:line="240"/>
               <w:jc w:val="center"/>
             </w:pPr>
@@ -4295,6 +4406,7 @@
           </w:tcPr>
           <w:p>
             <w:pPr>
+              <w:keepNext/>
               <w:spacing w:after="0" w:line="240"/>
               <w:jc w:val="center"/>
             </w:pPr>
@@ -4329,6 +4441,7 @@
           </w:tcPr>
           <w:p>
             <w:pPr>
+              <w:keepNext/>
               <w:spacing w:after="0" w:line="240"/>
               <w:jc w:val="center"/>
             </w:pPr>
@@ -4361,6 +4474,7 @@
           </w:tcPr>
           <w:p>
             <w:pPr>
+              <w:keepNext/>
               <w:spacing w:after="0" w:line="240"/>
               <w:jc w:val="center"/>
             </w:pPr>
@@ -4398,6 +4512,7 @@
           </w:tcPr>
           <w:p>
             <w:pPr>
+              <w:keepNext/>
               <w:spacing w:after="0" w:line="240"/>
               <w:jc w:val="left"/>
             </w:pPr>
@@ -4430,6 +4545,7 @@
           </w:tcPr>
           <w:p>
             <w:pPr>
+              <w:keepNext/>
               <w:spacing w:after="0" w:line="240"/>
               <w:jc w:val="center"/>
             </w:pPr>
@@ -4462,6 +4578,7 @@
           </w:tcPr>
           <w:p>
             <w:pPr>
+              <w:keepNext/>
               <w:spacing w:after="0" w:line="240"/>
               <w:jc w:val="center"/>
             </w:pPr>
@@ -4494,6 +4611,7 @@
           </w:tcPr>
           <w:p>
             <w:pPr>
+              <w:keepNext/>
               <w:spacing w:after="0" w:line="240"/>
               <w:jc w:val="center"/>
             </w:pPr>
@@ -4526,6 +4644,7 @@
           </w:tcPr>
           <w:p>
             <w:pPr>
+              <w:keepNext/>
               <w:spacing w:after="0" w:line="240"/>
               <w:jc w:val="center"/>
             </w:pPr>
@@ -4558,6 +4677,7 @@
           </w:tcPr>
           <w:p>
             <w:pPr>
+              <w:keepNext/>
               <w:spacing w:after="0" w:line="240"/>
               <w:jc w:val="center"/>
             </w:pPr>
@@ -4590,6 +4710,7 @@
           </w:tcPr>
           <w:p>
             <w:pPr>
+              <w:keepNext/>
               <w:spacing w:after="0" w:line="240"/>
               <w:jc w:val="center"/>
             </w:pPr>
@@ -4622,6 +4743,7 @@
           </w:tcPr>
           <w:p>
             <w:pPr>
+              <w:keepNext/>
               <w:spacing w:after="0" w:line="240"/>
               <w:jc w:val="center"/>
             </w:pPr>
@@ -4654,6 +4776,7 @@
           </w:tcPr>
           <w:p>
             <w:pPr>
+              <w:keepNext/>
               <w:spacing w:after="0" w:line="240"/>
               <w:jc w:val="center"/>
             </w:pPr>
@@ -4686,6 +4809,7 @@
           </w:tcPr>
           <w:p>
             <w:pPr>
+              <w:keepNext/>
               <w:spacing w:after="0" w:line="240"/>
               <w:jc w:val="center"/>
             </w:pPr>
@@ -4723,6 +4847,7 @@
           </w:tcPr>
           <w:p>
             <w:pPr>
+              <w:keepNext/>
               <w:spacing w:after="0" w:line="240"/>
               <w:jc w:val="left"/>
             </w:pPr>
@@ -4755,6 +4880,7 @@
           </w:tcPr>
           <w:p>
             <w:pPr>
+              <w:keepNext/>
               <w:spacing w:after="0" w:line="240"/>
               <w:jc w:val="center"/>
             </w:pPr>
@@ -4787,6 +4913,7 @@
           </w:tcPr>
           <w:p>
             <w:pPr>
+              <w:keepNext/>
               <w:spacing w:after="0" w:line="240"/>
               <w:jc w:val="center"/>
             </w:pPr>
@@ -4819,6 +4946,7 @@
           </w:tcPr>
           <w:p>
             <w:pPr>
+              <w:keepNext/>
               <w:spacing w:after="0" w:line="240"/>
               <w:jc w:val="center"/>
             </w:pPr>
@@ -4851,6 +4979,7 @@
           </w:tcPr>
           <w:p>
             <w:pPr>
+              <w:keepNext/>
               <w:spacing w:after="0" w:line="240"/>
               <w:jc w:val="center"/>
             </w:pPr>
@@ -4883,6 +5012,7 @@
           </w:tcPr>
           <w:p>
             <w:pPr>
+              <w:keepNext/>
               <w:spacing w:after="0" w:line="240"/>
               <w:jc w:val="center"/>
             </w:pPr>
@@ -4915,6 +5045,7 @@
           </w:tcPr>
           <w:p>
             <w:pPr>
+              <w:keepNext/>
               <w:spacing w:after="0" w:line="240"/>
               <w:jc w:val="center"/>
             </w:pPr>
@@ -4947,6 +5078,7 @@
           </w:tcPr>
           <w:p>
             <w:pPr>
+              <w:keepNext/>
               <w:spacing w:after="0" w:line="240"/>
               <w:jc w:val="center"/>
             </w:pPr>
@@ -4979,6 +5111,7 @@
           </w:tcPr>
           <w:p>
             <w:pPr>
+              <w:keepNext/>
               <w:spacing w:after="0" w:line="240"/>
               <w:jc w:val="center"/>
             </w:pPr>
@@ -5011,6 +5144,7 @@
           </w:tcPr>
           <w:p>
             <w:pPr>
+              <w:keepNext/>
               <w:spacing w:after="0" w:line="240"/>
               <w:jc w:val="center"/>
             </w:pPr>
@@ -5048,6 +5182,7 @@
           </w:tcPr>
           <w:p>
             <w:pPr>
+              <w:keepNext/>
               <w:spacing w:after="0" w:line="240"/>
               <w:jc w:val="left"/>
             </w:pPr>
@@ -5080,6 +5215,7 @@
           </w:tcPr>
           <w:p>
             <w:pPr>
+              <w:keepNext/>
               <w:spacing w:after="0" w:line="240"/>
               <w:jc w:val="center"/>
             </w:pPr>
@@ -5112,6 +5248,7 @@
           </w:tcPr>
           <w:p>
             <w:pPr>
+              <w:keepNext/>
               <w:spacing w:after="0" w:line="240"/>
               <w:jc w:val="center"/>
             </w:pPr>
@@ -5144,6 +5281,7 @@
           </w:tcPr>
           <w:p>
             <w:pPr>
+              <w:keepNext/>
               <w:spacing w:after="0" w:line="240"/>
               <w:jc w:val="center"/>
             </w:pPr>
@@ -5178,6 +5316,7 @@
           </w:tcPr>
           <w:p>
             <w:pPr>
+              <w:keepNext/>
               <w:spacing w:after="0" w:line="240"/>
               <w:jc w:val="center"/>
             </w:pPr>
@@ -5210,6 +5349,7 @@
           </w:tcPr>
           <w:p>
             <w:pPr>
+              <w:keepNext/>
               <w:spacing w:after="0" w:line="240"/>
               <w:jc w:val="center"/>
             </w:pPr>
@@ -5242,6 +5382,7 @@
           </w:tcPr>
           <w:p>
             <w:pPr>
+              <w:keepNext/>
               <w:spacing w:after="0" w:line="240"/>
               <w:jc w:val="center"/>
             </w:pPr>
@@ -5274,6 +5415,7 @@
           </w:tcPr>
           <w:p>
             <w:pPr>
+              <w:keepNext/>
               <w:spacing w:after="0" w:line="240"/>
               <w:jc w:val="center"/>
             </w:pPr>
@@ -5306,6 +5448,7 @@
           </w:tcPr>
           <w:p>
             <w:pPr>
+              <w:keepNext/>
               <w:spacing w:after="0" w:line="240"/>
               <w:jc w:val="center"/>
             </w:pPr>
@@ -5338,6 +5481,7 @@
           </w:tcPr>
           <w:p>
             <w:pPr>
+              <w:keepNext/>
               <w:spacing w:after="0" w:line="240"/>
               <w:jc w:val="center"/>
             </w:pPr>
@@ -5454,7 +5598,7 @@
         <w:rPr>
           <w:rFonts w:ascii="Times New Roman" w:cs="Times New Roman" w:eastAsia="Times New Roman" w:hAnsi="Times New Roman"/>
         </w:rPr>
-        <w:t xml:space="preserve">Pairwise DeLong tests (Table 3) showed that XGBoost was significantly better than LR (p = 0.005), RF (p = 0.001), SVM (p = 0.002) and ResNet (p = 0.002), but not than the MLP (p = 0.064) or the FT-Transformer (p = 0.075). No deep learning model was significantly better than any classical model: wherever a deep model had the higher AUC (the MLP and FT-Transformer versus LR, RF and SVM), p ranged from 0.161 to 0.460. Within the deep family, the MLP was significantly better than ResNet (p = 0.031).</w:t>
+        <w:t xml:space="preserve">Pairwise DeLong tests compared all 21 model pairs (Table 3). After Holm correction for multiple comparisons, XGBoost remained significantly better than RF (adjusted p = 0.012), ResNet (p = 0.036) and SVM (p = 0.040); its advantage over LR (unadjusted p = 0.005) was no longer significant (adjusted p = 0.095), and it did not differ significantly from the MLP or the FT-Transformer (adjusted p = 1.000). No deep learning model was significantly better than any classical model, with or without correction: wherever a deep model had the higher AUC (the MLP and FT-Transformer versus LR, RF and SVM), unadjusted p ranged from 0.161 to 0.460. The difference between the MLP and ResNet (unadjusted p = 0.031) did not survive correction (adjusted p = 0.525).</w:t>
       </w:r>
     </w:p>
     <w:p>
@@ -5479,7 +5623,7 @@
           <w:sz w:val="20"/>
           <w:szCs w:val="20"/>
         </w:rPr>
-        <w:t xml:space="preserve"> Pairwise DeLong test p-values for differences in test ROC-AUC (bold: p &lt; 0.05)</w:t>
+        <w:t xml:space="preserve"> Pairwise DeLong test p-values for differences in test ROC-AUC. Upper triangle: unadjusted; lower triangle: Holm-adjusted for 21 comparisons (bold: p &lt; 0.05)</w:t>
       </w:r>
     </w:p>
     <w:tbl>
@@ -5528,6 +5672,7 @@
           </w:tcPr>
           <w:p>
             <w:pPr>
+              <w:keepNext/>
               <w:spacing w:after="0" w:line="240"/>
               <w:jc w:val="left"/>
             </w:pPr>
@@ -5553,6 +5698,7 @@
           </w:tcPr>
           <w:p>
             <w:pPr>
+              <w:keepNext/>
               <w:spacing w:after="0" w:line="240"/>
               <w:jc w:val="center"/>
             </w:pPr>
@@ -5588,6 +5734,7 @@
           </w:tcPr>
           <w:p>
             <w:pPr>
+              <w:keepNext/>
               <w:spacing w:after="0" w:line="240"/>
               <w:jc w:val="center"/>
             </w:pPr>
@@ -5623,6 +5770,7 @@
           </w:tcPr>
           <w:p>
             <w:pPr>
+              <w:keepNext/>
               <w:spacing w:after="0" w:line="240"/>
               <w:jc w:val="center"/>
             </w:pPr>
@@ -5658,6 +5806,7 @@
           </w:tcPr>
           <w:p>
             <w:pPr>
+              <w:keepNext/>
               <w:spacing w:after="0" w:line="240"/>
               <w:jc w:val="center"/>
             </w:pPr>
@@ -5693,6 +5842,7 @@
           </w:tcPr>
           <w:p>
             <w:pPr>
+              <w:keepNext/>
               <w:spacing w:after="0" w:line="240"/>
               <w:jc w:val="center"/>
             </w:pPr>
@@ -5728,6 +5878,7 @@
           </w:tcPr>
           <w:p>
             <w:pPr>
+              <w:keepNext/>
               <w:spacing w:after="0" w:line="240"/>
               <w:jc w:val="center"/>
             </w:pPr>
@@ -5763,6 +5914,7 @@
           </w:tcPr>
           <w:p>
             <w:pPr>
+              <w:keepNext/>
               <w:spacing w:after="0" w:line="240"/>
               <w:jc w:val="center"/>
             </w:pPr>
@@ -5802,6 +5954,7 @@
           </w:tcPr>
           <w:p>
             <w:pPr>
+              <w:keepNext/>
               <w:spacing w:after="0" w:line="240"/>
               <w:jc w:val="left"/>
             </w:pPr>
@@ -5834,6 +5987,7 @@
           </w:tcPr>
           <w:p>
             <w:pPr>
+              <w:keepNext/>
               <w:spacing w:after="0" w:line="240"/>
               <w:jc w:val="center"/>
             </w:pPr>
@@ -5866,6 +6020,7 @@
           </w:tcPr>
           <w:p>
             <w:pPr>
+              <w:keepNext/>
               <w:spacing w:after="0" w:line="240"/>
               <w:jc w:val="center"/>
             </w:pPr>
@@ -5898,6 +6053,7 @@
           </w:tcPr>
           <w:p>
             <w:pPr>
+              <w:keepNext/>
               <w:spacing w:after="0" w:line="240"/>
               <w:jc w:val="center"/>
             </w:pPr>
@@ -5930,6 +6086,7 @@
           </w:tcPr>
           <w:p>
             <w:pPr>
+              <w:keepNext/>
               <w:spacing w:after="0" w:line="240"/>
               <w:jc w:val="center"/>
             </w:pPr>
@@ -5964,6 +6121,7 @@
           </w:tcPr>
           <w:p>
             <w:pPr>
+              <w:keepNext/>
               <w:spacing w:after="0" w:line="240"/>
               <w:jc w:val="center"/>
             </w:pPr>
@@ -5996,6 +6154,7 @@
           </w:tcPr>
           <w:p>
             <w:pPr>
+              <w:keepNext/>
               <w:spacing w:after="0" w:line="240"/>
               <w:jc w:val="center"/>
             </w:pPr>
@@ -6028,6 +6187,7 @@
           </w:tcPr>
           <w:p>
             <w:pPr>
+              <w:keepNext/>
               <w:spacing w:after="0" w:line="240"/>
               <w:jc w:val="center"/>
             </w:pPr>
@@ -6065,6 +6225,7 @@
           </w:tcPr>
           <w:p>
             <w:pPr>
+              <w:keepNext/>
               <w:spacing w:after="0" w:line="240"/>
               <w:jc w:val="left"/>
             </w:pPr>
@@ -6097,16 +6258,17 @@
           </w:tcPr>
           <w:p>
             <w:pPr>
-              <w:spacing w:after="0" w:line="240"/>
-              <w:jc w:val="center"/>
-            </w:pPr>
-            <w:r>
-              <w:rPr>
-                <w:rFonts w:ascii="Times New Roman" w:cs="Times New Roman" w:eastAsia="Times New Roman" w:hAnsi="Times New Roman"/>
-                <w:sz w:val="18"/>
-                <w:szCs w:val="18"/>
-              </w:rPr>
-              <w:t xml:space="preserve">0.944</w:t>
+              <w:keepNext/>
+              <w:spacing w:after="0" w:line="240"/>
+              <w:jc w:val="center"/>
+            </w:pPr>
+            <w:r>
+              <w:rPr>
+                <w:rFonts w:ascii="Times New Roman" w:cs="Times New Roman" w:eastAsia="Times New Roman" w:hAnsi="Times New Roman"/>
+                <w:sz w:val="18"/>
+                <w:szCs w:val="18"/>
+              </w:rPr>
+              <w:t xml:space="preserve">1.000</w:t>
             </w:r>
           </w:p>
         </w:tc>
@@ -6129,6 +6291,7 @@
           </w:tcPr>
           <w:p>
             <w:pPr>
+              <w:keepNext/>
               <w:spacing w:after="0" w:line="240"/>
               <w:jc w:val="center"/>
             </w:pPr>
@@ -6161,6 +6324,7 @@
           </w:tcPr>
           <w:p>
             <w:pPr>
+              <w:keepNext/>
               <w:spacing w:after="0" w:line="240"/>
               <w:jc w:val="center"/>
             </w:pPr>
@@ -6193,6 +6357,7 @@
           </w:tcPr>
           <w:p>
             <w:pPr>
+              <w:keepNext/>
               <w:spacing w:after="0" w:line="240"/>
               <w:jc w:val="center"/>
             </w:pPr>
@@ -6227,6 +6392,7 @@
           </w:tcPr>
           <w:p>
             <w:pPr>
+              <w:keepNext/>
               <w:spacing w:after="0" w:line="240"/>
               <w:jc w:val="center"/>
             </w:pPr>
@@ -6259,6 +6425,7 @@
           </w:tcPr>
           <w:p>
             <w:pPr>
+              <w:keepNext/>
               <w:spacing w:after="0" w:line="240"/>
               <w:jc w:val="center"/>
             </w:pPr>
@@ -6291,6 +6458,7 @@
           </w:tcPr>
           <w:p>
             <w:pPr>
+              <w:keepNext/>
               <w:spacing w:after="0" w:line="240"/>
               <w:jc w:val="center"/>
             </w:pPr>
@@ -6328,6 +6496,7 @@
           </w:tcPr>
           <w:p>
             <w:pPr>
+              <w:keepNext/>
               <w:spacing w:after="0" w:line="240"/>
               <w:jc w:val="left"/>
             </w:pPr>
@@ -6360,16 +6529,17 @@
           </w:tcPr>
           <w:p>
             <w:pPr>
-              <w:spacing w:after="0" w:line="240"/>
-              <w:jc w:val="center"/>
-            </w:pPr>
-            <w:r>
-              <w:rPr>
-                <w:rFonts w:ascii="Times New Roman" w:cs="Times New Roman" w:eastAsia="Times New Roman" w:hAnsi="Times New Roman"/>
-                <w:sz w:val="18"/>
-                <w:szCs w:val="18"/>
-              </w:rPr>
-              <w:t xml:space="preserve">0.876</w:t>
+              <w:keepNext/>
+              <w:spacing w:after="0" w:line="240"/>
+              <w:jc w:val="center"/>
+            </w:pPr>
+            <w:r>
+              <w:rPr>
+                <w:rFonts w:ascii="Times New Roman" w:cs="Times New Roman" w:eastAsia="Times New Roman" w:hAnsi="Times New Roman"/>
+                <w:sz w:val="18"/>
+                <w:szCs w:val="18"/>
+              </w:rPr>
+              <w:t xml:space="preserve">1.000</w:t>
             </w:r>
           </w:p>
         </w:tc>
@@ -6392,6 +6562,7 @@
           </w:tcPr>
           <w:p>
             <w:pPr>
+              <w:keepNext/>
               <w:spacing w:after="0" w:line="240"/>
               <w:jc w:val="center"/>
             </w:pPr>
@@ -6424,6 +6595,7 @@
           </w:tcPr>
           <w:p>
             <w:pPr>
+              <w:keepNext/>
               <w:spacing w:after="0" w:line="240"/>
               <w:jc w:val="center"/>
             </w:pPr>
@@ -6456,6 +6628,7 @@
           </w:tcPr>
           <w:p>
             <w:pPr>
+              <w:keepNext/>
               <w:spacing w:after="0" w:line="240"/>
               <w:jc w:val="center"/>
             </w:pPr>
@@ -6490,6 +6663,7 @@
           </w:tcPr>
           <w:p>
             <w:pPr>
+              <w:keepNext/>
               <w:spacing w:after="0" w:line="240"/>
               <w:jc w:val="center"/>
             </w:pPr>
@@ -6522,6 +6696,7 @@
           </w:tcPr>
           <w:p>
             <w:pPr>
+              <w:keepNext/>
               <w:spacing w:after="0" w:line="240"/>
               <w:jc w:val="center"/>
             </w:pPr>
@@ -6554,6 +6729,7 @@
           </w:tcPr>
           <w:p>
             <w:pPr>
+              <w:keepNext/>
               <w:spacing w:after="0" w:line="240"/>
               <w:jc w:val="center"/>
             </w:pPr>
@@ -6591,6 +6767,7 @@
           </w:tcPr>
           <w:p>
             <w:pPr>
+              <w:keepNext/>
               <w:spacing w:after="0" w:line="240"/>
               <w:jc w:val="left"/>
             </w:pPr>
@@ -6623,6 +6800,40 @@
           </w:tcPr>
           <w:p>
             <w:pPr>
+              <w:keepNext/>
+              <w:spacing w:after="0" w:line="240"/>
+              <w:jc w:val="center"/>
+            </w:pPr>
+            <w:r>
+              <w:rPr>
+                <w:rFonts w:ascii="Times New Roman" w:cs="Times New Roman" w:eastAsia="Times New Roman" w:hAnsi="Times New Roman"/>
+                <w:sz w:val="18"/>
+                <w:szCs w:val="18"/>
+              </w:rPr>
+              <w:t xml:space="preserve">0.095</w:t>
+            </w:r>
+          </w:p>
+        </w:tc>
+        <w:tc>
+          <w:tcPr>
+            <w:tcW w:type="dxa" w:w="1155"/>
+            <w:tcBorders>
+              <w:top w:val="single" w:color="808080" w:sz="4"/>
+              <w:left w:val="single" w:color="808080" w:sz="4"/>
+              <w:bottom w:val="single" w:color="808080" w:sz="4"/>
+              <w:right w:val="single" w:color="808080" w:sz="4"/>
+            </w:tcBorders>
+            <w:tcMar>
+              <w:top w:type="dxa" w:w="40"/>
+              <w:left w:type="dxa" w:w="70"/>
+              <w:bottom w:type="dxa" w:w="40"/>
+              <w:right w:type="dxa" w:w="70"/>
+            </w:tcMar>
+            <w:vAlign w:val="center"/>
+          </w:tcPr>
+          <w:p>
+            <w:pPr>
+              <w:keepNext/>
               <w:spacing w:after="0" w:line="240"/>
               <w:jc w:val="center"/>
             </w:pPr>
@@ -6634,7 +6845,7 @@
                 <w:sz w:val="18"/>
                 <w:szCs w:val="18"/>
               </w:rPr>
-              <w:t xml:space="preserve">0.005</w:t>
+              <w:t xml:space="preserve">0.012</w:t>
             </w:r>
           </w:p>
         </w:tc>
@@ -6657,6 +6868,7 @@
           </w:tcPr>
           <w:p>
             <w:pPr>
+              <w:keepNext/>
               <w:spacing w:after="0" w:line="240"/>
               <w:jc w:val="center"/>
             </w:pPr>
@@ -6668,7 +6880,7 @@
                 <w:sz w:val="18"/>
                 <w:szCs w:val="18"/>
               </w:rPr>
-              <w:t xml:space="preserve">0.001</w:t>
+              <w:t xml:space="preserve">0.040</w:t>
             </w:r>
           </w:p>
         </w:tc>
@@ -6691,6 +6903,73 @@
           </w:tcPr>
           <w:p>
             <w:pPr>
+              <w:keepNext/>
+              <w:spacing w:after="0" w:line="240"/>
+              <w:jc w:val="center"/>
+            </w:pPr>
+            <w:r>
+              <w:rPr>
+                <w:rFonts w:ascii="Times New Roman" w:cs="Times New Roman" w:eastAsia="Times New Roman" w:hAnsi="Times New Roman"/>
+                <w:sz w:val="18"/>
+                <w:szCs w:val="18"/>
+              </w:rPr>
+              <w:t xml:space="preserve">–</w:t>
+            </w:r>
+          </w:p>
+        </w:tc>
+        <w:tc>
+          <w:tcPr>
+            <w:tcW w:type="dxa" w:w="1155"/>
+            <w:tcBorders>
+              <w:top w:val="single" w:color="808080" w:sz="4"/>
+              <w:left w:val="single" w:color="808080" w:sz="4"/>
+              <w:bottom w:val="single" w:color="808080" w:sz="4"/>
+              <w:right w:val="single" w:color="808080" w:sz="4"/>
+            </w:tcBorders>
+            <w:tcMar>
+              <w:top w:type="dxa" w:w="40"/>
+              <w:left w:type="dxa" w:w="70"/>
+              <w:bottom w:type="dxa" w:w="40"/>
+              <w:right w:type="dxa" w:w="70"/>
+            </w:tcMar>
+            <w:vAlign w:val="center"/>
+          </w:tcPr>
+          <w:p>
+            <w:pPr>
+              <w:keepNext/>
+              <w:spacing w:after="0" w:line="240"/>
+              <w:jc w:val="center"/>
+            </w:pPr>
+            <w:r>
+              <w:rPr>
+                <w:rFonts w:ascii="Times New Roman" w:cs="Times New Roman" w:eastAsia="Times New Roman" w:hAnsi="Times New Roman"/>
+                <w:sz w:val="18"/>
+                <w:szCs w:val="18"/>
+              </w:rPr>
+              <w:t xml:space="preserve">0.064</w:t>
+            </w:r>
+          </w:p>
+        </w:tc>
+        <w:tc>
+          <w:tcPr>
+            <w:tcW w:type="dxa" w:w="1155"/>
+            <w:tcBorders>
+              <w:top w:val="single" w:color="808080" w:sz="4"/>
+              <w:left w:val="single" w:color="808080" w:sz="4"/>
+              <w:bottom w:val="single" w:color="808080" w:sz="4"/>
+              <w:right w:val="single" w:color="808080" w:sz="4"/>
+            </w:tcBorders>
+            <w:tcMar>
+              <w:top w:type="dxa" w:w="40"/>
+              <w:left w:type="dxa" w:w="70"/>
+              <w:bottom w:type="dxa" w:w="40"/>
+              <w:right w:type="dxa" w:w="70"/>
+            </w:tcMar>
+            <w:vAlign w:val="center"/>
+          </w:tcPr>
+          <w:p>
+            <w:pPr>
+              <w:keepNext/>
               <w:spacing w:after="0" w:line="240"/>
               <w:jc w:val="center"/>
             </w:pPr>
@@ -6708,104 +6987,6 @@
         </w:tc>
         <w:tc>
           <w:tcPr>
-            <w:tcW w:type="dxa" w:w="1155"/>
-            <w:tcBorders>
-              <w:top w:val="single" w:color="808080" w:sz="4"/>
-              <w:left w:val="single" w:color="808080" w:sz="4"/>
-              <w:bottom w:val="single" w:color="808080" w:sz="4"/>
-              <w:right w:val="single" w:color="808080" w:sz="4"/>
-            </w:tcBorders>
-            <w:tcMar>
-              <w:top w:type="dxa" w:w="40"/>
-              <w:left w:type="dxa" w:w="70"/>
-              <w:bottom w:type="dxa" w:w="40"/>
-              <w:right w:type="dxa" w:w="70"/>
-            </w:tcMar>
-            <w:vAlign w:val="center"/>
-          </w:tcPr>
-          <w:p>
-            <w:pPr>
-              <w:spacing w:after="0" w:line="240"/>
-              <w:jc w:val="center"/>
-            </w:pPr>
-            <w:r>
-              <w:rPr>
-                <w:rFonts w:ascii="Times New Roman" w:cs="Times New Roman" w:eastAsia="Times New Roman" w:hAnsi="Times New Roman"/>
-                <w:sz w:val="18"/>
-                <w:szCs w:val="18"/>
-              </w:rPr>
-              <w:t xml:space="preserve">–</w:t>
-            </w:r>
-          </w:p>
-        </w:tc>
-        <w:tc>
-          <w:tcPr>
-            <w:tcW w:type="dxa" w:w="1155"/>
-            <w:tcBorders>
-              <w:top w:val="single" w:color="808080" w:sz="4"/>
-              <w:left w:val="single" w:color="808080" w:sz="4"/>
-              <w:bottom w:val="single" w:color="808080" w:sz="4"/>
-              <w:right w:val="single" w:color="808080" w:sz="4"/>
-            </w:tcBorders>
-            <w:tcMar>
-              <w:top w:type="dxa" w:w="40"/>
-              <w:left w:type="dxa" w:w="70"/>
-              <w:bottom w:type="dxa" w:w="40"/>
-              <w:right w:type="dxa" w:w="70"/>
-            </w:tcMar>
-            <w:vAlign w:val="center"/>
-          </w:tcPr>
-          <w:p>
-            <w:pPr>
-              <w:spacing w:after="0" w:line="240"/>
-              <w:jc w:val="center"/>
-            </w:pPr>
-            <w:r>
-              <w:rPr>
-                <w:rFonts w:ascii="Times New Roman" w:cs="Times New Roman" w:eastAsia="Times New Roman" w:hAnsi="Times New Roman"/>
-                <w:sz w:val="18"/>
-                <w:szCs w:val="18"/>
-              </w:rPr>
-              <w:t xml:space="preserve">0.064</w:t>
-            </w:r>
-          </w:p>
-        </w:tc>
-        <w:tc>
-          <w:tcPr>
-            <w:tcW w:type="dxa" w:w="1155"/>
-            <w:tcBorders>
-              <w:top w:val="single" w:color="808080" w:sz="4"/>
-              <w:left w:val="single" w:color="808080" w:sz="4"/>
-              <w:bottom w:val="single" w:color="808080" w:sz="4"/>
-              <w:right w:val="single" w:color="808080" w:sz="4"/>
-            </w:tcBorders>
-            <w:tcMar>
-              <w:top w:type="dxa" w:w="40"/>
-              <w:left w:type="dxa" w:w="70"/>
-              <w:bottom w:type="dxa" w:w="40"/>
-              <w:right w:type="dxa" w:w="70"/>
-            </w:tcMar>
-            <w:vAlign w:val="center"/>
-          </w:tcPr>
-          <w:p>
-            <w:pPr>
-              <w:spacing w:after="0" w:line="240"/>
-              <w:jc w:val="center"/>
-            </w:pPr>
-            <w:r>
-              <w:rPr>
-                <w:rFonts w:ascii="Times New Roman" w:cs="Times New Roman" w:eastAsia="Times New Roman" w:hAnsi="Times New Roman"/>
-                <w:b/>
-                <w:bCs/>
-                <w:sz w:val="18"/>
-                <w:szCs w:val="18"/>
-              </w:rPr>
-              <w:t xml:space="preserve">0.002</w:t>
-            </w:r>
-          </w:p>
-        </w:tc>
-        <w:tc>
-          <w:tcPr>
             <w:tcW w:type="dxa" w:w="1159"/>
             <w:tcBorders>
               <w:top w:val="single" w:color="808080" w:sz="4"/>
@@ -6823,6 +7004,7 @@
           </w:tcPr>
           <w:p>
             <w:pPr>
+              <w:keepNext/>
               <w:spacing w:after="0" w:line="240"/>
               <w:jc w:val="center"/>
             </w:pPr>
@@ -6860,6 +7042,7 @@
           </w:tcPr>
           <w:p>
             <w:pPr>
+              <w:keepNext/>
               <w:spacing w:after="0" w:line="240"/>
               <w:jc w:val="left"/>
             </w:pPr>
@@ -6892,16 +7075,17 @@
           </w:tcPr>
           <w:p>
             <w:pPr>
-              <w:spacing w:after="0" w:line="240"/>
-              <w:jc w:val="center"/>
-            </w:pPr>
-            <w:r>
-              <w:rPr>
-                <w:rFonts w:ascii="Times New Roman" w:cs="Times New Roman" w:eastAsia="Times New Roman" w:hAnsi="Times New Roman"/>
-                <w:sz w:val="18"/>
-                <w:szCs w:val="18"/>
-              </w:rPr>
-              <w:t xml:space="preserve">0.321</w:t>
+              <w:keepNext/>
+              <w:spacing w:after="0" w:line="240"/>
+              <w:jc w:val="center"/>
+            </w:pPr>
+            <w:r>
+              <w:rPr>
+                <w:rFonts w:ascii="Times New Roman" w:cs="Times New Roman" w:eastAsia="Times New Roman" w:hAnsi="Times New Roman"/>
+                <w:sz w:val="18"/>
+                <w:szCs w:val="18"/>
+              </w:rPr>
+              <w:t xml:space="preserve">1.000</w:t>
             </w:r>
           </w:p>
         </w:tc>
@@ -6924,16 +7108,17 @@
           </w:tcPr>
           <w:p>
             <w:pPr>
-              <w:spacing w:after="0" w:line="240"/>
-              <w:jc w:val="center"/>
-            </w:pPr>
-            <w:r>
-              <w:rPr>
-                <w:rFonts w:ascii="Times New Roman" w:cs="Times New Roman" w:eastAsia="Times New Roman" w:hAnsi="Times New Roman"/>
-                <w:sz w:val="18"/>
-                <w:szCs w:val="18"/>
-              </w:rPr>
-              <w:t xml:space="preserve">0.460</w:t>
+              <w:keepNext/>
+              <w:spacing w:after="0" w:line="240"/>
+              <w:jc w:val="center"/>
+            </w:pPr>
+            <w:r>
+              <w:rPr>
+                <w:rFonts w:ascii="Times New Roman" w:cs="Times New Roman" w:eastAsia="Times New Roman" w:hAnsi="Times New Roman"/>
+                <w:sz w:val="18"/>
+                <w:szCs w:val="18"/>
+              </w:rPr>
+              <w:t xml:space="preserve">1.000</w:t>
             </w:r>
           </w:p>
         </w:tc>
@@ -6956,16 +7141,17 @@
           </w:tcPr>
           <w:p>
             <w:pPr>
-              <w:spacing w:after="0" w:line="240"/>
-              <w:jc w:val="center"/>
-            </w:pPr>
-            <w:r>
-              <w:rPr>
-                <w:rFonts w:ascii="Times New Roman" w:cs="Times New Roman" w:eastAsia="Times New Roman" w:hAnsi="Times New Roman"/>
-                <w:sz w:val="18"/>
-                <w:szCs w:val="18"/>
-              </w:rPr>
-              <w:t xml:space="preserve">0.274</w:t>
+              <w:keepNext/>
+              <w:spacing w:after="0" w:line="240"/>
+              <w:jc w:val="center"/>
+            </w:pPr>
+            <w:r>
+              <w:rPr>
+                <w:rFonts w:ascii="Times New Roman" w:cs="Times New Roman" w:eastAsia="Times New Roman" w:hAnsi="Times New Roman"/>
+                <w:sz w:val="18"/>
+                <w:szCs w:val="18"/>
+              </w:rPr>
+              <w:t xml:space="preserve">1.000</w:t>
             </w:r>
           </w:p>
         </w:tc>
@@ -6988,16 +7174,17 @@
           </w:tcPr>
           <w:p>
             <w:pPr>
-              <w:spacing w:after="0" w:line="240"/>
-              <w:jc w:val="center"/>
-            </w:pPr>
-            <w:r>
-              <w:rPr>
-                <w:rFonts w:ascii="Times New Roman" w:cs="Times New Roman" w:eastAsia="Times New Roman" w:hAnsi="Times New Roman"/>
-                <w:sz w:val="18"/>
-                <w:szCs w:val="18"/>
-              </w:rPr>
-              <w:t xml:space="preserve">0.064</w:t>
+              <w:keepNext/>
+              <w:spacing w:after="0" w:line="240"/>
+              <w:jc w:val="center"/>
+            </w:pPr>
+            <w:r>
+              <w:rPr>
+                <w:rFonts w:ascii="Times New Roman" w:cs="Times New Roman" w:eastAsia="Times New Roman" w:hAnsi="Times New Roman"/>
+                <w:sz w:val="18"/>
+                <w:szCs w:val="18"/>
+              </w:rPr>
+              <w:t xml:space="preserve">1.000</w:t>
             </w:r>
           </w:p>
         </w:tc>
@@ -7020,6 +7207,7 @@
           </w:tcPr>
           <w:p>
             <w:pPr>
+              <w:keepNext/>
               <w:spacing w:after="0" w:line="240"/>
               <w:jc w:val="center"/>
             </w:pPr>
@@ -7052,6 +7240,7 @@
           </w:tcPr>
           <w:p>
             <w:pPr>
+              <w:keepNext/>
               <w:spacing w:after="0" w:line="240"/>
               <w:jc w:val="center"/>
             </w:pPr>
@@ -7086,6 +7275,7 @@
           </w:tcPr>
           <w:p>
             <w:pPr>
+              <w:keepNext/>
               <w:spacing w:after="0" w:line="240"/>
               <w:jc w:val="center"/>
             </w:pPr>
@@ -7123,6 +7313,7 @@
           </w:tcPr>
           <w:p>
             <w:pPr>
+              <w:keepNext/>
               <w:spacing w:after="0" w:line="240"/>
               <w:jc w:val="left"/>
             </w:pPr>
@@ -7155,16 +7346,17 @@
           </w:tcPr>
           <w:p>
             <w:pPr>
-              <w:spacing w:after="0" w:line="240"/>
-              <w:jc w:val="center"/>
-            </w:pPr>
-            <w:r>
-              <w:rPr>
-                <w:rFonts w:ascii="Times New Roman" w:cs="Times New Roman" w:eastAsia="Times New Roman" w:hAnsi="Times New Roman"/>
-                <w:sz w:val="18"/>
-                <w:szCs w:val="18"/>
-              </w:rPr>
-              <w:t xml:space="preserve">0.675</w:t>
+              <w:keepNext/>
+              <w:spacing w:after="0" w:line="240"/>
+              <w:jc w:val="center"/>
+            </w:pPr>
+            <w:r>
+              <w:rPr>
+                <w:rFonts w:ascii="Times New Roman" w:cs="Times New Roman" w:eastAsia="Times New Roman" w:hAnsi="Times New Roman"/>
+                <w:sz w:val="18"/>
+                <w:szCs w:val="18"/>
+              </w:rPr>
+              <w:t xml:space="preserve">1.000</w:t>
             </w:r>
           </w:p>
         </w:tc>
@@ -7187,16 +7379,17 @@
           </w:tcPr>
           <w:p>
             <w:pPr>
-              <w:spacing w:after="0" w:line="240"/>
-              <w:jc w:val="center"/>
-            </w:pPr>
-            <w:r>
-              <w:rPr>
-                <w:rFonts w:ascii="Times New Roman" w:cs="Times New Roman" w:eastAsia="Times New Roman" w:hAnsi="Times New Roman"/>
-                <w:sz w:val="18"/>
-                <w:szCs w:val="18"/>
-              </w:rPr>
-              <w:t xml:space="preserve">0.643</w:t>
+              <w:keepNext/>
+              <w:spacing w:after="0" w:line="240"/>
+              <w:jc w:val="center"/>
+            </w:pPr>
+            <w:r>
+              <w:rPr>
+                <w:rFonts w:ascii="Times New Roman" w:cs="Times New Roman" w:eastAsia="Times New Roman" w:hAnsi="Times New Roman"/>
+                <w:sz w:val="18"/>
+                <w:szCs w:val="18"/>
+              </w:rPr>
+              <w:t xml:space="preserve">1.000</w:t>
             </w:r>
           </w:p>
         </w:tc>
@@ -7219,16 +7412,17 @@
           </w:tcPr>
           <w:p>
             <w:pPr>
-              <w:spacing w:after="0" w:line="240"/>
-              <w:jc w:val="center"/>
-            </w:pPr>
-            <w:r>
-              <w:rPr>
-                <w:rFonts w:ascii="Times New Roman" w:cs="Times New Roman" w:eastAsia="Times New Roman" w:hAnsi="Times New Roman"/>
-                <w:sz w:val="18"/>
-                <w:szCs w:val="18"/>
-              </w:rPr>
-              <w:t xml:space="preserve">0.547</w:t>
+              <w:keepNext/>
+              <w:spacing w:after="0" w:line="240"/>
+              <w:jc w:val="center"/>
+            </w:pPr>
+            <w:r>
+              <w:rPr>
+                <w:rFonts w:ascii="Times New Roman" w:cs="Times New Roman" w:eastAsia="Times New Roman" w:hAnsi="Times New Roman"/>
+                <w:sz w:val="18"/>
+                <w:szCs w:val="18"/>
+              </w:rPr>
+              <w:t xml:space="preserve">1.000</w:t>
             </w:r>
           </w:p>
         </w:tc>
@@ -7251,6 +7445,7 @@
           </w:tcPr>
           <w:p>
             <w:pPr>
+              <w:keepNext/>
               <w:spacing w:after="0" w:line="240"/>
               <w:jc w:val="center"/>
             </w:pPr>
@@ -7262,7 +7457,7 @@
                 <w:sz w:val="18"/>
                 <w:szCs w:val="18"/>
               </w:rPr>
-              <w:t xml:space="preserve">0.002</w:t>
+              <w:t xml:space="preserve">0.036</w:t>
             </w:r>
           </w:p>
         </w:tc>
@@ -7285,18 +7480,17 @@
           </w:tcPr>
           <w:p>
             <w:pPr>
-              <w:spacing w:after="0" w:line="240"/>
-              <w:jc w:val="center"/>
-            </w:pPr>
-            <w:r>
-              <w:rPr>
-                <w:rFonts w:ascii="Times New Roman" w:cs="Times New Roman" w:eastAsia="Times New Roman" w:hAnsi="Times New Roman"/>
-                <w:b/>
-                <w:bCs/>
-                <w:sz w:val="18"/>
-                <w:szCs w:val="18"/>
-              </w:rPr>
-              <w:t xml:space="preserve">0.031</w:t>
+              <w:keepNext/>
+              <w:spacing w:after="0" w:line="240"/>
+              <w:jc w:val="center"/>
+            </w:pPr>
+            <w:r>
+              <w:rPr>
+                <w:rFonts w:ascii="Times New Roman" w:cs="Times New Roman" w:eastAsia="Times New Roman" w:hAnsi="Times New Roman"/>
+                <w:sz w:val="18"/>
+                <w:szCs w:val="18"/>
+              </w:rPr>
+              <w:t xml:space="preserve">0.525</w:t>
             </w:r>
           </w:p>
         </w:tc>
@@ -7319,6 +7513,7 @@
           </w:tcPr>
           <w:p>
             <w:pPr>
+              <w:keepNext/>
               <w:spacing w:after="0" w:line="240"/>
               <w:jc w:val="center"/>
             </w:pPr>
@@ -7351,6 +7546,7 @@
           </w:tcPr>
           <w:p>
             <w:pPr>
+              <w:keepNext/>
               <w:spacing w:after="0" w:line="240"/>
               <w:jc w:val="center"/>
             </w:pPr>
@@ -7388,6 +7584,7 @@
           </w:tcPr>
           <w:p>
             <w:pPr>
+              <w:keepNext/>
               <w:spacing w:after="0" w:line="240"/>
               <w:jc w:val="left"/>
             </w:pPr>
@@ -7420,16 +7617,17 @@
           </w:tcPr>
           <w:p>
             <w:pPr>
-              <w:spacing w:after="0" w:line="240"/>
-              <w:jc w:val="center"/>
-            </w:pPr>
-            <w:r>
-              <w:rPr>
-                <w:rFonts w:ascii="Times New Roman" w:cs="Times New Roman" w:eastAsia="Times New Roman" w:hAnsi="Times New Roman"/>
-                <w:sz w:val="18"/>
-                <w:szCs w:val="18"/>
-              </w:rPr>
-              <w:t xml:space="preserve">0.169</w:t>
+              <w:keepNext/>
+              <w:spacing w:after="0" w:line="240"/>
+              <w:jc w:val="center"/>
+            </w:pPr>
+            <w:r>
+              <w:rPr>
+                <w:rFonts w:ascii="Times New Roman" w:cs="Times New Roman" w:eastAsia="Times New Roman" w:hAnsi="Times New Roman"/>
+                <w:sz w:val="18"/>
+                <w:szCs w:val="18"/>
+              </w:rPr>
+              <w:t xml:space="preserve">1.000</w:t>
             </w:r>
           </w:p>
         </w:tc>
@@ -7452,16 +7650,17 @@
           </w:tcPr>
           <w:p>
             <w:pPr>
-              <w:spacing w:after="0" w:line="240"/>
-              <w:jc w:val="center"/>
-            </w:pPr>
-            <w:r>
-              <w:rPr>
-                <w:rFonts w:ascii="Times New Roman" w:cs="Times New Roman" w:eastAsia="Times New Roman" w:hAnsi="Times New Roman"/>
-                <w:sz w:val="18"/>
-                <w:szCs w:val="18"/>
-              </w:rPr>
-              <w:t xml:space="preserve">0.239</w:t>
+              <w:keepNext/>
+              <w:spacing w:after="0" w:line="240"/>
+              <w:jc w:val="center"/>
+            </w:pPr>
+            <w:r>
+              <w:rPr>
+                <w:rFonts w:ascii="Times New Roman" w:cs="Times New Roman" w:eastAsia="Times New Roman" w:hAnsi="Times New Roman"/>
+                <w:sz w:val="18"/>
+                <w:szCs w:val="18"/>
+              </w:rPr>
+              <w:t xml:space="preserve">1.000</w:t>
             </w:r>
           </w:p>
         </w:tc>
@@ -7484,16 +7683,17 @@
           </w:tcPr>
           <w:p>
             <w:pPr>
-              <w:spacing w:after="0" w:line="240"/>
-              <w:jc w:val="center"/>
-            </w:pPr>
-            <w:r>
-              <w:rPr>
-                <w:rFonts w:ascii="Times New Roman" w:cs="Times New Roman" w:eastAsia="Times New Roman" w:hAnsi="Times New Roman"/>
-                <w:sz w:val="18"/>
-                <w:szCs w:val="18"/>
-              </w:rPr>
-              <w:t xml:space="preserve">0.161</w:t>
+              <w:keepNext/>
+              <w:spacing w:after="0" w:line="240"/>
+              <w:jc w:val="center"/>
+            </w:pPr>
+            <w:r>
+              <w:rPr>
+                <w:rFonts w:ascii="Times New Roman" w:cs="Times New Roman" w:eastAsia="Times New Roman" w:hAnsi="Times New Roman"/>
+                <w:sz w:val="18"/>
+                <w:szCs w:val="18"/>
+              </w:rPr>
+              <w:t xml:space="preserve">1.000</w:t>
             </w:r>
           </w:p>
         </w:tc>
@@ -7516,16 +7716,17 @@
           </w:tcPr>
           <w:p>
             <w:pPr>
-              <w:spacing w:after="0" w:line="240"/>
-              <w:jc w:val="center"/>
-            </w:pPr>
-            <w:r>
-              <w:rPr>
-                <w:rFonts w:ascii="Times New Roman" w:cs="Times New Roman" w:eastAsia="Times New Roman" w:hAnsi="Times New Roman"/>
-                <w:sz w:val="18"/>
-                <w:szCs w:val="18"/>
-              </w:rPr>
-              <w:t xml:space="preserve">0.075</w:t>
+              <w:keepNext/>
+              <w:spacing w:after="0" w:line="240"/>
+              <w:jc w:val="center"/>
+            </w:pPr>
+            <w:r>
+              <w:rPr>
+                <w:rFonts w:ascii="Times New Roman" w:cs="Times New Roman" w:eastAsia="Times New Roman" w:hAnsi="Times New Roman"/>
+                <w:sz w:val="18"/>
+                <w:szCs w:val="18"/>
+              </w:rPr>
+              <w:t xml:space="preserve">1.000</w:t>
             </w:r>
           </w:p>
         </w:tc>
@@ -7548,16 +7749,17 @@
           </w:tcPr>
           <w:p>
             <w:pPr>
-              <w:spacing w:after="0" w:line="240"/>
-              <w:jc w:val="center"/>
-            </w:pPr>
-            <w:r>
-              <w:rPr>
-                <w:rFonts w:ascii="Times New Roman" w:cs="Times New Roman" w:eastAsia="Times New Roman" w:hAnsi="Times New Roman"/>
-                <w:sz w:val="18"/>
-                <w:szCs w:val="18"/>
-              </w:rPr>
-              <w:t xml:space="preserve">0.682</w:t>
+              <w:keepNext/>
+              <w:spacing w:after="0" w:line="240"/>
+              <w:jc w:val="center"/>
+            </w:pPr>
+            <w:r>
+              <w:rPr>
+                <w:rFonts w:ascii="Times New Roman" w:cs="Times New Roman" w:eastAsia="Times New Roman" w:hAnsi="Times New Roman"/>
+                <w:sz w:val="18"/>
+                <w:szCs w:val="18"/>
+              </w:rPr>
+              <w:t xml:space="preserve">1.000</w:t>
             </w:r>
           </w:p>
         </w:tc>
@@ -7580,16 +7782,17 @@
           </w:tcPr>
           <w:p>
             <w:pPr>
-              <w:spacing w:after="0" w:line="240"/>
-              <w:jc w:val="center"/>
-            </w:pPr>
-            <w:r>
-              <w:rPr>
-                <w:rFonts w:ascii="Times New Roman" w:cs="Times New Roman" w:eastAsia="Times New Roman" w:hAnsi="Times New Roman"/>
-                <w:sz w:val="18"/>
-                <w:szCs w:val="18"/>
-              </w:rPr>
-              <w:t xml:space="preserve">0.075</w:t>
+              <w:keepNext/>
+              <w:spacing w:after="0" w:line="240"/>
+              <w:jc w:val="center"/>
+            </w:pPr>
+            <w:r>
+              <w:rPr>
+                <w:rFonts w:ascii="Times New Roman" w:cs="Times New Roman" w:eastAsia="Times New Roman" w:hAnsi="Times New Roman"/>
+                <w:sz w:val="18"/>
+                <w:szCs w:val="18"/>
+              </w:rPr>
+              <w:t xml:space="preserve">1.000</w:t>
             </w:r>
           </w:p>
         </w:tc>
@@ -7612,6 +7815,7 @@
           </w:tcPr>
           <w:p>
             <w:pPr>
+              <w:keepNext/>
               <w:spacing w:after="0" w:line="240"/>
               <w:jc w:val="center"/>
             </w:pPr>
@@ -7730,6 +7934,7 @@
           </w:tcPr>
           <w:p>
             <w:pPr>
+              <w:keepNext/>
               <w:spacing w:after="0" w:line="240"/>
               <w:jc w:val="left"/>
             </w:pPr>
@@ -7765,6 +7970,7 @@
           </w:tcPr>
           <w:p>
             <w:pPr>
+              <w:keepNext/>
               <w:spacing w:after="0" w:line="240"/>
               <w:jc w:val="center"/>
             </w:pPr>
@@ -7800,6 +8006,7 @@
           </w:tcPr>
           <w:p>
             <w:pPr>
+              <w:keepNext/>
               <w:spacing w:after="0" w:line="240"/>
               <w:jc w:val="center"/>
             </w:pPr>
@@ -7835,6 +8042,7 @@
           </w:tcPr>
           <w:p>
             <w:pPr>
+              <w:keepNext/>
               <w:spacing w:after="0" w:line="240"/>
               <w:jc w:val="center"/>
             </w:pPr>
@@ -7870,6 +8078,7 @@
           </w:tcPr>
           <w:p>
             <w:pPr>
+              <w:keepNext/>
               <w:spacing w:after="0" w:line="240"/>
               <w:jc w:val="center"/>
             </w:pPr>
@@ -7905,6 +8114,7 @@
           </w:tcPr>
           <w:p>
             <w:pPr>
+              <w:keepNext/>
               <w:spacing w:after="0" w:line="240"/>
               <w:jc w:val="center"/>
             </w:pPr>
@@ -7940,6 +8150,7 @@
           </w:tcPr>
           <w:p>
             <w:pPr>
+              <w:keepNext/>
               <w:spacing w:after="0" w:line="240"/>
               <w:jc w:val="center"/>
             </w:pPr>
@@ -7979,6 +8190,7 @@
           </w:tcPr>
           <w:p>
             <w:pPr>
+              <w:keepNext/>
               <w:spacing w:after="0" w:line="240"/>
               <w:jc w:val="left"/>
             </w:pPr>
@@ -8011,6 +8223,7 @@
           </w:tcPr>
           <w:p>
             <w:pPr>
+              <w:keepNext/>
               <w:spacing w:after="0" w:line="240"/>
               <w:jc w:val="center"/>
             </w:pPr>
@@ -8043,6 +8256,7 @@
           </w:tcPr>
           <w:p>
             <w:pPr>
+              <w:keepNext/>
               <w:spacing w:after="0" w:line="240"/>
               <w:jc w:val="center"/>
             </w:pPr>
@@ -8075,6 +8289,7 @@
           </w:tcPr>
           <w:p>
             <w:pPr>
+              <w:keepNext/>
               <w:spacing w:after="0" w:line="240"/>
               <w:jc w:val="center"/>
             </w:pPr>
@@ -8107,6 +8322,7 @@
           </w:tcPr>
           <w:p>
             <w:pPr>
+              <w:keepNext/>
               <w:spacing w:after="0" w:line="240"/>
               <w:jc w:val="center"/>
             </w:pPr>
@@ -8139,6 +8355,7 @@
           </w:tcPr>
           <w:p>
             <w:pPr>
+              <w:keepNext/>
               <w:spacing w:after="0" w:line="240"/>
               <w:jc w:val="center"/>
             </w:pPr>
@@ -8171,6 +8388,7 @@
           </w:tcPr>
           <w:p>
             <w:pPr>
+              <w:keepNext/>
               <w:spacing w:after="0" w:line="240"/>
               <w:jc w:val="center"/>
             </w:pPr>
@@ -8208,6 +8426,7 @@
           </w:tcPr>
           <w:p>
             <w:pPr>
+              <w:keepNext/>
               <w:spacing w:after="0" w:line="240"/>
               <w:jc w:val="left"/>
             </w:pPr>
@@ -8240,6 +8459,7 @@
           </w:tcPr>
           <w:p>
             <w:pPr>
+              <w:keepNext/>
               <w:spacing w:after="0" w:line="240"/>
               <w:jc w:val="center"/>
             </w:pPr>
@@ -8272,6 +8492,7 @@
           </w:tcPr>
           <w:p>
             <w:pPr>
+              <w:keepNext/>
               <w:spacing w:after="0" w:line="240"/>
               <w:jc w:val="center"/>
             </w:pPr>
@@ -8304,6 +8525,7 @@
           </w:tcPr>
           <w:p>
             <w:pPr>
+              <w:keepNext/>
               <w:spacing w:after="0" w:line="240"/>
               <w:jc w:val="center"/>
             </w:pPr>
@@ -8336,6 +8558,7 @@
           </w:tcPr>
           <w:p>
             <w:pPr>
+              <w:keepNext/>
               <w:spacing w:after="0" w:line="240"/>
               <w:jc w:val="center"/>
             </w:pPr>
@@ -8368,6 +8591,7 @@
           </w:tcPr>
           <w:p>
             <w:pPr>
+              <w:keepNext/>
               <w:spacing w:after="0" w:line="240"/>
               <w:jc w:val="center"/>
             </w:pPr>
@@ -8400,6 +8624,7 @@
           </w:tcPr>
           <w:p>
             <w:pPr>
+              <w:keepNext/>
               <w:spacing w:after="0" w:line="240"/>
               <w:jc w:val="center"/>
             </w:pPr>
@@ -8437,6 +8662,7 @@
           </w:tcPr>
           <w:p>
             <w:pPr>
+              <w:keepNext/>
               <w:spacing w:after="0" w:line="240"/>
               <w:jc w:val="left"/>
             </w:pPr>
@@ -8469,6 +8695,7 @@
           </w:tcPr>
           <w:p>
             <w:pPr>
+              <w:keepNext/>
               <w:spacing w:after="0" w:line="240"/>
               <w:jc w:val="center"/>
             </w:pPr>
@@ -8501,6 +8728,7 @@
           </w:tcPr>
           <w:p>
             <w:pPr>
+              <w:keepNext/>
               <w:spacing w:after="0" w:line="240"/>
               <w:jc w:val="center"/>
             </w:pPr>
@@ -8533,6 +8761,7 @@
           </w:tcPr>
           <w:p>
             <w:pPr>
+              <w:keepNext/>
               <w:spacing w:after="0" w:line="240"/>
               <w:jc w:val="center"/>
             </w:pPr>
@@ -8565,6 +8794,7 @@
           </w:tcPr>
           <w:p>
             <w:pPr>
+              <w:keepNext/>
               <w:spacing w:after="0" w:line="240"/>
               <w:jc w:val="center"/>
             </w:pPr>
@@ -8597,6 +8827,7 @@
           </w:tcPr>
           <w:p>
             <w:pPr>
+              <w:keepNext/>
               <w:spacing w:after="0" w:line="240"/>
               <w:jc w:val="center"/>
             </w:pPr>
@@ -8629,6 +8860,7 @@
           </w:tcPr>
           <w:p>
             <w:pPr>
+              <w:keepNext/>
               <w:spacing w:after="0" w:line="240"/>
               <w:jc w:val="center"/>
             </w:pPr>
@@ -8666,6 +8898,7 @@
           </w:tcPr>
           <w:p>
             <w:pPr>
+              <w:keepNext/>
               <w:spacing w:after="0" w:line="240"/>
               <w:jc w:val="left"/>
             </w:pPr>
@@ -8698,6 +8931,7 @@
           </w:tcPr>
           <w:p>
             <w:pPr>
+              <w:keepNext/>
               <w:spacing w:after="0" w:line="240"/>
               <w:jc w:val="center"/>
             </w:pPr>
@@ -8732,6 +8966,7 @@
           </w:tcPr>
           <w:p>
             <w:pPr>
+              <w:keepNext/>
               <w:spacing w:after="0" w:line="240"/>
               <w:jc w:val="center"/>
             </w:pPr>
@@ -8764,6 +8999,7 @@
           </w:tcPr>
           <w:p>
             <w:pPr>
+              <w:keepNext/>
               <w:spacing w:after="0" w:line="240"/>
               <w:jc w:val="center"/>
             </w:pPr>
@@ -8798,6 +9034,7 @@
           </w:tcPr>
           <w:p>
             <w:pPr>
+              <w:keepNext/>
               <w:spacing w:after="0" w:line="240"/>
               <w:jc w:val="center"/>
             </w:pPr>
@@ -8830,6 +9067,7 @@
           </w:tcPr>
           <w:p>
             <w:pPr>
+              <w:keepNext/>
               <w:spacing w:after="0" w:line="240"/>
               <w:jc w:val="center"/>
             </w:pPr>
@@ -8862,6 +9100,7 @@
           </w:tcPr>
           <w:p>
             <w:pPr>
+              <w:keepNext/>
               <w:spacing w:after="0" w:line="240"/>
               <w:jc w:val="center"/>
             </w:pPr>
@@ -8899,6 +9138,7 @@
           </w:tcPr>
           <w:p>
             <w:pPr>
+              <w:keepNext/>
               <w:spacing w:after="0" w:line="240"/>
               <w:jc w:val="left"/>
             </w:pPr>
@@ -8931,6 +9171,7 @@
           </w:tcPr>
           <w:p>
             <w:pPr>
+              <w:keepNext/>
               <w:spacing w:after="0" w:line="240"/>
               <w:jc w:val="center"/>
             </w:pPr>
@@ -8963,6 +9204,7 @@
           </w:tcPr>
           <w:p>
             <w:pPr>
+              <w:keepNext/>
               <w:spacing w:after="0" w:line="240"/>
               <w:jc w:val="center"/>
             </w:pPr>
@@ -8995,6 +9237,7 @@
           </w:tcPr>
           <w:p>
             <w:pPr>
+              <w:keepNext/>
               <w:spacing w:after="0" w:line="240"/>
               <w:jc w:val="center"/>
             </w:pPr>
@@ -9027,6 +9270,7 @@
           </w:tcPr>
           <w:p>
             <w:pPr>
+              <w:keepNext/>
               <w:spacing w:after="0" w:line="240"/>
               <w:jc w:val="center"/>
             </w:pPr>
@@ -9059,6 +9303,7 @@
           </w:tcPr>
           <w:p>
             <w:pPr>
+              <w:keepNext/>
               <w:spacing w:after="0" w:line="240"/>
               <w:jc w:val="center"/>
             </w:pPr>
@@ -9091,6 +9336,7 @@
           </w:tcPr>
           <w:p>
             <w:pPr>
+              <w:keepNext/>
               <w:spacing w:after="0" w:line="240"/>
               <w:jc w:val="center"/>
             </w:pPr>
@@ -9128,6 +9374,7 @@
           </w:tcPr>
           <w:p>
             <w:pPr>
+              <w:keepNext/>
               <w:spacing w:after="0" w:line="240"/>
               <w:jc w:val="left"/>
             </w:pPr>
@@ -9160,6 +9407,7 @@
           </w:tcPr>
           <w:p>
             <w:pPr>
+              <w:keepNext/>
               <w:spacing w:after="0" w:line="240"/>
               <w:jc w:val="center"/>
             </w:pPr>
@@ -9192,6 +9440,7 @@
           </w:tcPr>
           <w:p>
             <w:pPr>
+              <w:keepNext/>
               <w:spacing w:after="0" w:line="240"/>
               <w:jc w:val="center"/>
             </w:pPr>
@@ -9226,6 +9475,7 @@
           </w:tcPr>
           <w:p>
             <w:pPr>
+              <w:keepNext/>
               <w:spacing w:after="0" w:line="240"/>
               <w:jc w:val="center"/>
             </w:pPr>
@@ -9258,6 +9508,7 @@
           </w:tcPr>
           <w:p>
             <w:pPr>
+              <w:keepNext/>
               <w:spacing w:after="0" w:line="240"/>
               <w:jc w:val="center"/>
             </w:pPr>
@@ -9290,6 +9541,7 @@
           </w:tcPr>
           <w:p>
             <w:pPr>
+              <w:keepNext/>
               <w:spacing w:after="0" w:line="240"/>
               <w:jc w:val="center"/>
             </w:pPr>
@@ -9322,6 +9574,7 @@
           </w:tcPr>
           <w:p>
             <w:pPr>
+              <w:keepNext/>
               <w:spacing w:after="0" w:line="240"/>
               <w:jc w:val="center"/>
             </w:pPr>
@@ -9359,6 +9612,7 @@
           </w:tcPr>
           <w:p>
             <w:pPr>
+              <w:keepNext/>
               <w:spacing w:after="0" w:line="240"/>
               <w:jc w:val="left"/>
             </w:pPr>
@@ -9391,6 +9645,7 @@
           </w:tcPr>
           <w:p>
             <w:pPr>
+              <w:keepNext/>
               <w:spacing w:after="0" w:line="240"/>
               <w:jc w:val="center"/>
             </w:pPr>
@@ -9423,6 +9678,7 @@
           </w:tcPr>
           <w:p>
             <w:pPr>
+              <w:keepNext/>
               <w:spacing w:after="0" w:line="240"/>
               <w:jc w:val="center"/>
             </w:pPr>
@@ -9455,6 +9711,7 @@
           </w:tcPr>
           <w:p>
             <w:pPr>
+              <w:keepNext/>
               <w:spacing w:after="0" w:line="240"/>
               <w:jc w:val="center"/>
             </w:pPr>
@@ -9487,6 +9744,7 @@
           </w:tcPr>
           <w:p>
             <w:pPr>
+              <w:keepNext/>
               <w:spacing w:after="0" w:line="240"/>
               <w:jc w:val="center"/>
             </w:pPr>
@@ -9519,6 +9777,7 @@
           </w:tcPr>
           <w:p>
             <w:pPr>
+              <w:keepNext/>
               <w:spacing w:after="0" w:line="240"/>
               <w:jc w:val="center"/>
             </w:pPr>
@@ -9551,6 +9810,7 @@
           </w:tcPr>
           <w:p>
             <w:pPr>
+              <w:keepNext/>
               <w:spacing w:after="0" w:line="240"/>
               <w:jc w:val="center"/>
             </w:pPr>
@@ -9753,6 +10013,7 @@
           </w:tcPr>
           <w:p>
             <w:pPr>
+              <w:keepNext/>
               <w:spacing w:after="0" w:line="240"/>
               <w:jc w:val="left"/>
             </w:pPr>
@@ -9778,6 +10039,7 @@
           </w:tcPr>
           <w:p>
             <w:pPr>
+              <w:keepNext/>
               <w:spacing w:after="0" w:line="240"/>
               <w:jc w:val="center"/>
             </w:pPr>
@@ -9813,6 +10075,7 @@
           </w:tcPr>
           <w:p>
             <w:pPr>
+              <w:keepNext/>
               <w:spacing w:after="0" w:line="240"/>
               <w:jc w:val="center"/>
             </w:pPr>
@@ -9848,6 +10111,7 @@
           </w:tcPr>
           <w:p>
             <w:pPr>
+              <w:keepNext/>
               <w:spacing w:after="0" w:line="240"/>
               <w:jc w:val="center"/>
             </w:pPr>
@@ -9883,6 +10147,7 @@
           </w:tcPr>
           <w:p>
             <w:pPr>
+              <w:keepNext/>
               <w:spacing w:after="0" w:line="240"/>
               <w:jc w:val="center"/>
             </w:pPr>
@@ -9918,6 +10183,7 @@
           </w:tcPr>
           <w:p>
             <w:pPr>
+              <w:keepNext/>
               <w:spacing w:after="0" w:line="240"/>
               <w:jc w:val="center"/>
             </w:pPr>
@@ -9953,6 +10219,7 @@
           </w:tcPr>
           <w:p>
             <w:pPr>
+              <w:keepNext/>
               <w:spacing w:after="0" w:line="240"/>
               <w:jc w:val="center"/>
             </w:pPr>
@@ -9988,6 +10255,7 @@
           </w:tcPr>
           <w:p>
             <w:pPr>
+              <w:keepNext/>
               <w:spacing w:after="0" w:line="240"/>
               <w:jc w:val="center"/>
             </w:pPr>
@@ -10027,6 +10295,7 @@
           </w:tcPr>
           <w:p>
             <w:pPr>
+              <w:keepNext/>
               <w:spacing w:after="0" w:line="240"/>
               <w:jc w:val="left"/>
             </w:pPr>
@@ -10059,6 +10328,7 @@
           </w:tcPr>
           <w:p>
             <w:pPr>
+              <w:keepNext/>
               <w:spacing w:after="0" w:line="240"/>
               <w:jc w:val="center"/>
             </w:pPr>
@@ -10091,6 +10361,7 @@
           </w:tcPr>
           <w:p>
             <w:pPr>
+              <w:keepNext/>
               <w:spacing w:after="0" w:line="240"/>
               <w:jc w:val="center"/>
             </w:pPr>
@@ -10115,6 +10386,7 @@
           </w:tcPr>
           <w:p>
             <w:pPr>
+              <w:keepNext/>
               <w:spacing w:after="0" w:line="240"/>
               <w:jc w:val="center"/>
             </w:pPr>
@@ -10139,6 +10411,7 @@
           </w:tcPr>
           <w:p>
             <w:pPr>
+              <w:keepNext/>
               <w:spacing w:after="0" w:line="240"/>
               <w:jc w:val="center"/>
             </w:pPr>
@@ -10163,6 +10436,7 @@
           </w:tcPr>
           <w:p>
             <w:pPr>
+              <w:keepNext/>
               <w:spacing w:after="0" w:line="240"/>
               <w:jc w:val="center"/>
             </w:pPr>
@@ -10187,6 +10461,7 @@
           </w:tcPr>
           <w:p>
             <w:pPr>
+              <w:keepNext/>
               <w:spacing w:after="0" w:line="240"/>
               <w:jc w:val="center"/>
             </w:pPr>
@@ -10211,6 +10486,7 @@
           </w:tcPr>
           <w:p>
             <w:pPr>
+              <w:keepNext/>
               <w:spacing w:after="0" w:line="240"/>
               <w:jc w:val="center"/>
             </w:pPr>
@@ -10240,6 +10516,7 @@
           </w:tcPr>
           <w:p>
             <w:pPr>
+              <w:keepNext/>
               <w:spacing w:after="0" w:line="240"/>
               <w:jc w:val="left"/>
             </w:pPr>
@@ -10272,6 +10549,7 @@
           </w:tcPr>
           <w:p>
             <w:pPr>
+              <w:keepNext/>
               <w:spacing w:after="0" w:line="240"/>
               <w:jc w:val="center"/>
             </w:pPr>
@@ -10304,6 +10582,7 @@
           </w:tcPr>
           <w:p>
             <w:pPr>
+              <w:keepNext/>
               <w:spacing w:after="0" w:line="240"/>
               <w:jc w:val="center"/>
             </w:pPr>
@@ -10336,6 +10615,7 @@
           </w:tcPr>
           <w:p>
             <w:pPr>
+              <w:keepNext/>
               <w:spacing w:after="0" w:line="240"/>
               <w:jc w:val="center"/>
             </w:pPr>
@@ -10360,6 +10640,7 @@
           </w:tcPr>
           <w:p>
             <w:pPr>
+              <w:keepNext/>
               <w:spacing w:after="0" w:line="240"/>
               <w:jc w:val="center"/>
             </w:pPr>
@@ -10384,6 +10665,7 @@
           </w:tcPr>
           <w:p>
             <w:pPr>
+              <w:keepNext/>
               <w:spacing w:after="0" w:line="240"/>
               <w:jc w:val="center"/>
             </w:pPr>
@@ -10408,6 +10690,7 @@
           </w:tcPr>
           <w:p>
             <w:pPr>
+              <w:keepNext/>
               <w:spacing w:after="0" w:line="240"/>
               <w:jc w:val="center"/>
             </w:pPr>
@@ -10432,6 +10715,7 @@
           </w:tcPr>
           <w:p>
             <w:pPr>
+              <w:keepNext/>
               <w:spacing w:after="0" w:line="240"/>
               <w:jc w:val="center"/>
             </w:pPr>
@@ -10461,6 +10745,7 @@
           </w:tcPr>
           <w:p>
             <w:pPr>
+              <w:keepNext/>
               <w:spacing w:after="0" w:line="240"/>
               <w:jc w:val="left"/>
             </w:pPr>
@@ -10493,6 +10778,7 @@
           </w:tcPr>
           <w:p>
             <w:pPr>
+              <w:keepNext/>
               <w:spacing w:after="0" w:line="240"/>
               <w:jc w:val="center"/>
             </w:pPr>
@@ -10525,6 +10811,7 @@
           </w:tcPr>
           <w:p>
             <w:pPr>
+              <w:keepNext/>
               <w:spacing w:after="0" w:line="240"/>
               <w:jc w:val="center"/>
             </w:pPr>
@@ -10559,6 +10846,7 @@
           </w:tcPr>
           <w:p>
             <w:pPr>
+              <w:keepNext/>
               <w:spacing w:after="0" w:line="240"/>
               <w:jc w:val="center"/>
             </w:pPr>
@@ -10591,6 +10879,7 @@
           </w:tcPr>
           <w:p>
             <w:pPr>
+              <w:keepNext/>
               <w:spacing w:after="0" w:line="240"/>
               <w:jc w:val="center"/>
             </w:pPr>
@@ -10615,6 +10904,7 @@
           </w:tcPr>
           <w:p>
             <w:pPr>
+              <w:keepNext/>
               <w:spacing w:after="0" w:line="240"/>
               <w:jc w:val="center"/>
             </w:pPr>
@@ -10639,6 +10929,7 @@
           </w:tcPr>
           <w:p>
             <w:pPr>
+              <w:keepNext/>
               <w:spacing w:after="0" w:line="240"/>
               <w:jc w:val="center"/>
             </w:pPr>
@@ -10663,6 +10954,7 @@
           </w:tcPr>
           <w:p>
             <w:pPr>
+              <w:keepNext/>
               <w:spacing w:after="0" w:line="240"/>
               <w:jc w:val="center"/>
             </w:pPr>
@@ -10692,6 +10984,7 @@
           </w:tcPr>
           <w:p>
             <w:pPr>
+              <w:keepNext/>
               <w:spacing w:after="0" w:line="240"/>
               <w:jc w:val="left"/>
             </w:pPr>
@@ -10724,6 +11017,7 @@
           </w:tcPr>
           <w:p>
             <w:pPr>
+              <w:keepNext/>
               <w:spacing w:after="0" w:line="240"/>
               <w:jc w:val="center"/>
             </w:pPr>
@@ -10756,6 +11050,7 @@
           </w:tcPr>
           <w:p>
             <w:pPr>
+              <w:keepNext/>
               <w:spacing w:after="0" w:line="240"/>
               <w:jc w:val="center"/>
             </w:pPr>
@@ -10788,6 +11083,7 @@
           </w:tcPr>
           <w:p>
             <w:pPr>
+              <w:keepNext/>
               <w:spacing w:after="0" w:line="240"/>
               <w:jc w:val="center"/>
             </w:pPr>
@@ -10822,6 +11118,7 @@
           </w:tcPr>
           <w:p>
             <w:pPr>
+              <w:keepNext/>
               <w:spacing w:after="0" w:line="240"/>
               <w:jc w:val="center"/>
             </w:pPr>
@@ -10854,6 +11151,7 @@
           </w:tcPr>
           <w:p>
             <w:pPr>
+              <w:keepNext/>
               <w:spacing w:after="0" w:line="240"/>
               <w:jc w:val="center"/>
             </w:pPr>
@@ -10878,6 +11176,7 @@
           </w:tcPr>
           <w:p>
             <w:pPr>
+              <w:keepNext/>
               <w:spacing w:after="0" w:line="240"/>
               <w:jc w:val="center"/>
             </w:pPr>
@@ -10902,6 +11201,7 @@
           </w:tcPr>
           <w:p>
             <w:pPr>
+              <w:keepNext/>
               <w:spacing w:after="0" w:line="240"/>
               <w:jc w:val="center"/>
             </w:pPr>
@@ -10931,6 +11231,7 @@
           </w:tcPr>
           <w:p>
             <w:pPr>
+              <w:keepNext/>
               <w:spacing w:after="0" w:line="240"/>
               <w:jc w:val="left"/>
             </w:pPr>
@@ -10963,6 +11264,7 @@
           </w:tcPr>
           <w:p>
             <w:pPr>
+              <w:keepNext/>
               <w:spacing w:after="0" w:line="240"/>
               <w:jc w:val="center"/>
             </w:pPr>
@@ -10995,6 +11297,7 @@
           </w:tcPr>
           <w:p>
             <w:pPr>
+              <w:keepNext/>
               <w:spacing w:after="0" w:line="240"/>
               <w:jc w:val="center"/>
             </w:pPr>
@@ -11027,6 +11330,7 @@
           </w:tcPr>
           <w:p>
             <w:pPr>
+              <w:keepNext/>
               <w:spacing w:after="0" w:line="240"/>
               <w:jc w:val="center"/>
             </w:pPr>
@@ -11059,6 +11363,7 @@
           </w:tcPr>
           <w:p>
             <w:pPr>
+              <w:keepNext/>
               <w:spacing w:after="0" w:line="240"/>
               <w:jc w:val="center"/>
             </w:pPr>
@@ -11091,6 +11396,7 @@
           </w:tcPr>
           <w:p>
             <w:pPr>
+              <w:keepNext/>
               <w:spacing w:after="0" w:line="240"/>
               <w:jc w:val="center"/>
             </w:pPr>
@@ -11123,6 +11429,7 @@
           </w:tcPr>
           <w:p>
             <w:pPr>
+              <w:keepNext/>
               <w:spacing w:after="0" w:line="240"/>
               <w:jc w:val="center"/>
             </w:pPr>
@@ -11147,6 +11454,7 @@
           </w:tcPr>
           <w:p>
             <w:pPr>
+              <w:keepNext/>
               <w:spacing w:after="0" w:line="240"/>
               <w:jc w:val="center"/>
             </w:pPr>
@@ -11176,6 +11484,7 @@
           </w:tcPr>
           <w:p>
             <w:pPr>
+              <w:keepNext/>
               <w:spacing w:after="0" w:line="240"/>
               <w:jc w:val="left"/>
             </w:pPr>
@@ -11208,6 +11517,7 @@
           </w:tcPr>
           <w:p>
             <w:pPr>
+              <w:keepNext/>
               <w:spacing w:after="0" w:line="240"/>
               <w:jc w:val="center"/>
             </w:pPr>
@@ -11240,6 +11550,7 @@
           </w:tcPr>
           <w:p>
             <w:pPr>
+              <w:keepNext/>
               <w:spacing w:after="0" w:line="240"/>
               <w:jc w:val="center"/>
             </w:pPr>
@@ -11272,6 +11583,7 @@
           </w:tcPr>
           <w:p>
             <w:pPr>
+              <w:keepNext/>
               <w:spacing w:after="0" w:line="240"/>
               <w:jc w:val="center"/>
             </w:pPr>
@@ -11304,6 +11616,7 @@
           </w:tcPr>
           <w:p>
             <w:pPr>
+              <w:keepNext/>
               <w:spacing w:after="0" w:line="240"/>
               <w:jc w:val="center"/>
             </w:pPr>
@@ -11336,6 +11649,7 @@
           </w:tcPr>
           <w:p>
             <w:pPr>
+              <w:keepNext/>
               <w:spacing w:after="0" w:line="240"/>
               <w:jc w:val="center"/>
             </w:pPr>
@@ -11368,6 +11682,7 @@
           </w:tcPr>
           <w:p>
             <w:pPr>
+              <w:keepNext/>
               <w:spacing w:after="0" w:line="240"/>
               <w:jc w:val="center"/>
             </w:pPr>
@@ -11402,6 +11717,7 @@
           </w:tcPr>
           <w:p>
             <w:pPr>
+              <w:keepNext/>
               <w:spacing w:after="0" w:line="240"/>
               <w:jc w:val="center"/>
             </w:pPr>
@@ -11431,6 +11747,7 @@
           </w:tcPr>
           <w:p>
             <w:pPr>
+              <w:keepNext/>
               <w:spacing w:after="0" w:line="240"/>
               <w:jc w:val="left"/>
             </w:pPr>
@@ -11463,6 +11780,7 @@
           </w:tcPr>
           <w:p>
             <w:pPr>
+              <w:keepNext/>
               <w:spacing w:after="0" w:line="240"/>
               <w:jc w:val="center"/>
             </w:pPr>
@@ -11495,6 +11813,7 @@
           </w:tcPr>
           <w:p>
             <w:pPr>
+              <w:keepNext/>
               <w:spacing w:after="0" w:line="240"/>
               <w:jc w:val="center"/>
             </w:pPr>
@@ -11527,6 +11846,7 @@
           </w:tcPr>
           <w:p>
             <w:pPr>
+              <w:keepNext/>
               <w:spacing w:after="0" w:line="240"/>
               <w:jc w:val="center"/>
             </w:pPr>
@@ -11559,6 +11879,7 @@
           </w:tcPr>
           <w:p>
             <w:pPr>
+              <w:keepNext/>
               <w:spacing w:after="0" w:line="240"/>
               <w:jc w:val="center"/>
             </w:pPr>
@@ -11591,6 +11912,7 @@
           </w:tcPr>
           <w:p>
             <w:pPr>
+              <w:keepNext/>
               <w:spacing w:after="0" w:line="240"/>
               <w:jc w:val="center"/>
             </w:pPr>
@@ -11623,6 +11945,7 @@
           </w:tcPr>
           <w:p>
             <w:pPr>
+              <w:keepNext/>
               <w:spacing w:after="0" w:line="240"/>
               <w:jc w:val="center"/>
             </w:pPr>
@@ -11655,6 +11978,7 @@
           </w:tcPr>
           <w:p>
             <w:pPr>
+              <w:keepNext/>
               <w:spacing w:after="0" w:line="240"/>
               <w:jc w:val="center"/>
             </w:pPr>
@@ -11692,6 +12016,7 @@
           </w:tcPr>
           <w:p>
             <w:pPr>
+              <w:keepNext/>
               <w:spacing w:after="0" w:line="240"/>
               <w:jc w:val="left"/>
             </w:pPr>
@@ -11724,6 +12049,7 @@
           </w:tcPr>
           <w:p>
             <w:pPr>
+              <w:keepNext/>
               <w:spacing w:after="0" w:line="240"/>
               <w:jc w:val="center"/>
             </w:pPr>
@@ -11756,6 +12082,7 @@
           </w:tcPr>
           <w:p>
             <w:pPr>
+              <w:keepNext/>
               <w:spacing w:after="0" w:line="240"/>
               <w:jc w:val="center"/>
             </w:pPr>
@@ -11788,6 +12115,7 @@
           </w:tcPr>
           <w:p>
             <w:pPr>
+              <w:keepNext/>
               <w:spacing w:after="0" w:line="240"/>
               <w:jc w:val="center"/>
             </w:pPr>
@@ -11820,6 +12148,7 @@
           </w:tcPr>
           <w:p>
             <w:pPr>
+              <w:keepNext/>
               <w:spacing w:after="0" w:line="240"/>
               <w:jc w:val="center"/>
             </w:pPr>
@@ -11852,6 +12181,7 @@
           </w:tcPr>
           <w:p>
             <w:pPr>
+              <w:keepNext/>
               <w:spacing w:after="0" w:line="240"/>
               <w:jc w:val="center"/>
             </w:pPr>
@@ -11884,6 +12214,7 @@
           </w:tcPr>
           <w:p>
             <w:pPr>
+              <w:keepNext/>
               <w:spacing w:after="0" w:line="240"/>
               <w:jc w:val="center"/>
             </w:pPr>
@@ -11916,6 +12247,7 @@
           </w:tcPr>
           <w:p>
             <w:pPr>
+              <w:keepNext/>
               <w:spacing w:after="0" w:line="240"/>
               <w:jc w:val="center"/>
             </w:pPr>
@@ -12746,6 +13078,47 @@
           <w:rFonts w:ascii="Times New Roman" w:cs="Times New Roman" w:eastAsia="Times New Roman" w:hAnsi="Times New Roman"/>
         </w:rPr>
         <w:t xml:space="preserve"> (Vol. 35, pp. 507–520).</w:t>
+      </w:r>
+    </w:p>
+    <w:p>
+      <w:pPr>
+        <w:spacing w:after="80" w:line="240"/>
+        <w:ind w:left="720" w:hanging="720"/>
+        <w:jc w:val="left"/>
+      </w:pPr>
+      <w:r>
+        <w:rPr>
+          <w:rFonts w:ascii="Times New Roman" w:cs="Times New Roman" w:eastAsia="Times New Roman" w:hAnsi="Times New Roman"/>
+        </w:rPr>
+        <w:t xml:space="preserve">Holm, S. (1979). A simple sequentially rejective multiple test procedure. </w:t>
+      </w:r>
+      <w:r>
+        <w:rPr>
+          <w:rFonts w:ascii="Times New Roman" w:cs="Times New Roman" w:eastAsia="Times New Roman" w:hAnsi="Times New Roman"/>
+          <w:i/>
+          <w:iCs/>
+        </w:rPr>
+        <w:t xml:space="preserve">Scandinavian Journal of Statistics</w:t>
+      </w:r>
+      <w:r>
+        <w:rPr>
+          <w:rFonts w:ascii="Times New Roman" w:cs="Times New Roman" w:eastAsia="Times New Roman" w:hAnsi="Times New Roman"/>
+        </w:rPr>
+        <w:t xml:space="preserve">, </w:t>
+      </w:r>
+      <w:r>
+        <w:rPr>
+          <w:rFonts w:ascii="Times New Roman" w:cs="Times New Roman" w:eastAsia="Times New Roman" w:hAnsi="Times New Roman"/>
+          <w:i/>
+          <w:iCs/>
+        </w:rPr>
+        <w:t xml:space="preserve">6</w:t>
+      </w:r>
+      <w:r>
+        <w:rPr>
+          <w:rFonts w:ascii="Times New Roman" w:cs="Times New Roman" w:eastAsia="Times New Roman" w:hAnsi="Times New Roman"/>
+        </w:rPr>
+        <w:t xml:space="preserve">(2), 65–70.</w:t>
       </w:r>
     </w:p>
     <w:p>

</xml_diff>

<commit_message>
ICINCDS manuscript: numbered in-text citations and numbered APA reference list, matching the official template
Co-Authored-By: Claude Opus 5.5 <noreply@anthropic.com>
</commit_message>
<xml_diff>
--- a/ICINCDS_2026_Manuscript_NHANES_CVD_v2.docx
+++ b/ICINCDS_2026_Manuscript_NHANES_CVD_v2.docx
@@ -123,7 +123,7 @@
         <w:rPr>
           <w:rFonts w:ascii="Times New Roman" w:cs="Times New Roman" w:eastAsia="Times New Roman" w:hAnsi="Times New Roman"/>
         </w:rPr>
-        <w:t xml:space="preserve">Cardiovascular diseases (CVDs) are a major public health concern associated with demographic, physiological, biochemical and behavioral factors (Roth et al., 2020; Tsao et al., 2023). Clinical variables such as age, blood pressure, cholesterol, glucose concentration and body mass index provide valuable information about cardiovascular health and underpin established risk scores (D’Agostino et al., 2008; Goff et al., 2014). However, relationships among these variables can be nonlinear and interdependent, which motivates the application of data-driven predictive methods.</w:t>
+        <w:t xml:space="preserve">Cardiovascular diseases (CVDs) are a major public health concern associated with demographic, physiological, biochemical and behavioral factors [1, 2]. Clinical variables such as age, blood pressure, cholesterol, glucose concentration and body mass index provide valuable information about cardiovascular health and underpin established risk scores [3, 4]. However, relationships among these variables can be nonlinear and interdependent, which motivates the application of data-driven predictive methods.</w:t>
       </w:r>
     </w:p>
     <w:p>
@@ -135,7 +135,7 @@
         <w:rPr>
           <w:rFonts w:ascii="Times New Roman" w:cs="Times New Roman" w:eastAsia="Times New Roman" w:hAnsi="Times New Roman"/>
         </w:rPr>
-        <w:t xml:space="preserve">Classical machine learning algorithms, including Logistic Regression, Support Vector Machines, Random Forests and gradient-boosted decision trees, are widely applicable to structured clinical data. These methods offer different trade-offs between interpretability, computational efficiency and the ability to capture nonlinear relationships. Deep learning models, from multilayer perceptrons to Transformer architectures designed for tabular data (Gorishniy et al., 2021), can learn complex feature interactions but may require careful regularization and sufficient training data. Their greater complexity does not necessarily guarantee superior performance on tabular health datasets (Christodoulou et al., 2019; Grinsztajn et al., 2022; Shwartz-Ziv &amp; Armon, 2022).</w:t>
+        <w:t xml:space="preserve">Classical machine learning algorithms, including Logistic Regression, Support Vector Machines, Random Forests and gradient-boosted decision trees, are widely applicable to structured clinical data. These methods offer different trade-offs between interpretability, computational efficiency and the ability to capture nonlinear relationships. Deep learning models, from multilayer perceptrons to Transformer architectures designed for tabular data [5], can learn complex feature interactions but may require careful regularization and sufficient training data. Their greater complexity does not necessarily guarantee superior performance on tabular health datasets [6, 7, 8].</w:t>
       </w:r>
     </w:p>
     <w:p>
@@ -147,7 +147,7 @@
         <w:rPr>
           <w:rFonts w:ascii="Times New Roman" w:cs="Times New Roman" w:eastAsia="Times New Roman" w:hAnsi="Times New Roman"/>
         </w:rPr>
-        <w:t xml:space="preserve">Model evaluation in clinical applications should extend beyond predictive accuracy. Identifying which features influence predictions, determining whether their contributions remain stable across algorithms, and assessing probability calibration are important for judging model reliability (Van Calster et al., 2019). Explainable artificial intelligence techniques, including SHapley Additive exPlanations (SHAP; Lundberg &amp; Lee, 2017), provide a framework for examining feature contributions. However, model attribution indicates predictive influence rather than causation (Rudin, 2019).</w:t>
+        <w:t xml:space="preserve">Model evaluation in clinical applications should extend beyond predictive accuracy. Identifying which features influence predictions, determining whether their contributions remain stable across algorithms, and assessing probability calibration are important for judging model reliability [9]. Explainable artificial intelligence techniques, including SHapley Additive exPlanations (SHAP) [10], provide a framework for examining feature contributions. However, model attribution indicates predictive influence rather than causation [11].</w:t>
       </w:r>
     </w:p>
     <w:p>
@@ -159,7 +159,7 @@
         <w:rPr>
           <w:rFonts w:ascii="Times New Roman" w:cs="Times New Roman" w:eastAsia="Times New Roman" w:hAnsi="Times New Roman"/>
         </w:rPr>
-        <w:t xml:space="preserve">The National Health and Nutrition Examination Survey (NHANES), conducted by the United States Centers for Disease Control and Prevention, combines health interviews, physical examinations and laboratory measurements (Centers for Disease Control and Prevention, n.d.). Integrating four survey periods provides an opportunity to compare predictive models on population-level clinical data. Such integration requires consistent variable definitions, appropriate handling of missing data, and consideration of survey design and changes in data collection (Johnson et al., 2013).</w:t>
+        <w:t xml:space="preserve">The National Health and Nutrition Examination Survey (NHANES), conducted by the United States Centers for Disease Control and Prevention, combines health interviews, physical examinations and laboratory measurements [12]. Integrating four survey periods provides an opportunity to compare predictive models on population-level clinical data. Such integration requires consistent variable definitions, appropriate handling of missing data, and consideration of survey design and changes in data collection [13].</w:t>
       </w:r>
     </w:p>
     <w:p>
@@ -197,7 +197,7 @@
         <w:rPr>
           <w:rFonts w:ascii="Times New Roman" w:cs="Times New Roman" w:eastAsia="Times New Roman" w:hAnsi="Times New Roman"/>
         </w:rPr>
-        <w:t xml:space="preserve">Machine learning for CVD risk has been studied in large cohorts. Weng et al. (2017) compared logistic regression, random forests, gradient boosting and neural networks with the ACC/AHA risk score in 378,256 UK primary-care patients; the neural network exceeded logistic regression by only 0.004 AUC. Alaa et al. (2019) showed that an automated machine-learning ensemble outperformed the Framingham score in 423,604 UK Biobank participants, largely by using many more variables, and Ambale-Venkatesh et al. (2017) applied random survival forests to the Multi-Ethnic Study of Atherosclerosis. A meta-analysis of 103 cohorts found overlapping performance across algorithm families and substantial heterogeneity between studies (Krittanawong et al., 2020).</w:t>
+        <w:t xml:space="preserve">Machine learning for CVD risk has been studied in large cohorts. Weng et al. [14] compared logistic regression, random forests, gradient boosting and neural networks with the ACC/AHA risk score in 378,256 UK primary-care patients; the neural network exceeded logistic regression by only 0.004 AUC. Alaa et al. [15] showed that an automated machine-learning ensemble outperformed the Framingham score in 423,604 UK Biobank participants, largely by using many more variables, and Ambale-Venkatesh et al. [16] applied random survival forests to the Multi-Ethnic Study of Atherosclerosis. A meta-analysis of 103 cohorts found overlapping performance across algorithm families and substantial heterogeneity between studies [17].</w:t>
       </w:r>
     </w:p>
     <w:p>
@@ -209,7 +209,7 @@
         <w:rPr>
           <w:rFonts w:ascii="Times New Roman" w:cs="Times New Roman" w:eastAsia="Times New Roman" w:hAnsi="Times New Roman"/>
         </w:rPr>
-        <w:t xml:space="preserve">Several studies have used NHANES. Dinh et al. (2019) reported an ensemble AUC of 0.831 for CVD using 131 variables. Martin-Morales et al. (2023) predicted CVD mortality and identified age and systolic blood pressure as key SHAP features, and Ahiduzzaman and Hasan (2025) compared five classical models with SHAP and LIME on NHANES 2017–2023. None of these studies evaluated deep learning models, and none measured whether attributions agree across models or remain stable across refits.</w:t>
+        <w:t xml:space="preserve">Several studies have used NHANES. Dinh et al. [18] reported an ensemble AUC of 0.831 for CVD using 131 variables. Martin-Morales et al. [19] predicted CVD mortality and identified age and systolic blood pressure as key SHAP features, and Ahiduzzaman and Hasan [20] compared five classical models with SHAP and LIME on NHANES 2017–2023. None of these studies evaluated deep learning models, and none measured whether attributions agree across models or remain stable across refits.</w:t>
       </w:r>
     </w:p>
     <w:p>
@@ -221,7 +221,7 @@
         <w:rPr>
           <w:rFonts w:ascii="Times New Roman" w:cs="Times New Roman" w:eastAsia="Times New Roman" w:hAnsi="Times New Roman"/>
         </w:rPr>
-        <w:t xml:space="preserve">Broader evidence suggests that machine learning rarely outperforms logistic regression in clinical prediction (Christodoulou et al., 2019) and that tree ensembles often match or exceed deep learning on medium-sized tabular data (Grinsztajn et al., 2022; Shwartz-Ziv &amp; Armon, 2022). Explanation methods can also disagree with one another (Krishna et al., 2024). The present study addresses these gaps by comparing classical and deep models on identical data splits, with calibration, temporal validation, and cross-model and within-model SHAP stability analyses.</w:t>
+        <w:t xml:space="preserve">Broader evidence suggests that machine learning rarely outperforms logistic regression in clinical prediction [6] and that tree ensembles often match or exceed deep learning on medium-sized tabular data [7, 8]. Explanation methods can also disagree with one another [21]. The present study addresses these gaps by comparing classical and deep models on identical data splits, with calibration, temporal validation, and cross-model and within-model SHAP stability analyses.</w:t>
       </w:r>
     </w:p>
     <w:p>
@@ -263,7 +263,7 @@
         <w:rPr>
           <w:rFonts w:ascii="Times New Roman" w:cs="Times New Roman" w:eastAsia="Times New Roman" w:hAnsi="Times New Roman"/>
         </w:rPr>
-        <w:t xml:space="preserve">Four NHANES cycles (2011–2012, 2013–2014, 2015–2016 and 2017–2018) were combined (Centers for Disease Control and Prevention, n.d.); the 2019–2020 cycle was excluded because data collection was interrupted by COVID-19. The analytic cohort comprised adults aged 20 years or older who completed the physical examination and had a determinable outcome (n = 21,552; 2,369 cases). Prevalence was 11.0% unweighted and 8.9% survey-weighted, using the examination weight divided by four as recommended for combined cycles (Johnson et al., 2013).</w:t>
+        <w:t xml:space="preserve">Four NHANES cycles (2011–2012, 2013–2014, 2015–2016 and 2017–2018) were combined [12]; the 2019–2020 cycle was excluded because data collection was interrupted by COVID-19. The analytic cohort comprised adults aged 20 years or older who completed the physical examination and had a determinable outcome (n = 21,552; 2,369 cases). Prevalence was 11.0% unweighted and 8.9% survey-weighted, using the examination weight divided by four as recommended for combined cycles [13].</w:t>
       </w:r>
     </w:p>
     <w:p>
@@ -347,7 +347,7 @@
         <w:rPr>
           <w:rFonts w:ascii="Times New Roman" w:cs="Times New Roman" w:eastAsia="Times New Roman" w:hAnsi="Times New Roman"/>
         </w:rPr>
-        <w:t xml:space="preserve">Data were split 80/20 with stratification (training n = 17,241; test n = 4,311). Hyperparameters were tuned by five-fold stratified cross-validation on the training set to maximize ROC-AUC. The classical models were L2-regularized Logistic Regression (LR), Random Forest (RF; Breiman, 2001), a radial-basis-function Support Vector Machine (SVM; Cortes &amp; Vapnik, 1995) with Platt-scaled probabilities, and XGBoost (XGB; Chen &amp; Guestrin, 2016) tuned by random search. The deep models were a multilayer perceptron (MLP) built from Linear–BatchNorm–ReLU–Dropout blocks, a tabular ResNet and an FT-Transformer (Gorishniy et al., 2021), which converts each feature into a token and applies multi-head self-attention. All three deep models were trained with the AdamW optimizer, binary cross-entropy loss and early stopping on a 15% validation split; the selected networks had 3,649, 68,353 and 69,589 parameters, respectively. For ResNet and FT-Transformer the best configurations lay on a plateau, with the top configurations within 0.003 cross-validated AUC of each other, below the cross-validation standard deviation. Models were implemented in scikit-learn, XGBoost and PyTorch. Each model’s decision threshold maximized the F1-score on out-of-fold training predictions.</w:t>
+        <w:t xml:space="preserve">Data were split 80/20 with stratification (training n = 17,241; test n = 4,311). Hyperparameters were tuned by five-fold stratified cross-validation on the training set to maximize ROC-AUC. The classical models were L2-regularized Logistic Regression (LR), Random Forest (RF) [22], a radial-basis-function Support Vector Machine (SVM) [23] with Platt-scaled probabilities, and XGBoost (XGB) [24] tuned by random search. The deep models were a multilayer perceptron (MLP) built from Linear–BatchNorm–ReLU–Dropout blocks, a tabular ResNet and an FT-Transformer [5], which converts each feature into a token and applies multi-head self-attention. All three deep models were trained with the AdamW optimizer, binary cross-entropy loss and early stopping on a 15% validation split; the selected networks had 3,649, 68,353 and 69,589 parameters, respectively. For ResNet and FT-Transformer the best configurations lay on a plateau, with the top configurations within 0.003 cross-validated AUC of each other, below the cross-validation standard deviation. Models were implemented in scikit-learn, XGBoost and PyTorch. Each model’s decision threshold maximized the F1-score on out-of-fold training predictions.</w:t>
       </w:r>
     </w:p>
     <w:p>
@@ -375,7 +375,7 @@
         <w:rPr>
           <w:rFonts w:ascii="Times New Roman" w:cs="Times New Roman" w:eastAsia="Times New Roman" w:hAnsi="Times New Roman"/>
         </w:rPr>
-        <w:t xml:space="preserve">Test-set performance was assessed with ROC-AUC (with 1,000-sample bootstrap confidence intervals), PR-AUC (Saito &amp; Rehmsmeier, 2015), precision, recall, specificity, F1-score, Brier score, expected calibration error (ECE) and calibration slope (Van Calster et al., 2019). Paired AUC differences were tested with DeLong’s method (DeLong et al., 1988), and p-values for the 21 pairwise comparisons were adjusted with Holm’s step-down procedure (Holm, 1979). Robustness was assessed over five random splits, by temporal validation (training on 2011–2016 and testing on 2017–2018), and with survey-weighted AUC.</w:t>
+        <w:t xml:space="preserve">Test-set performance was assessed with ROC-AUC (with 1,000-sample bootstrap confidence intervals), PR-AUC [25], precision, recall, specificity, F1-score, Brier score, expected calibration error (ECE) and calibration slope [9]. Paired AUC differences were tested with DeLong’s method [26], and p-values for the 21 pairwise comparisons were adjusted with Holm’s step-down procedure [27]. Robustness was assessed over five random splits, by temporal validation (training on 2011–2016 and testing on 2017–2018), and with survey-weighted AUC.</w:t>
       </w:r>
     </w:p>
     <w:p>
@@ -403,7 +403,7 @@
         <w:rPr>
           <w:rFonts w:ascii="Times New Roman" w:cs="Times New Roman" w:eastAsia="Times New Roman" w:hAnsi="Times New Roman"/>
         </w:rPr>
-        <w:t xml:space="preserve">The same model-agnostic permutation SHAP estimator (Lundberg &amp; Lee, 2017) was applied to every model’s predicted probability (300 test rows, 50 background rows); its rankings agreed with exact TreeSHAP (Lundberg et al., 2020) for XGBoost (Spearman ρ = 0.989). Agreement between models was measured with pairwise Spearman correlation of mean absolute SHAP values and with Kendall’s W; stability within each model was measured across five bootstrap refits. Feature-group ablation removed one of eight feature groups at a time, retrained each model and averaged the change in AUC over five splits. All final models and reported timings used a CPU; FT-Transformer refits for the ablation and stability analyses used a GPU.</w:t>
+        <w:t xml:space="preserve">The same model-agnostic permutation SHAP estimator [10] was applied to every model’s predicted probability (300 test rows, 50 background rows); its rankings agreed with exact TreeSHAP [28] for XGBoost (Spearman ρ = 0.989). Agreement between models was measured with pairwise Spearman correlation of mean absolute SHAP values and with Kendall’s W; stability within each model was measured across five bootstrap refits. Feature-group ablation removed one of eight feature groups at a time, retrained each model and averaged the change in AUC over five splits. All final models and reported timings used a CPU; FT-Transformer refits for the ablation and stability analyses used a GPU.</w:t>
       </w:r>
     </w:p>
     <w:p>
@@ -12390,7 +12390,7 @@
         <w:rPr>
           <w:rFonts w:ascii="Times New Roman" w:cs="Times New Roman" w:eastAsia="Times New Roman" w:hAnsi="Times New Roman"/>
         </w:rPr>
-        <w:t xml:space="preserve">Neither the MLP nor the architectures designed for tabular data (ResNet and FT-Transformer) offered a measurable advantage over classical models. This agrees with benchmarks on medium-sized tabular data (Grinsztajn et al., 2022; Shwartz-Ziv &amp; Armon, 2022) and with clinical prediction studies (Christodoulou et al., 2019; Weng et al., 2017). Logistic Regression came within 0.009 AUC of the best model at a negligible computational cost, supporting the use of inherently interpretable models where their accuracy is comparable (Rudin, 2019).</w:t>
+        <w:t xml:space="preserve">Neither the MLP nor the architectures designed for tabular data (ResNet and FT-Transformer) offered a measurable advantage over classical models. This agrees with benchmarks on medium-sized tabular data [7, 8] and with clinical prediction studies [6, 14]. Logistic Regression came within 0.009 AUC of the best model at a negligible computational cost, supporting the use of inherently interpretable models where their accuracy is comparable [11].</w:t>
       </w:r>
     </w:p>
     <w:p>
@@ -12402,7 +12402,7 @@
         <w:rPr>
           <w:rFonts w:ascii="Times New Roman" w:cs="Times New Roman" w:eastAsia="Times New Roman" w:hAnsi="Times New Roman"/>
         </w:rPr>
-        <w:t xml:space="preserve">Similar accuracy did not imply similar explanations. Tree ensembles and smooth-boundary models distributed credit differently among correlated features, so attributions from a single model give an incomplete picture of which clinical factors matter (Krishna et al., 2024). Reporting SHAP results from several model families, together with their stability, offers a more reliable basis for interpretation.</w:t>
+        <w:t xml:space="preserve">Similar accuracy did not imply similar explanations. Tree ensembles and smooth-boundary models distributed credit differently among correlated features, so attributions from a single model give an incomplete picture of which clinical factors matter [21]. Reporting SHAP results from several model families, together with their stability, offers a more reliable basis for interpretation.</w:t>
       </w:r>
     </w:p>
     <w:p>
@@ -12414,7 +12414,7 @@
         <w:rPr>
           <w:rFonts w:ascii="Times New Roman" w:cs="Times New Roman" w:eastAsia="Times New Roman" w:hAnsi="Times New Roman"/>
         </w:rPr>
-        <w:t xml:space="preserve">Higher total cholesterol lowered predicted CVD probability in every model, and blood pressure added almost no discriminative information. Both effects reflect treatment after diagnosis: survey-weighted statin use was 58.0% among participants with CVD versus 14.2% among those without, and antihypertensive use was 62.8% versus 20.1%. In contrast, NHANES studies of future CVD mortality find systolic blood pressure predictive (Martin-Morales et al., 2023). Because the outcome in this study is prevalent, self-reported CVD measured cross-sectionally, the models partly learn markers of diagnosis and treatment, and the attributions describe association only.</w:t>
+        <w:t xml:space="preserve">Higher total cholesterol lowered predicted CVD probability in every model, and blood pressure added almost no discriminative information. Both effects reflect treatment after diagnosis: survey-weighted statin use was 58.0% among participants with CVD versus 14.2% among those without, and antihypertensive use was 62.8% versus 20.1%. In contrast, NHANES studies of future CVD mortality find systolic blood pressure predictive [19]. Because the outcome in this study is prevalent, self-reported CVD measured cross-sectionally, the models partly learn markers of diagnosis and treatment, and the attributions describe association only.</w:t>
       </w:r>
     </w:p>
     <w:p>
@@ -12426,7 +12426,7 @@
         <w:rPr>
           <w:rFonts w:ascii="Times New Roman" w:cs="Times New Roman" w:eastAsia="Times New Roman" w:hAnsi="Times New Roman"/>
         </w:rPr>
-        <w:t xml:space="preserve">This study has limitations. The outcome is self-reported and therefore subject to recall bias, age is top-coded at 80 years in NHANES, and survey weights were used for descriptive analysis and a weighted-AUC check rather than for model training. Reporting followed the TRIPOD+AI guidance (Collins et al., 2024).</w:t>
+        <w:t xml:space="preserve">This study has limitations. The outcome is self-reported and therefore subject to recall bias, age is top-coded at 80 years in NHANES, and survey weights were used for descriptive analysis and a weighted-AUC check rather than for model training. Reporting followed the TRIPOD+AI guidance [29].</w:t>
       </w:r>
     </w:p>
     <w:p>
@@ -12478,7 +12478,7 @@
         <w:rPr>
           <w:rFonts w:ascii="Times New Roman" w:cs="Times New Roman" w:eastAsia="Times New Roman" w:hAnsi="Times New Roman"/>
         </w:rPr>
-        <w:t xml:space="preserve">NHANES data are publicly available from the U.S. Centers for Disease Control and Prevention (Centers for Disease Control and Prevention, n.d.). Analysis code, random seeds, trained models and result files are available at https://github.com/Nilay-11/AIRP.</w:t>
+        <w:t xml:space="preserve">NHANES data are publicly available from the U.S. Centers for Disease Control and Prevention [12]. Analysis code, random seeds, trained models and result files are available at https://github.com/Nilay-11/AIRP.</w:t>
       </w:r>
     </w:p>
     <w:p>
@@ -12525,13 +12525,13 @@
       <w:pPr>
         <w:spacing w:after="80" w:line="240"/>
         <w:ind w:left="720" w:hanging="720"/>
-        <w:jc w:val="left"/>
+        <w:jc w:val="both"/>
       </w:pPr>
       <w:r>
         <w:rPr>
           <w:rFonts w:ascii="Times New Roman" w:cs="Times New Roman" w:eastAsia="Times New Roman" w:hAnsi="Times New Roman"/>
         </w:rPr>
-        <w:t xml:space="preserve">Ahiduzzaman, M., &amp; Hasan, M. N. (2025). Interpretable machine learning for cardiovascular risk prediction: Insights from NHANES dietary and health data. </w:t>
+        <w:t xml:space="preserve">1.	Roth, G. A., Mensah, G. A., Johnson, C. O., Addolorato, G., Ammirati, E., Baddour, L. M., ... &amp; Fuster, V. (2020). Global burden of cardiovascular diseases and risk factors, 1990–2019: Update from the GBD 2019 study. </w:t>
       </w:r>
       <w:r>
         <w:rPr>
@@ -12539,7 +12539,7 @@
           <w:i/>
           <w:iCs/>
         </w:rPr>
-        <w:t xml:space="preserve">PLOS ONE</w:t>
+        <w:t xml:space="preserve">Journal of the American College of Cardiology</w:t>
       </w:r>
       <w:r>
         <w:rPr>
@@ -12553,26 +12553,26 @@
           <w:i/>
           <w:iCs/>
         </w:rPr>
-        <w:t xml:space="preserve">20</w:t>
-      </w:r>
-      <w:r>
-        <w:rPr>
-          <w:rFonts w:ascii="Times New Roman" w:cs="Times New Roman" w:eastAsia="Times New Roman" w:hAnsi="Times New Roman"/>
-        </w:rPr>
-        <w:t xml:space="preserve">(11), e0335915. https://doi.org/10.1371/journal.pone.0335915</w:t>
+        <w:t xml:space="preserve">76</w:t>
+      </w:r>
+      <w:r>
+        <w:rPr>
+          <w:rFonts w:ascii="Times New Roman" w:cs="Times New Roman" w:eastAsia="Times New Roman" w:hAnsi="Times New Roman"/>
+        </w:rPr>
+        <w:t xml:space="preserve">(25), 2982–3021. https://doi.org/10.1016/j.jacc.2020.11.010</w:t>
       </w:r>
     </w:p>
     <w:p>
       <w:pPr>
         <w:spacing w:after="80" w:line="240"/>
         <w:ind w:left="720" w:hanging="720"/>
-        <w:jc w:val="left"/>
+        <w:jc w:val="both"/>
       </w:pPr>
       <w:r>
         <w:rPr>
           <w:rFonts w:ascii="Times New Roman" w:cs="Times New Roman" w:eastAsia="Times New Roman" w:hAnsi="Times New Roman"/>
         </w:rPr>
-        <w:t xml:space="preserve">Alaa, A. M., Bolton, T., Di Angelantonio, E., Rudd, J. H. F., &amp; van der Schaar, M. (2019). Cardiovascular disease risk prediction using automated machine learning: A prospective study of 423,604 UK Biobank participants. </w:t>
+        <w:t xml:space="preserve">2.	Tsao, C. W., Aday, A. W., Almarzooq, Z. I., Anderson, C. A. M., Arora, P., Avery, C. L., ... &amp; Martin, S. S. (2023). Heart disease and stroke statistics—2023 update: A report from the American Heart Association. </w:t>
       </w:r>
       <w:r>
         <w:rPr>
@@ -12580,7 +12580,7 @@
           <w:i/>
           <w:iCs/>
         </w:rPr>
-        <w:t xml:space="preserve">PLOS ONE</w:t>
+        <w:t xml:space="preserve">Circulation</w:t>
       </w:r>
       <w:r>
         <w:rPr>
@@ -12594,26 +12594,26 @@
           <w:i/>
           <w:iCs/>
         </w:rPr>
-        <w:t xml:space="preserve">14</w:t>
-      </w:r>
-      <w:r>
-        <w:rPr>
-          <w:rFonts w:ascii="Times New Roman" w:cs="Times New Roman" w:eastAsia="Times New Roman" w:hAnsi="Times New Roman"/>
-        </w:rPr>
-        <w:t xml:space="preserve">(5), e0213653. https://doi.org/10.1371/journal.pone.0213653</w:t>
+        <w:t xml:space="preserve">147</w:t>
+      </w:r>
+      <w:r>
+        <w:rPr>
+          <w:rFonts w:ascii="Times New Roman" w:cs="Times New Roman" w:eastAsia="Times New Roman" w:hAnsi="Times New Roman"/>
+        </w:rPr>
+        <w:t xml:space="preserve">(8), e93–e621. https://doi.org/10.1161/CIR.0000000000001123</w:t>
       </w:r>
     </w:p>
     <w:p>
       <w:pPr>
         <w:spacing w:after="80" w:line="240"/>
         <w:ind w:left="720" w:hanging="720"/>
-        <w:jc w:val="left"/>
+        <w:jc w:val="both"/>
       </w:pPr>
       <w:r>
         <w:rPr>
           <w:rFonts w:ascii="Times New Roman" w:cs="Times New Roman" w:eastAsia="Times New Roman" w:hAnsi="Times New Roman"/>
         </w:rPr>
-        <w:t xml:space="preserve">Ambale-Venkatesh, B., Yang, X., Wu, C. O., Liu, K., Hundley, W. G., McClelland, R., ... &amp; Lima, J. A. C. (2017). Cardiovascular event prediction by machine learning: The Multi-Ethnic Study of Atherosclerosis. </w:t>
+        <w:t xml:space="preserve">3.	D'Agostino, R. B., Sr., Vasan, R. S., Pencina, M. J., Wolf, P. A., Cobain, M., Massaro, J. M., &amp; Kannel, W. B. (2008). General cardiovascular risk profile for use in primary care: The Framingham Heart Study. </w:t>
       </w:r>
       <w:r>
         <w:rPr>
@@ -12621,7 +12621,7 @@
           <w:i/>
           <w:iCs/>
         </w:rPr>
-        <w:t xml:space="preserve">Circulation Research</w:t>
+        <w:t xml:space="preserve">Circulation</w:t>
       </w:r>
       <w:r>
         <w:rPr>
@@ -12635,26 +12635,26 @@
           <w:i/>
           <w:iCs/>
         </w:rPr>
-        <w:t xml:space="preserve">121</w:t>
-      </w:r>
-      <w:r>
-        <w:rPr>
-          <w:rFonts w:ascii="Times New Roman" w:cs="Times New Roman" w:eastAsia="Times New Roman" w:hAnsi="Times New Roman"/>
-        </w:rPr>
-        <w:t xml:space="preserve">(9), 1092–1101. https://doi.org/10.1161/CIRCRESAHA.117.311312</w:t>
+        <w:t xml:space="preserve">117</w:t>
+      </w:r>
+      <w:r>
+        <w:rPr>
+          <w:rFonts w:ascii="Times New Roman" w:cs="Times New Roman" w:eastAsia="Times New Roman" w:hAnsi="Times New Roman"/>
+        </w:rPr>
+        <w:t xml:space="preserve">(6), 743–753. https://doi.org/10.1161/CIRCULATIONAHA.107.699579</w:t>
       </w:r>
     </w:p>
     <w:p>
       <w:pPr>
         <w:spacing w:after="80" w:line="240"/>
         <w:ind w:left="720" w:hanging="720"/>
-        <w:jc w:val="left"/>
+        <w:jc w:val="both"/>
       </w:pPr>
       <w:r>
         <w:rPr>
           <w:rFonts w:ascii="Times New Roman" w:cs="Times New Roman" w:eastAsia="Times New Roman" w:hAnsi="Times New Roman"/>
         </w:rPr>
-        <w:t xml:space="preserve">Breiman, L. (2001). Random forests. </w:t>
+        <w:t xml:space="preserve">4.	Goff, D. C., Lloyd-Jones, D. M., Bennett, G., Coady, S., D'Agostino, R. B., Gibbons, R., ... &amp; Wilson, P. W. F. (2014). 2013 ACC/AHA guideline on the assessment of cardiovascular risk: A report of the American College of Cardiology/American Heart Association Task Force on Practice Guidelines. </w:t>
       </w:r>
       <w:r>
         <w:rPr>
@@ -12662,7 +12662,7 @@
           <w:i/>
           <w:iCs/>
         </w:rPr>
-        <w:t xml:space="preserve">Machine Learning</w:t>
+        <w:t xml:space="preserve">Circulation</w:t>
       </w:r>
       <w:r>
         <w:rPr>
@@ -12676,26 +12676,26 @@
           <w:i/>
           <w:iCs/>
         </w:rPr>
-        <w:t xml:space="preserve">45</w:t>
-      </w:r>
-      <w:r>
-        <w:rPr>
-          <w:rFonts w:ascii="Times New Roman" w:cs="Times New Roman" w:eastAsia="Times New Roman" w:hAnsi="Times New Roman"/>
-        </w:rPr>
-        <w:t xml:space="preserve">(1), 5–32. https://doi.org/10.1023/A:1010933404324</w:t>
+        <w:t xml:space="preserve">129</w:t>
+      </w:r>
+      <w:r>
+        <w:rPr>
+          <w:rFonts w:ascii="Times New Roman" w:cs="Times New Roman" w:eastAsia="Times New Roman" w:hAnsi="Times New Roman"/>
+        </w:rPr>
+        <w:t xml:space="preserve">(25 Suppl. 2), S49–S73. https://doi.org/10.1161/01.cir.0000437741.48606.98</w:t>
       </w:r>
     </w:p>
     <w:p>
       <w:pPr>
         <w:spacing w:after="80" w:line="240"/>
         <w:ind w:left="720" w:hanging="720"/>
-        <w:jc w:val="left"/>
+        <w:jc w:val="both"/>
       </w:pPr>
       <w:r>
         <w:rPr>
           <w:rFonts w:ascii="Times New Roman" w:cs="Times New Roman" w:eastAsia="Times New Roman" w:hAnsi="Times New Roman"/>
         </w:rPr>
-        <w:t xml:space="preserve">Centers for Disease Control and Prevention, National Center for Health Statistics. (n.d.). </w:t>
+        <w:t xml:space="preserve">5.	Gorishniy, Y., Rubachev, I., Khrulkov, V., &amp; Babenko, A. (2021). Revisiting deep learning models for tabular data. In </w:t>
       </w:r>
       <w:r>
         <w:rPr>
@@ -12703,26 +12703,26 @@
           <w:i/>
           <w:iCs/>
         </w:rPr>
-        <w:t xml:space="preserve">National Health and Nutrition Examination Survey data, 2011–2018</w:t>
-      </w:r>
-      <w:r>
-        <w:rPr>
-          <w:rFonts w:ascii="Times New Roman" w:cs="Times New Roman" w:eastAsia="Times New Roman" w:hAnsi="Times New Roman"/>
-        </w:rPr>
-        <w:t xml:space="preserve">. U.S. Department of Health and Human Services. https://wwwn.cdc.gov/nchs/nhanes/</w:t>
+        <w:t xml:space="preserve">Advances in Neural Information Processing Systems</w:t>
+      </w:r>
+      <w:r>
+        <w:rPr>
+          <w:rFonts w:ascii="Times New Roman" w:cs="Times New Roman" w:eastAsia="Times New Roman" w:hAnsi="Times New Roman"/>
+        </w:rPr>
+        <w:t xml:space="preserve"> (Vol. 34, pp. 18932–18943).</w:t>
       </w:r>
     </w:p>
     <w:p>
       <w:pPr>
         <w:spacing w:after="80" w:line="240"/>
         <w:ind w:left="720" w:hanging="720"/>
-        <w:jc w:val="left"/>
+        <w:jc w:val="both"/>
       </w:pPr>
       <w:r>
         <w:rPr>
           <w:rFonts w:ascii="Times New Roman" w:cs="Times New Roman" w:eastAsia="Times New Roman" w:hAnsi="Times New Roman"/>
         </w:rPr>
-        <w:t xml:space="preserve">Chen, T., &amp; Guestrin, C. (2016). XGBoost: A scalable tree boosting system. In </w:t>
+        <w:t xml:space="preserve">6.	Christodoulou, E., Ma, J., Collins, G. S., Steyerberg, E. W., Verbakel, J. Y., &amp; Van Calster, B. (2019). A systematic review shows no performance benefit of machine learning over logistic regression for clinical prediction models. </w:t>
       </w:r>
       <w:r>
         <w:rPr>
@@ -12730,26 +12730,40 @@
           <w:i/>
           <w:iCs/>
         </w:rPr>
-        <w:t xml:space="preserve">Proceedings of the 22nd ACM SIGKDD International Conference on Knowledge Discovery and Data Mining</w:t>
-      </w:r>
-      <w:r>
-        <w:rPr>
-          <w:rFonts w:ascii="Times New Roman" w:cs="Times New Roman" w:eastAsia="Times New Roman" w:hAnsi="Times New Roman"/>
-        </w:rPr>
-        <w:t xml:space="preserve"> (pp. 785–794). https://doi.org/10.1145/2939672.2939785</w:t>
+        <w:t xml:space="preserve">Journal of Clinical Epidemiology</w:t>
+      </w:r>
+      <w:r>
+        <w:rPr>
+          <w:rFonts w:ascii="Times New Roman" w:cs="Times New Roman" w:eastAsia="Times New Roman" w:hAnsi="Times New Roman"/>
+        </w:rPr>
+        <w:t xml:space="preserve">, </w:t>
+      </w:r>
+      <w:r>
+        <w:rPr>
+          <w:rFonts w:ascii="Times New Roman" w:cs="Times New Roman" w:eastAsia="Times New Roman" w:hAnsi="Times New Roman"/>
+          <w:i/>
+          <w:iCs/>
+        </w:rPr>
+        <w:t xml:space="preserve">110</w:t>
+      </w:r>
+      <w:r>
+        <w:rPr>
+          <w:rFonts w:ascii="Times New Roman" w:cs="Times New Roman" w:eastAsia="Times New Roman" w:hAnsi="Times New Roman"/>
+        </w:rPr>
+        <w:t xml:space="preserve">, 12–22. https://doi.org/10.1016/j.jclinepi.2019.02.004</w:t>
       </w:r>
     </w:p>
     <w:p>
       <w:pPr>
         <w:spacing w:after="80" w:line="240"/>
         <w:ind w:left="720" w:hanging="720"/>
-        <w:jc w:val="left"/>
+        <w:jc w:val="both"/>
       </w:pPr>
       <w:r>
         <w:rPr>
           <w:rFonts w:ascii="Times New Roman" w:cs="Times New Roman" w:eastAsia="Times New Roman" w:hAnsi="Times New Roman"/>
         </w:rPr>
-        <w:t xml:space="preserve">Christodoulou, E., Ma, J., Collins, G. S., Steyerberg, E. W., Verbakel, J. Y., &amp; Van Calster, B. (2019). A systematic review shows no performance benefit of machine learning over logistic regression for clinical prediction models. </w:t>
+        <w:t xml:space="preserve">7.	Grinsztajn, L., Oyallon, E., &amp; Varoquaux, G. (2022). Why do tree-based models still outperform deep learning on typical tabular data? In </w:t>
       </w:r>
       <w:r>
         <w:rPr>
@@ -12757,40 +12771,26 @@
           <w:i/>
           <w:iCs/>
         </w:rPr>
-        <w:t xml:space="preserve">Journal of Clinical Epidemiology</w:t>
-      </w:r>
-      <w:r>
-        <w:rPr>
-          <w:rFonts w:ascii="Times New Roman" w:cs="Times New Roman" w:eastAsia="Times New Roman" w:hAnsi="Times New Roman"/>
-        </w:rPr>
-        <w:t xml:space="preserve">, </w:t>
-      </w:r>
-      <w:r>
-        <w:rPr>
-          <w:rFonts w:ascii="Times New Roman" w:cs="Times New Roman" w:eastAsia="Times New Roman" w:hAnsi="Times New Roman"/>
-          <w:i/>
-          <w:iCs/>
-        </w:rPr>
-        <w:t xml:space="preserve">110</w:t>
-      </w:r>
-      <w:r>
-        <w:rPr>
-          <w:rFonts w:ascii="Times New Roman" w:cs="Times New Roman" w:eastAsia="Times New Roman" w:hAnsi="Times New Roman"/>
-        </w:rPr>
-        <w:t xml:space="preserve">, 12–22. https://doi.org/10.1016/j.jclinepi.2019.02.004</w:t>
+        <w:t xml:space="preserve">Advances in Neural Information Processing Systems</w:t>
+      </w:r>
+      <w:r>
+        <w:rPr>
+          <w:rFonts w:ascii="Times New Roman" w:cs="Times New Roman" w:eastAsia="Times New Roman" w:hAnsi="Times New Roman"/>
+        </w:rPr>
+        <w:t xml:space="preserve"> (Vol. 35, pp. 507–520).</w:t>
       </w:r>
     </w:p>
     <w:p>
       <w:pPr>
         <w:spacing w:after="80" w:line="240"/>
         <w:ind w:left="720" w:hanging="720"/>
-        <w:jc w:val="left"/>
+        <w:jc w:val="both"/>
       </w:pPr>
       <w:r>
         <w:rPr>
           <w:rFonts w:ascii="Times New Roman" w:cs="Times New Roman" w:eastAsia="Times New Roman" w:hAnsi="Times New Roman"/>
         </w:rPr>
-        <w:t xml:space="preserve">Collins, G. S., Moons, K. G. M., Dhiman, P., Riley, R. D., Beam, A. L., Van Calster, B., ... &amp; Logullo, P. (2024). TRIPOD+AI statement: Updated guidance for reporting clinical prediction models that use regression or machine learning methods. </w:t>
+        <w:t xml:space="preserve">8.	Shwartz-Ziv, R., &amp; Armon, A. (2022). Tabular data: Deep learning is not all you need. </w:t>
       </w:r>
       <w:r>
         <w:rPr>
@@ -12798,7 +12798,7 @@
           <w:i/>
           <w:iCs/>
         </w:rPr>
-        <w:t xml:space="preserve">BMJ</w:t>
+        <w:t xml:space="preserve">Information Fusion</w:t>
       </w:r>
       <w:r>
         <w:rPr>
@@ -12812,26 +12812,26 @@
           <w:i/>
           <w:iCs/>
         </w:rPr>
-        <w:t xml:space="preserve">385</w:t>
-      </w:r>
-      <w:r>
-        <w:rPr>
-          <w:rFonts w:ascii="Times New Roman" w:cs="Times New Roman" w:eastAsia="Times New Roman" w:hAnsi="Times New Roman"/>
-        </w:rPr>
-        <w:t xml:space="preserve">, e078378. https://doi.org/10.1136/bmj-2023-078378</w:t>
+        <w:t xml:space="preserve">81</w:t>
+      </w:r>
+      <w:r>
+        <w:rPr>
+          <w:rFonts w:ascii="Times New Roman" w:cs="Times New Roman" w:eastAsia="Times New Roman" w:hAnsi="Times New Roman"/>
+        </w:rPr>
+        <w:t xml:space="preserve">, 84–90. https://doi.org/10.1016/j.inffus.2021.11.011</w:t>
       </w:r>
     </w:p>
     <w:p>
       <w:pPr>
         <w:spacing w:after="80" w:line="240"/>
         <w:ind w:left="720" w:hanging="720"/>
-        <w:jc w:val="left"/>
+        <w:jc w:val="both"/>
       </w:pPr>
       <w:r>
         <w:rPr>
           <w:rFonts w:ascii="Times New Roman" w:cs="Times New Roman" w:eastAsia="Times New Roman" w:hAnsi="Times New Roman"/>
         </w:rPr>
-        <w:t xml:space="preserve">Cortes, C., &amp; Vapnik, V. (1995). Support-vector networks. </w:t>
+        <w:t xml:space="preserve">9.	Van Calster, B., McLernon, D. J., van Smeden, M., Wynants, L., &amp; Steyerberg, E. W. (2019). Calibration: The Achilles heel of predictive analytics. </w:t>
       </w:r>
       <w:r>
         <w:rPr>
@@ -12839,7 +12839,7 @@
           <w:i/>
           <w:iCs/>
         </w:rPr>
-        <w:t xml:space="preserve">Machine Learning</w:t>
+        <w:t xml:space="preserve">BMC Medicine</w:t>
       </w:r>
       <w:r>
         <w:rPr>
@@ -12853,26 +12853,26 @@
           <w:i/>
           <w:iCs/>
         </w:rPr>
-        <w:t xml:space="preserve">20</w:t>
-      </w:r>
-      <w:r>
-        <w:rPr>
-          <w:rFonts w:ascii="Times New Roman" w:cs="Times New Roman" w:eastAsia="Times New Roman" w:hAnsi="Times New Roman"/>
-        </w:rPr>
-        <w:t xml:space="preserve">(3), 273–297. https://doi.org/10.1007/BF00994018</w:t>
+        <w:t xml:space="preserve">17</w:t>
+      </w:r>
+      <w:r>
+        <w:rPr>
+          <w:rFonts w:ascii="Times New Roman" w:cs="Times New Roman" w:eastAsia="Times New Roman" w:hAnsi="Times New Roman"/>
+        </w:rPr>
+        <w:t xml:space="preserve">(1), 230. https://doi.org/10.1186/s12916-019-1466-7</w:t>
       </w:r>
     </w:p>
     <w:p>
       <w:pPr>
         <w:spacing w:after="80" w:line="240"/>
         <w:ind w:left="720" w:hanging="720"/>
-        <w:jc w:val="left"/>
+        <w:jc w:val="both"/>
       </w:pPr>
       <w:r>
         <w:rPr>
           <w:rFonts w:ascii="Times New Roman" w:cs="Times New Roman" w:eastAsia="Times New Roman" w:hAnsi="Times New Roman"/>
         </w:rPr>
-        <w:t xml:space="preserve">D'Agostino, R. B., Sr., Vasan, R. S., Pencina, M. J., Wolf, P. A., Cobain, M., Massaro, J. M., &amp; Kannel, W. B. (2008). General cardiovascular risk profile for use in primary care: The Framingham Heart Study. </w:t>
+        <w:t xml:space="preserve">10.	Lundberg, S. M., &amp; Lee, S.-I. (2017). A unified approach to interpreting model predictions. In </w:t>
       </w:r>
       <w:r>
         <w:rPr>
@@ -12880,40 +12880,26 @@
           <w:i/>
           <w:iCs/>
         </w:rPr>
-        <w:t xml:space="preserve">Circulation</w:t>
-      </w:r>
-      <w:r>
-        <w:rPr>
-          <w:rFonts w:ascii="Times New Roman" w:cs="Times New Roman" w:eastAsia="Times New Roman" w:hAnsi="Times New Roman"/>
-        </w:rPr>
-        <w:t xml:space="preserve">, </w:t>
-      </w:r>
-      <w:r>
-        <w:rPr>
-          <w:rFonts w:ascii="Times New Roman" w:cs="Times New Roman" w:eastAsia="Times New Roman" w:hAnsi="Times New Roman"/>
-          <w:i/>
-          <w:iCs/>
-        </w:rPr>
-        <w:t xml:space="preserve">117</w:t>
-      </w:r>
-      <w:r>
-        <w:rPr>
-          <w:rFonts w:ascii="Times New Roman" w:cs="Times New Roman" w:eastAsia="Times New Roman" w:hAnsi="Times New Roman"/>
-        </w:rPr>
-        <w:t xml:space="preserve">(6), 743–753. https://doi.org/10.1161/CIRCULATIONAHA.107.699579</w:t>
+        <w:t xml:space="preserve">Advances in Neural Information Processing Systems</w:t>
+      </w:r>
+      <w:r>
+        <w:rPr>
+          <w:rFonts w:ascii="Times New Roman" w:cs="Times New Roman" w:eastAsia="Times New Roman" w:hAnsi="Times New Roman"/>
+        </w:rPr>
+        <w:t xml:space="preserve"> (Vol. 30, pp. 4765–4774).</w:t>
       </w:r>
     </w:p>
     <w:p>
       <w:pPr>
         <w:spacing w:after="80" w:line="240"/>
         <w:ind w:left="720" w:hanging="720"/>
-        <w:jc w:val="left"/>
+        <w:jc w:val="both"/>
       </w:pPr>
       <w:r>
         <w:rPr>
           <w:rFonts w:ascii="Times New Roman" w:cs="Times New Roman" w:eastAsia="Times New Roman" w:hAnsi="Times New Roman"/>
         </w:rPr>
-        <w:t xml:space="preserve">DeLong, E. R., DeLong, D. M., &amp; Clarke-Pearson, D. L. (1988). Comparing the areas under two or more correlated receiver operating characteristic curves: A nonparametric approach. </w:t>
+        <w:t xml:space="preserve">11.	Rudin, C. (2019). Stop explaining black box machine learning models for high stakes decisions and use interpretable models instead. </w:t>
       </w:r>
       <w:r>
         <w:rPr>
@@ -12921,7 +12907,7 @@
           <w:i/>
           <w:iCs/>
         </w:rPr>
-        <w:t xml:space="preserve">Biometrics</w:t>
+        <w:t xml:space="preserve">Nature Machine Intelligence</w:t>
       </w:r>
       <w:r>
         <w:rPr>
@@ -12935,26 +12921,26 @@
           <w:i/>
           <w:iCs/>
         </w:rPr>
-        <w:t xml:space="preserve">44</w:t>
-      </w:r>
-      <w:r>
-        <w:rPr>
-          <w:rFonts w:ascii="Times New Roman" w:cs="Times New Roman" w:eastAsia="Times New Roman" w:hAnsi="Times New Roman"/>
-        </w:rPr>
-        <w:t xml:space="preserve">(3), 837–845. https://doi.org/10.2307/2531595</w:t>
+        <w:t xml:space="preserve">1</w:t>
+      </w:r>
+      <w:r>
+        <w:rPr>
+          <w:rFonts w:ascii="Times New Roman" w:cs="Times New Roman" w:eastAsia="Times New Roman" w:hAnsi="Times New Roman"/>
+        </w:rPr>
+        <w:t xml:space="preserve">(5), 206–215. https://doi.org/10.1038/s42256-019-0048-x</w:t>
       </w:r>
     </w:p>
     <w:p>
       <w:pPr>
         <w:spacing w:after="80" w:line="240"/>
         <w:ind w:left="720" w:hanging="720"/>
-        <w:jc w:val="left"/>
+        <w:jc w:val="both"/>
       </w:pPr>
       <w:r>
         <w:rPr>
           <w:rFonts w:ascii="Times New Roman" w:cs="Times New Roman" w:eastAsia="Times New Roman" w:hAnsi="Times New Roman"/>
         </w:rPr>
-        <w:t xml:space="preserve">Dinh, A., Miertschin, S., Young, A., &amp; Mohanty, S. D. (2019). A data-driven approach to predicting diabetes and cardiovascular disease with machine learning. </w:t>
+        <w:t xml:space="preserve">12.	Centers for Disease Control and Prevention, National Center for Health Statistics. (n.d.). </w:t>
       </w:r>
       <w:r>
         <w:rPr>
@@ -12962,40 +12948,26 @@
           <w:i/>
           <w:iCs/>
         </w:rPr>
-        <w:t xml:space="preserve">BMC Medical Informatics and Decision Making</w:t>
-      </w:r>
-      <w:r>
-        <w:rPr>
-          <w:rFonts w:ascii="Times New Roman" w:cs="Times New Roman" w:eastAsia="Times New Roman" w:hAnsi="Times New Roman"/>
-        </w:rPr>
-        <w:t xml:space="preserve">, </w:t>
-      </w:r>
-      <w:r>
-        <w:rPr>
-          <w:rFonts w:ascii="Times New Roman" w:cs="Times New Roman" w:eastAsia="Times New Roman" w:hAnsi="Times New Roman"/>
-          <w:i/>
-          <w:iCs/>
-        </w:rPr>
-        <w:t xml:space="preserve">19</w:t>
-      </w:r>
-      <w:r>
-        <w:rPr>
-          <w:rFonts w:ascii="Times New Roman" w:cs="Times New Roman" w:eastAsia="Times New Roman" w:hAnsi="Times New Roman"/>
-        </w:rPr>
-        <w:t xml:space="preserve">(1), 211. https://doi.org/10.1186/s12911-019-0918-5</w:t>
+        <w:t xml:space="preserve">National Health and Nutrition Examination Survey data, 2011–2018</w:t>
+      </w:r>
+      <w:r>
+        <w:rPr>
+          <w:rFonts w:ascii="Times New Roman" w:cs="Times New Roman" w:eastAsia="Times New Roman" w:hAnsi="Times New Roman"/>
+        </w:rPr>
+        <w:t xml:space="preserve">. U.S. Department of Health and Human Services. https://wwwn.cdc.gov/nchs/nhanes/</w:t>
       </w:r>
     </w:p>
     <w:p>
       <w:pPr>
         <w:spacing w:after="80" w:line="240"/>
         <w:ind w:left="720" w:hanging="720"/>
-        <w:jc w:val="left"/>
+        <w:jc w:val="both"/>
       </w:pPr>
       <w:r>
         <w:rPr>
           <w:rFonts w:ascii="Times New Roman" w:cs="Times New Roman" w:eastAsia="Times New Roman" w:hAnsi="Times New Roman"/>
         </w:rPr>
-        <w:t xml:space="preserve">Goff, D. C., Lloyd-Jones, D. M., Bennett, G., Coady, S., D'Agostino, R. B., Gibbons, R., ... &amp; Wilson, P. W. F. (2014). 2013 ACC/AHA guideline on the assessment of cardiovascular risk: A report of the American College of Cardiology/American Heart Association Task Force on Practice Guidelines. </w:t>
+        <w:t xml:space="preserve">13.	Johnson, C. L., Paulose-Ram, R., Ogden, C. L., Carroll, M. D., Kruszon-Moran, D., Dohrmann, S. M., &amp; Curtin, L. R. (2013). National Health and Nutrition Examination Survey: Analytic guidelines, 1999–2010. </w:t>
       </w:r>
       <w:r>
         <w:rPr>
@@ -13003,40 +12975,26 @@
           <w:i/>
           <w:iCs/>
         </w:rPr>
-        <w:t xml:space="preserve">Circulation</w:t>
-      </w:r>
-      <w:r>
-        <w:rPr>
-          <w:rFonts w:ascii="Times New Roman" w:cs="Times New Roman" w:eastAsia="Times New Roman" w:hAnsi="Times New Roman"/>
-        </w:rPr>
-        <w:t xml:space="preserve">, </w:t>
-      </w:r>
-      <w:r>
-        <w:rPr>
-          <w:rFonts w:ascii="Times New Roman" w:cs="Times New Roman" w:eastAsia="Times New Roman" w:hAnsi="Times New Roman"/>
-          <w:i/>
-          <w:iCs/>
-        </w:rPr>
-        <w:t xml:space="preserve">129</w:t>
-      </w:r>
-      <w:r>
-        <w:rPr>
-          <w:rFonts w:ascii="Times New Roman" w:cs="Times New Roman" w:eastAsia="Times New Roman" w:hAnsi="Times New Roman"/>
-        </w:rPr>
-        <w:t xml:space="preserve">(25 Suppl. 2), S49–S73. https://doi.org/10.1161/01.cir.0000437741.48606.98</w:t>
+        <w:t xml:space="preserve">Vital and Health Statistics, Series 2</w:t>
+      </w:r>
+      <w:r>
+        <w:rPr>
+          <w:rFonts w:ascii="Times New Roman" w:cs="Times New Roman" w:eastAsia="Times New Roman" w:hAnsi="Times New Roman"/>
+        </w:rPr>
+        <w:t xml:space="preserve">(161), 1–24.</w:t>
       </w:r>
     </w:p>
     <w:p>
       <w:pPr>
         <w:spacing w:after="80" w:line="240"/>
         <w:ind w:left="720" w:hanging="720"/>
-        <w:jc w:val="left"/>
+        <w:jc w:val="both"/>
       </w:pPr>
       <w:r>
         <w:rPr>
           <w:rFonts w:ascii="Times New Roman" w:cs="Times New Roman" w:eastAsia="Times New Roman" w:hAnsi="Times New Roman"/>
         </w:rPr>
-        <w:t xml:space="preserve">Gorishniy, Y., Rubachev, I., Khrulkov, V., &amp; Babenko, A. (2021). Revisiting deep learning models for tabular data. In </w:t>
+        <w:t xml:space="preserve">14.	Weng, S. F., Reps, J., Kai, J., Garibaldi, J. M., &amp; Qureshi, N. (2017). Can machine-learning improve cardiovascular risk prediction using routine clinical data? </w:t>
       </w:r>
       <w:r>
         <w:rPr>
@@ -13044,26 +13002,40 @@
           <w:i/>
           <w:iCs/>
         </w:rPr>
-        <w:t xml:space="preserve">Advances in Neural Information Processing Systems</w:t>
-      </w:r>
-      <w:r>
-        <w:rPr>
-          <w:rFonts w:ascii="Times New Roman" w:cs="Times New Roman" w:eastAsia="Times New Roman" w:hAnsi="Times New Roman"/>
-        </w:rPr>
-        <w:t xml:space="preserve"> (Vol. 34, pp. 18932–18943).</w:t>
+        <w:t xml:space="preserve">PLOS ONE</w:t>
+      </w:r>
+      <w:r>
+        <w:rPr>
+          <w:rFonts w:ascii="Times New Roman" w:cs="Times New Roman" w:eastAsia="Times New Roman" w:hAnsi="Times New Roman"/>
+        </w:rPr>
+        <w:t xml:space="preserve">, </w:t>
+      </w:r>
+      <w:r>
+        <w:rPr>
+          <w:rFonts w:ascii="Times New Roman" w:cs="Times New Roman" w:eastAsia="Times New Roman" w:hAnsi="Times New Roman"/>
+          <w:i/>
+          <w:iCs/>
+        </w:rPr>
+        <w:t xml:space="preserve">12</w:t>
+      </w:r>
+      <w:r>
+        <w:rPr>
+          <w:rFonts w:ascii="Times New Roman" w:cs="Times New Roman" w:eastAsia="Times New Roman" w:hAnsi="Times New Roman"/>
+        </w:rPr>
+        <w:t xml:space="preserve">(4), e0174944. https://doi.org/10.1371/journal.pone.0174944</w:t>
       </w:r>
     </w:p>
     <w:p>
       <w:pPr>
         <w:spacing w:after="80" w:line="240"/>
         <w:ind w:left="720" w:hanging="720"/>
-        <w:jc w:val="left"/>
+        <w:jc w:val="both"/>
       </w:pPr>
       <w:r>
         <w:rPr>
           <w:rFonts w:ascii="Times New Roman" w:cs="Times New Roman" w:eastAsia="Times New Roman" w:hAnsi="Times New Roman"/>
         </w:rPr>
-        <w:t xml:space="preserve">Grinsztajn, L., Oyallon, E., &amp; Varoquaux, G. (2022). Why do tree-based models still outperform deep learning on typical tabular data? In </w:t>
+        <w:t xml:space="preserve">15.	Alaa, A. M., Bolton, T., Di Angelantonio, E., Rudd, J. H. F., &amp; van der Schaar, M. (2019). Cardiovascular disease risk prediction using automated machine learning: A prospective study of 423,604 UK Biobank participants. </w:t>
       </w:r>
       <w:r>
         <w:rPr>
@@ -13071,26 +13043,40 @@
           <w:i/>
           <w:iCs/>
         </w:rPr>
-        <w:t xml:space="preserve">Advances in Neural Information Processing Systems</w:t>
-      </w:r>
-      <w:r>
-        <w:rPr>
-          <w:rFonts w:ascii="Times New Roman" w:cs="Times New Roman" w:eastAsia="Times New Roman" w:hAnsi="Times New Roman"/>
-        </w:rPr>
-        <w:t xml:space="preserve"> (Vol. 35, pp. 507–520).</w:t>
+        <w:t xml:space="preserve">PLOS ONE</w:t>
+      </w:r>
+      <w:r>
+        <w:rPr>
+          <w:rFonts w:ascii="Times New Roman" w:cs="Times New Roman" w:eastAsia="Times New Roman" w:hAnsi="Times New Roman"/>
+        </w:rPr>
+        <w:t xml:space="preserve">, </w:t>
+      </w:r>
+      <w:r>
+        <w:rPr>
+          <w:rFonts w:ascii="Times New Roman" w:cs="Times New Roman" w:eastAsia="Times New Roman" w:hAnsi="Times New Roman"/>
+          <w:i/>
+          <w:iCs/>
+        </w:rPr>
+        <w:t xml:space="preserve">14</w:t>
+      </w:r>
+      <w:r>
+        <w:rPr>
+          <w:rFonts w:ascii="Times New Roman" w:cs="Times New Roman" w:eastAsia="Times New Roman" w:hAnsi="Times New Roman"/>
+        </w:rPr>
+        <w:t xml:space="preserve">(5), e0213653. https://doi.org/10.1371/journal.pone.0213653</w:t>
       </w:r>
     </w:p>
     <w:p>
       <w:pPr>
         <w:spacing w:after="80" w:line="240"/>
         <w:ind w:left="720" w:hanging="720"/>
-        <w:jc w:val="left"/>
+        <w:jc w:val="both"/>
       </w:pPr>
       <w:r>
         <w:rPr>
           <w:rFonts w:ascii="Times New Roman" w:cs="Times New Roman" w:eastAsia="Times New Roman" w:hAnsi="Times New Roman"/>
         </w:rPr>
-        <w:t xml:space="preserve">Holm, S. (1979). A simple sequentially rejective multiple test procedure. </w:t>
+        <w:t xml:space="preserve">16.	Ambale-Venkatesh, B., Yang, X., Wu, C. O., Liu, K., Hundley, W. G., McClelland, R., ... &amp; Lima, J. A. C. (2017). Cardiovascular event prediction by machine learning: The Multi-Ethnic Study of Atherosclerosis. </w:t>
       </w:r>
       <w:r>
         <w:rPr>
@@ -13098,7 +13084,7 @@
           <w:i/>
           <w:iCs/>
         </w:rPr>
-        <w:t xml:space="preserve">Scandinavian Journal of Statistics</w:t>
+        <w:t xml:space="preserve">Circulation Research</w:t>
       </w:r>
       <w:r>
         <w:rPr>
@@ -13112,26 +13098,26 @@
           <w:i/>
           <w:iCs/>
         </w:rPr>
-        <w:t xml:space="preserve">6</w:t>
-      </w:r>
-      <w:r>
-        <w:rPr>
-          <w:rFonts w:ascii="Times New Roman" w:cs="Times New Roman" w:eastAsia="Times New Roman" w:hAnsi="Times New Roman"/>
-        </w:rPr>
-        <w:t xml:space="preserve">(2), 65–70.</w:t>
+        <w:t xml:space="preserve">121</w:t>
+      </w:r>
+      <w:r>
+        <w:rPr>
+          <w:rFonts w:ascii="Times New Roman" w:cs="Times New Roman" w:eastAsia="Times New Roman" w:hAnsi="Times New Roman"/>
+        </w:rPr>
+        <w:t xml:space="preserve">(9), 1092–1101. https://doi.org/10.1161/CIRCRESAHA.117.311312</w:t>
       </w:r>
     </w:p>
     <w:p>
       <w:pPr>
         <w:spacing w:after="80" w:line="240"/>
         <w:ind w:left="720" w:hanging="720"/>
-        <w:jc w:val="left"/>
+        <w:jc w:val="both"/>
       </w:pPr>
       <w:r>
         <w:rPr>
           <w:rFonts w:ascii="Times New Roman" w:cs="Times New Roman" w:eastAsia="Times New Roman" w:hAnsi="Times New Roman"/>
         </w:rPr>
-        <w:t xml:space="preserve">Johnson, C. L., Paulose-Ram, R., Ogden, C. L., Carroll, M. D., Kruszon-Moran, D., Dohrmann, S. M., &amp; Curtin, L. R. (2013). National Health and Nutrition Examination Survey: Analytic guidelines, 1999–2010. </w:t>
+        <w:t xml:space="preserve">17.	Krittanawong, C., Virk, H. U. H., Bangalore, S., Wang, Z., Johnson, K. W., Pinotti, R., ... &amp; Tang, W. H. W. (2020). Machine learning prediction in cardiovascular diseases: A meta-analysis. </w:t>
       </w:r>
       <w:r>
         <w:rPr>
@@ -13139,26 +13125,40 @@
           <w:i/>
           <w:iCs/>
         </w:rPr>
-        <w:t xml:space="preserve">Vital and Health Statistics, Series 2</w:t>
-      </w:r>
-      <w:r>
-        <w:rPr>
-          <w:rFonts w:ascii="Times New Roman" w:cs="Times New Roman" w:eastAsia="Times New Roman" w:hAnsi="Times New Roman"/>
-        </w:rPr>
-        <w:t xml:space="preserve">(161), 1–24.</w:t>
+        <w:t xml:space="preserve">Scientific Reports</w:t>
+      </w:r>
+      <w:r>
+        <w:rPr>
+          <w:rFonts w:ascii="Times New Roman" w:cs="Times New Roman" w:eastAsia="Times New Roman" w:hAnsi="Times New Roman"/>
+        </w:rPr>
+        <w:t xml:space="preserve">, </w:t>
+      </w:r>
+      <w:r>
+        <w:rPr>
+          <w:rFonts w:ascii="Times New Roman" w:cs="Times New Roman" w:eastAsia="Times New Roman" w:hAnsi="Times New Roman"/>
+          <w:i/>
+          <w:iCs/>
+        </w:rPr>
+        <w:t xml:space="preserve">10</w:t>
+      </w:r>
+      <w:r>
+        <w:rPr>
+          <w:rFonts w:ascii="Times New Roman" w:cs="Times New Roman" w:eastAsia="Times New Roman" w:hAnsi="Times New Roman"/>
+        </w:rPr>
+        <w:t xml:space="preserve">(1), 16057. https://doi.org/10.1038/s41598-020-72685-1</w:t>
       </w:r>
     </w:p>
     <w:p>
       <w:pPr>
         <w:spacing w:after="80" w:line="240"/>
         <w:ind w:left="720" w:hanging="720"/>
-        <w:jc w:val="left"/>
+        <w:jc w:val="both"/>
       </w:pPr>
       <w:r>
         <w:rPr>
           <w:rFonts w:ascii="Times New Roman" w:cs="Times New Roman" w:eastAsia="Times New Roman" w:hAnsi="Times New Roman"/>
         </w:rPr>
-        <w:t xml:space="preserve">Krishna, S., Han, T., Gu, A., Wu, S., Jabbari, S., &amp; Lakkaraju, H. (2024). The disagreement problem in explainable machine learning: A practitioner's perspective. </w:t>
+        <w:t xml:space="preserve">18.	Dinh, A., Miertschin, S., Young, A., &amp; Mohanty, S. D. (2019). A data-driven approach to predicting diabetes and cardiovascular disease with machine learning. </w:t>
       </w:r>
       <w:r>
         <w:rPr>
@@ -13166,26 +13166,40 @@
           <w:i/>
           <w:iCs/>
         </w:rPr>
-        <w:t xml:space="preserve">Transactions on Machine Learning Research</w:t>
-      </w:r>
-      <w:r>
-        <w:rPr>
-          <w:rFonts w:ascii="Times New Roman" w:cs="Times New Roman" w:eastAsia="Times New Roman" w:hAnsi="Times New Roman"/>
-        </w:rPr>
-        <w:t xml:space="preserve">. https://arxiv.org/abs/2202.01602</w:t>
+        <w:t xml:space="preserve">BMC Medical Informatics and Decision Making</w:t>
+      </w:r>
+      <w:r>
+        <w:rPr>
+          <w:rFonts w:ascii="Times New Roman" w:cs="Times New Roman" w:eastAsia="Times New Roman" w:hAnsi="Times New Roman"/>
+        </w:rPr>
+        <w:t xml:space="preserve">, </w:t>
+      </w:r>
+      <w:r>
+        <w:rPr>
+          <w:rFonts w:ascii="Times New Roman" w:cs="Times New Roman" w:eastAsia="Times New Roman" w:hAnsi="Times New Roman"/>
+          <w:i/>
+          <w:iCs/>
+        </w:rPr>
+        <w:t xml:space="preserve">19</w:t>
+      </w:r>
+      <w:r>
+        <w:rPr>
+          <w:rFonts w:ascii="Times New Roman" w:cs="Times New Roman" w:eastAsia="Times New Roman" w:hAnsi="Times New Roman"/>
+        </w:rPr>
+        <w:t xml:space="preserve">(1), 211. https://doi.org/10.1186/s12911-019-0918-5</w:t>
       </w:r>
     </w:p>
     <w:p>
       <w:pPr>
         <w:spacing w:after="80" w:line="240"/>
         <w:ind w:left="720" w:hanging="720"/>
-        <w:jc w:val="left"/>
+        <w:jc w:val="both"/>
       </w:pPr>
       <w:r>
         <w:rPr>
           <w:rFonts w:ascii="Times New Roman" w:cs="Times New Roman" w:eastAsia="Times New Roman" w:hAnsi="Times New Roman"/>
         </w:rPr>
-        <w:t xml:space="preserve">Krittanawong, C., Virk, H. U. H., Bangalore, S., Wang, Z., Johnson, K. W., Pinotti, R., ... &amp; Tang, W. H. W. (2020). Machine learning prediction in cardiovascular diseases: A meta-analysis. </w:t>
+        <w:t xml:space="preserve">19.	Martin-Morales, A., Yamamoto, M., Inoue, M., Vu, T., Dawadi, R., &amp; Araki, M. (2023). Predicting cardiovascular disease mortality: Leveraging machine learning for comprehensive assessment of health and nutrition variables. </w:t>
       </w:r>
       <w:r>
         <w:rPr>
@@ -13193,7 +13207,7 @@
           <w:i/>
           <w:iCs/>
         </w:rPr>
-        <w:t xml:space="preserve">Scientific Reports</w:t>
+        <w:t xml:space="preserve">Nutrients</w:t>
       </w:r>
       <w:r>
         <w:rPr>
@@ -13207,26 +13221,26 @@
           <w:i/>
           <w:iCs/>
         </w:rPr>
-        <w:t xml:space="preserve">10</w:t>
-      </w:r>
-      <w:r>
-        <w:rPr>
-          <w:rFonts w:ascii="Times New Roman" w:cs="Times New Roman" w:eastAsia="Times New Roman" w:hAnsi="Times New Roman"/>
-        </w:rPr>
-        <w:t xml:space="preserve">(1), 16057. https://doi.org/10.1038/s41598-020-72685-1</w:t>
+        <w:t xml:space="preserve">15</w:t>
+      </w:r>
+      <w:r>
+        <w:rPr>
+          <w:rFonts w:ascii="Times New Roman" w:cs="Times New Roman" w:eastAsia="Times New Roman" w:hAnsi="Times New Roman"/>
+        </w:rPr>
+        <w:t xml:space="preserve">(18), 3937. https://doi.org/10.3390/nu15183937</w:t>
       </w:r>
     </w:p>
     <w:p>
       <w:pPr>
         <w:spacing w:after="80" w:line="240"/>
         <w:ind w:left="720" w:hanging="720"/>
-        <w:jc w:val="left"/>
+        <w:jc w:val="both"/>
       </w:pPr>
       <w:r>
         <w:rPr>
           <w:rFonts w:ascii="Times New Roman" w:cs="Times New Roman" w:eastAsia="Times New Roman" w:hAnsi="Times New Roman"/>
         </w:rPr>
-        <w:t xml:space="preserve">Lundberg, S. M., Erion, G., Chen, H., DeGrave, A., Prutkin, J. M., Nair, B., ... &amp; Lee, S.-I. (2020). From local explanations to global understanding with explainable AI for trees. </w:t>
+        <w:t xml:space="preserve">20.	Ahiduzzaman, M., &amp; Hasan, M. N. (2025). Interpretable machine learning for cardiovascular risk prediction: Insights from NHANES dietary and health data. </w:t>
       </w:r>
       <w:r>
         <w:rPr>
@@ -13234,7 +13248,7 @@
           <w:i/>
           <w:iCs/>
         </w:rPr>
-        <w:t xml:space="preserve">Nature Machine Intelligence</w:t>
+        <w:t xml:space="preserve">PLOS ONE</w:t>
       </w:r>
       <w:r>
         <w:rPr>
@@ -13248,26 +13262,26 @@
           <w:i/>
           <w:iCs/>
         </w:rPr>
-        <w:t xml:space="preserve">2</w:t>
-      </w:r>
-      <w:r>
-        <w:rPr>
-          <w:rFonts w:ascii="Times New Roman" w:cs="Times New Roman" w:eastAsia="Times New Roman" w:hAnsi="Times New Roman"/>
-        </w:rPr>
-        <w:t xml:space="preserve">(1), 56–67. https://doi.org/10.1038/s42256-019-0138-9</w:t>
+        <w:t xml:space="preserve">20</w:t>
+      </w:r>
+      <w:r>
+        <w:rPr>
+          <w:rFonts w:ascii="Times New Roman" w:cs="Times New Roman" w:eastAsia="Times New Roman" w:hAnsi="Times New Roman"/>
+        </w:rPr>
+        <w:t xml:space="preserve">(11), e0335915. https://doi.org/10.1371/journal.pone.0335915</w:t>
       </w:r>
     </w:p>
     <w:p>
       <w:pPr>
         <w:spacing w:after="80" w:line="240"/>
         <w:ind w:left="720" w:hanging="720"/>
-        <w:jc w:val="left"/>
+        <w:jc w:val="both"/>
       </w:pPr>
       <w:r>
         <w:rPr>
           <w:rFonts w:ascii="Times New Roman" w:cs="Times New Roman" w:eastAsia="Times New Roman" w:hAnsi="Times New Roman"/>
         </w:rPr>
-        <w:t xml:space="preserve">Lundberg, S. M., &amp; Lee, S.-I. (2017). A unified approach to interpreting model predictions. In </w:t>
+        <w:t xml:space="preserve">21.	Krishna, S., Han, T., Gu, A., Wu, S., Jabbari, S., &amp; Lakkaraju, H. (2024). The disagreement problem in explainable machine learning: A practitioner's perspective. </w:t>
       </w:r>
       <w:r>
         <w:rPr>
@@ -13275,26 +13289,26 @@
           <w:i/>
           <w:iCs/>
         </w:rPr>
-        <w:t xml:space="preserve">Advances in Neural Information Processing Systems</w:t>
-      </w:r>
-      <w:r>
-        <w:rPr>
-          <w:rFonts w:ascii="Times New Roman" w:cs="Times New Roman" w:eastAsia="Times New Roman" w:hAnsi="Times New Roman"/>
-        </w:rPr>
-        <w:t xml:space="preserve"> (Vol. 30, pp. 4765–4774).</w:t>
+        <w:t xml:space="preserve">Transactions on Machine Learning Research</w:t>
+      </w:r>
+      <w:r>
+        <w:rPr>
+          <w:rFonts w:ascii="Times New Roman" w:cs="Times New Roman" w:eastAsia="Times New Roman" w:hAnsi="Times New Roman"/>
+        </w:rPr>
+        <w:t xml:space="preserve">. https://arxiv.org/abs/2202.01602</w:t>
       </w:r>
     </w:p>
     <w:p>
       <w:pPr>
         <w:spacing w:after="80" w:line="240"/>
         <w:ind w:left="720" w:hanging="720"/>
-        <w:jc w:val="left"/>
+        <w:jc w:val="both"/>
       </w:pPr>
       <w:r>
         <w:rPr>
           <w:rFonts w:ascii="Times New Roman" w:cs="Times New Roman" w:eastAsia="Times New Roman" w:hAnsi="Times New Roman"/>
         </w:rPr>
-        <w:t xml:space="preserve">Martin-Morales, A., Yamamoto, M., Inoue, M., Vu, T., Dawadi, R., &amp; Araki, M. (2023). Predicting cardiovascular disease mortality: Leveraging machine learning for comprehensive assessment of health and nutrition variables. </w:t>
+        <w:t xml:space="preserve">22.	Breiman, L. (2001). Random forests. </w:t>
       </w:r>
       <w:r>
         <w:rPr>
@@ -13302,7 +13316,7 @@
           <w:i/>
           <w:iCs/>
         </w:rPr>
-        <w:t xml:space="preserve">Nutrients</w:t>
+        <w:t xml:space="preserve">Machine Learning</w:t>
       </w:r>
       <w:r>
         <w:rPr>
@@ -13316,26 +13330,26 @@
           <w:i/>
           <w:iCs/>
         </w:rPr>
-        <w:t xml:space="preserve">15</w:t>
-      </w:r>
-      <w:r>
-        <w:rPr>
-          <w:rFonts w:ascii="Times New Roman" w:cs="Times New Roman" w:eastAsia="Times New Roman" w:hAnsi="Times New Roman"/>
-        </w:rPr>
-        <w:t xml:space="preserve">(18), 3937. https://doi.org/10.3390/nu15183937</w:t>
+        <w:t xml:space="preserve">45</w:t>
+      </w:r>
+      <w:r>
+        <w:rPr>
+          <w:rFonts w:ascii="Times New Roman" w:cs="Times New Roman" w:eastAsia="Times New Roman" w:hAnsi="Times New Roman"/>
+        </w:rPr>
+        <w:t xml:space="preserve">(1), 5–32. https://doi.org/10.1023/A:1010933404324</w:t>
       </w:r>
     </w:p>
     <w:p>
       <w:pPr>
         <w:spacing w:after="80" w:line="240"/>
         <w:ind w:left="720" w:hanging="720"/>
-        <w:jc w:val="left"/>
+        <w:jc w:val="both"/>
       </w:pPr>
       <w:r>
         <w:rPr>
           <w:rFonts w:ascii="Times New Roman" w:cs="Times New Roman" w:eastAsia="Times New Roman" w:hAnsi="Times New Roman"/>
         </w:rPr>
-        <w:t xml:space="preserve">Roth, G. A., Mensah, G. A., Johnson, C. O., Addolorato, G., Ammirati, E., Baddour, L. M., ... &amp; Fuster, V. (2020). Global burden of cardiovascular diseases and risk factors, 1990–2019: Update from the GBD 2019 study. </w:t>
+        <w:t xml:space="preserve">23.	Cortes, C., &amp; Vapnik, V. (1995). Support-vector networks. </w:t>
       </w:r>
       <w:r>
         <w:rPr>
@@ -13343,7 +13357,7 @@
           <w:i/>
           <w:iCs/>
         </w:rPr>
-        <w:t xml:space="preserve">Journal of the American College of Cardiology</w:t>
+        <w:t xml:space="preserve">Machine Learning</w:t>
       </w:r>
       <w:r>
         <w:rPr>
@@ -13357,26 +13371,26 @@
           <w:i/>
           <w:iCs/>
         </w:rPr>
-        <w:t xml:space="preserve">76</w:t>
-      </w:r>
-      <w:r>
-        <w:rPr>
-          <w:rFonts w:ascii="Times New Roman" w:cs="Times New Roman" w:eastAsia="Times New Roman" w:hAnsi="Times New Roman"/>
-        </w:rPr>
-        <w:t xml:space="preserve">(25), 2982–3021. https://doi.org/10.1016/j.jacc.2020.11.010</w:t>
+        <w:t xml:space="preserve">20</w:t>
+      </w:r>
+      <w:r>
+        <w:rPr>
+          <w:rFonts w:ascii="Times New Roman" w:cs="Times New Roman" w:eastAsia="Times New Roman" w:hAnsi="Times New Roman"/>
+        </w:rPr>
+        <w:t xml:space="preserve">(3), 273–297. https://doi.org/10.1007/BF00994018</w:t>
       </w:r>
     </w:p>
     <w:p>
       <w:pPr>
         <w:spacing w:after="80" w:line="240"/>
         <w:ind w:left="720" w:hanging="720"/>
-        <w:jc w:val="left"/>
+        <w:jc w:val="both"/>
       </w:pPr>
       <w:r>
         <w:rPr>
           <w:rFonts w:ascii="Times New Roman" w:cs="Times New Roman" w:eastAsia="Times New Roman" w:hAnsi="Times New Roman"/>
         </w:rPr>
-        <w:t xml:space="preserve">Rudin, C. (2019). Stop explaining black box machine learning models for high stakes decisions and use interpretable models instead. </w:t>
+        <w:t xml:space="preserve">24.	Chen, T., &amp; Guestrin, C. (2016). XGBoost: A scalable tree boosting system. In </w:t>
       </w:r>
       <w:r>
         <w:rPr>
@@ -13384,40 +13398,26 @@
           <w:i/>
           <w:iCs/>
         </w:rPr>
-        <w:t xml:space="preserve">Nature Machine Intelligence</w:t>
-      </w:r>
-      <w:r>
-        <w:rPr>
-          <w:rFonts w:ascii="Times New Roman" w:cs="Times New Roman" w:eastAsia="Times New Roman" w:hAnsi="Times New Roman"/>
-        </w:rPr>
-        <w:t xml:space="preserve">, </w:t>
-      </w:r>
-      <w:r>
-        <w:rPr>
-          <w:rFonts w:ascii="Times New Roman" w:cs="Times New Roman" w:eastAsia="Times New Roman" w:hAnsi="Times New Roman"/>
-          <w:i/>
-          <w:iCs/>
-        </w:rPr>
-        <w:t xml:space="preserve">1</w:t>
-      </w:r>
-      <w:r>
-        <w:rPr>
-          <w:rFonts w:ascii="Times New Roman" w:cs="Times New Roman" w:eastAsia="Times New Roman" w:hAnsi="Times New Roman"/>
-        </w:rPr>
-        <w:t xml:space="preserve">(5), 206–215. https://doi.org/10.1038/s42256-019-0048-x</w:t>
+        <w:t xml:space="preserve">Proceedings of the 22nd ACM SIGKDD International Conference on Knowledge Discovery and Data Mining</w:t>
+      </w:r>
+      <w:r>
+        <w:rPr>
+          <w:rFonts w:ascii="Times New Roman" w:cs="Times New Roman" w:eastAsia="Times New Roman" w:hAnsi="Times New Roman"/>
+        </w:rPr>
+        <w:t xml:space="preserve"> (pp. 785–794). https://doi.org/10.1145/2939672.2939785</w:t>
       </w:r>
     </w:p>
     <w:p>
       <w:pPr>
         <w:spacing w:after="80" w:line="240"/>
         <w:ind w:left="720" w:hanging="720"/>
-        <w:jc w:val="left"/>
+        <w:jc w:val="both"/>
       </w:pPr>
       <w:r>
         <w:rPr>
           <w:rFonts w:ascii="Times New Roman" w:cs="Times New Roman" w:eastAsia="Times New Roman" w:hAnsi="Times New Roman"/>
         </w:rPr>
-        <w:t xml:space="preserve">Saito, T., &amp; Rehmsmeier, M. (2015). The precision-recall plot is more informative than the ROC plot when evaluating binary classifiers on imbalanced datasets. </w:t>
+        <w:t xml:space="preserve">25.	Saito, T., &amp; Rehmsmeier, M. (2015). The precision-recall plot is more informative than the ROC plot when evaluating binary classifiers on imbalanced datasets. </w:t>
       </w:r>
       <w:r>
         <w:rPr>
@@ -13452,13 +13452,13 @@
       <w:pPr>
         <w:spacing w:after="80" w:line="240"/>
         <w:ind w:left="720" w:hanging="720"/>
-        <w:jc w:val="left"/>
+        <w:jc w:val="both"/>
       </w:pPr>
       <w:r>
         <w:rPr>
           <w:rFonts w:ascii="Times New Roman" w:cs="Times New Roman" w:eastAsia="Times New Roman" w:hAnsi="Times New Roman"/>
         </w:rPr>
-        <w:t xml:space="preserve">Shwartz-Ziv, R., &amp; Armon, A. (2022). Tabular data: Deep learning is not all you need. </w:t>
+        <w:t xml:space="preserve">26.	DeLong, E. R., DeLong, D. M., &amp; Clarke-Pearson, D. L. (1988). Comparing the areas under two or more correlated receiver operating characteristic curves: A nonparametric approach. </w:t>
       </w:r>
       <w:r>
         <w:rPr>
@@ -13466,7 +13466,7 @@
           <w:i/>
           <w:iCs/>
         </w:rPr>
-        <w:t xml:space="preserve">Information Fusion</w:t>
+        <w:t xml:space="preserve">Biometrics</w:t>
       </w:r>
       <w:r>
         <w:rPr>
@@ -13480,26 +13480,26 @@
           <w:i/>
           <w:iCs/>
         </w:rPr>
-        <w:t xml:space="preserve">81</w:t>
-      </w:r>
-      <w:r>
-        <w:rPr>
-          <w:rFonts w:ascii="Times New Roman" w:cs="Times New Roman" w:eastAsia="Times New Roman" w:hAnsi="Times New Roman"/>
-        </w:rPr>
-        <w:t xml:space="preserve">, 84–90. https://doi.org/10.1016/j.inffus.2021.11.011</w:t>
+        <w:t xml:space="preserve">44</w:t>
+      </w:r>
+      <w:r>
+        <w:rPr>
+          <w:rFonts w:ascii="Times New Roman" w:cs="Times New Roman" w:eastAsia="Times New Roman" w:hAnsi="Times New Roman"/>
+        </w:rPr>
+        <w:t xml:space="preserve">(3), 837–845. https://doi.org/10.2307/2531595</w:t>
       </w:r>
     </w:p>
     <w:p>
       <w:pPr>
         <w:spacing w:after="80" w:line="240"/>
         <w:ind w:left="720" w:hanging="720"/>
-        <w:jc w:val="left"/>
+        <w:jc w:val="both"/>
       </w:pPr>
       <w:r>
         <w:rPr>
           <w:rFonts w:ascii="Times New Roman" w:cs="Times New Roman" w:eastAsia="Times New Roman" w:hAnsi="Times New Roman"/>
         </w:rPr>
-        <w:t xml:space="preserve">Tsao, C. W., Aday, A. W., Almarzooq, Z. I., Anderson, C. A. M., Arora, P., Avery, C. L., ... &amp; Martin, S. S. (2023). Heart disease and stroke statistics—2023 update: A report from the American Heart Association. </w:t>
+        <w:t xml:space="preserve">27.	Holm, S. (1979). A simple sequentially rejective multiple test procedure. </w:t>
       </w:r>
       <w:r>
         <w:rPr>
@@ -13507,7 +13507,7 @@
           <w:i/>
           <w:iCs/>
         </w:rPr>
-        <w:t xml:space="preserve">Circulation</w:t>
+        <w:t xml:space="preserve">Scandinavian Journal of Statistics</w:t>
       </w:r>
       <w:r>
         <w:rPr>
@@ -13521,26 +13521,26 @@
           <w:i/>
           <w:iCs/>
         </w:rPr>
-        <w:t xml:space="preserve">147</w:t>
-      </w:r>
-      <w:r>
-        <w:rPr>
-          <w:rFonts w:ascii="Times New Roman" w:cs="Times New Roman" w:eastAsia="Times New Roman" w:hAnsi="Times New Roman"/>
-        </w:rPr>
-        <w:t xml:space="preserve">(8), e93–e621. https://doi.org/10.1161/CIR.0000000000001123</w:t>
+        <w:t xml:space="preserve">6</w:t>
+      </w:r>
+      <w:r>
+        <w:rPr>
+          <w:rFonts w:ascii="Times New Roman" w:cs="Times New Roman" w:eastAsia="Times New Roman" w:hAnsi="Times New Roman"/>
+        </w:rPr>
+        <w:t xml:space="preserve">(2), 65–70.</w:t>
       </w:r>
     </w:p>
     <w:p>
       <w:pPr>
         <w:spacing w:after="80" w:line="240"/>
         <w:ind w:left="720" w:hanging="720"/>
-        <w:jc w:val="left"/>
+        <w:jc w:val="both"/>
       </w:pPr>
       <w:r>
         <w:rPr>
           <w:rFonts w:ascii="Times New Roman" w:cs="Times New Roman" w:eastAsia="Times New Roman" w:hAnsi="Times New Roman"/>
         </w:rPr>
-        <w:t xml:space="preserve">Van Calster, B., McLernon, D. J., van Smeden, M., Wynants, L., &amp; Steyerberg, E. W. (2019). Calibration: The Achilles heel of predictive analytics. </w:t>
+        <w:t xml:space="preserve">28.	Lundberg, S. M., Erion, G., Chen, H., DeGrave, A., Prutkin, J. M., Nair, B., ... &amp; Lee, S.-I. (2020). From local explanations to global understanding with explainable AI for trees. </w:t>
       </w:r>
       <w:r>
         <w:rPr>
@@ -13548,7 +13548,7 @@
           <w:i/>
           <w:iCs/>
         </w:rPr>
-        <w:t xml:space="preserve">BMC Medicine</w:t>
+        <w:t xml:space="preserve">Nature Machine Intelligence</w:t>
       </w:r>
       <w:r>
         <w:rPr>
@@ -13562,26 +13562,26 @@
           <w:i/>
           <w:iCs/>
         </w:rPr>
-        <w:t xml:space="preserve">17</w:t>
-      </w:r>
-      <w:r>
-        <w:rPr>
-          <w:rFonts w:ascii="Times New Roman" w:cs="Times New Roman" w:eastAsia="Times New Roman" w:hAnsi="Times New Roman"/>
-        </w:rPr>
-        <w:t xml:space="preserve">(1), 230. https://doi.org/10.1186/s12916-019-1466-7</w:t>
+        <w:t xml:space="preserve">2</w:t>
+      </w:r>
+      <w:r>
+        <w:rPr>
+          <w:rFonts w:ascii="Times New Roman" w:cs="Times New Roman" w:eastAsia="Times New Roman" w:hAnsi="Times New Roman"/>
+        </w:rPr>
+        <w:t xml:space="preserve">(1), 56–67. https://doi.org/10.1038/s42256-019-0138-9</w:t>
       </w:r>
     </w:p>
     <w:p>
       <w:pPr>
         <w:spacing w:after="80" w:line="240"/>
         <w:ind w:left="720" w:hanging="720"/>
-        <w:jc w:val="left"/>
+        <w:jc w:val="both"/>
       </w:pPr>
       <w:r>
         <w:rPr>
           <w:rFonts w:ascii="Times New Roman" w:cs="Times New Roman" w:eastAsia="Times New Roman" w:hAnsi="Times New Roman"/>
         </w:rPr>
-        <w:t xml:space="preserve">Weng, S. F., Reps, J., Kai, J., Garibaldi, J. M., &amp; Qureshi, N. (2017). Can machine-learning improve cardiovascular risk prediction using routine clinical data? </w:t>
+        <w:t xml:space="preserve">29.	Collins, G. S., Moons, K. G. M., Dhiman, P., Riley, R. D., Beam, A. L., Van Calster, B., ... &amp; Logullo, P. (2024). TRIPOD+AI statement: Updated guidance for reporting clinical prediction models that use regression or machine learning methods. </w:t>
       </w:r>
       <w:r>
         <w:rPr>
@@ -13589,7 +13589,7 @@
           <w:i/>
           <w:iCs/>
         </w:rPr>
-        <w:t xml:space="preserve">PLOS ONE</w:t>
+        <w:t xml:space="preserve">BMJ</w:t>
       </w:r>
       <w:r>
         <w:rPr>
@@ -13603,13 +13603,13 @@
           <w:i/>
           <w:iCs/>
         </w:rPr>
-        <w:t xml:space="preserve">12</w:t>
-      </w:r>
-      <w:r>
-        <w:rPr>
-          <w:rFonts w:ascii="Times New Roman" w:cs="Times New Roman" w:eastAsia="Times New Roman" w:hAnsi="Times New Roman"/>
-        </w:rPr>
-        <w:t xml:space="preserve">(4), e0174944. https://doi.org/10.1371/journal.pone.0174944</w:t>
+        <w:t xml:space="preserve">385</w:t>
+      </w:r>
+      <w:r>
+        <w:rPr>
+          <w:rFonts w:ascii="Times New Roman" w:cs="Times New Roman" w:eastAsia="Times New Roman" w:hAnsi="Times New Roman"/>
+        </w:rPr>
+        <w:t xml:space="preserve">, e078378. https://doi.org/10.1136/bmj-2023-078378</w:t>
       </w:r>
     </w:p>
     <w:sectPr>

</xml_diff>